<commit_message>
feat(group-05): MPSTME GUARDIAN dual-UAV patrol simulation, 180-run real-trials batch, business model and completed dossier
</commit_message>
<xml_diff>
--- a/Group_05_Muaaz_Aditya_Zaid_Soumya/docs/MDRIIA_Group_05_Technical_Dossier.docx
+++ b/Group_05_Muaaz_Aditya_Zaid_Soumya/docs/MDRIIA_Group_05_Technical_Dossier.docx
@@ -1323,7 +1323,7 @@
                     <w:sz w:val="14"/>
                     <w:szCs w:val="14"/>
                   </w:rPr>
-                  <w:t xml:space="preserve">type here</w:t>
+                  <w:t xml:space="preserve">No primary source found. Corrected to our measured cycle time (N = 30 per cell): interior guard 2460.46 s vs UAV 57.41 s; exterior 532.91 s vs 71.82 s.</w:t>
                 </w:r>
               </w:sdtContent>
             </w:sdt>
@@ -1363,7 +1363,7 @@
                     <w:sz w:val="14"/>
                     <w:szCs w:val="14"/>
                   </w:rPr>
-                  <w:t xml:space="preserve">Select ▾</w:t>
+                  <w:t xml:space="preserve">No source found</w:t>
                 </w:r>
               </w:sdtContent>
             </w:sdt>
@@ -1400,7 +1400,7 @@
                     <w:sz w:val="14"/>
                     <w:szCs w:val="14"/>
                   </w:rPr>
-                  <w:t xml:space="preserve">Select ▾</w:t>
+                  <w:t xml:space="preserve">Correct</w:t>
                 </w:r>
               </w:sdtContent>
             </w:sdt>
@@ -1480,7 +1480,7 @@
                     <w:sz w:val="14"/>
                     <w:szCs w:val="14"/>
                   </w:rPr>
-                  <w:t xml:space="preserve">type here</w:t>
+                  <w:t xml:space="preserve">No primary source found. Corrected to T_payback from analytics/campus_security_economics.py (Section 3), a conditional range, not a point claim.</w:t>
                 </w:r>
               </w:sdtContent>
             </w:sdt>
@@ -1520,7 +1520,7 @@
                     <w:sz w:val="14"/>
                     <w:szCs w:val="14"/>
                   </w:rPr>
-                  <w:t xml:space="preserve">Select ▾</w:t>
+                  <w:t xml:space="preserve">No source found</w:t>
                 </w:r>
               </w:sdtContent>
             </w:sdt>
@@ -1557,7 +1557,7 @@
                     <w:sz w:val="14"/>
                     <w:szCs w:val="14"/>
                   </w:rPr>
-                  <w:t xml:space="preserve">Select ▾</w:t>
+                  <w:t xml:space="preserve">Correct</w:t>
                 </w:r>
               </w:sdtContent>
             </w:sdt>
@@ -1634,7 +1634,7 @@
                     <w:sz w:val="14"/>
                     <w:szCs w:val="14"/>
                   </w:rPr>
-                  <w:t xml:space="preserve">type here</w:t>
+                  <w:t xml:space="preserve">No primary source found (a design target). Corrected to the measured verify time: mean 0.199 s over 83 detected UAV runs (3 vision ticks at 10 Hz).</w:t>
                 </w:r>
               </w:sdtContent>
             </w:sdt>
@@ -1673,7 +1673,7 @@
                     <w:sz w:val="14"/>
                     <w:szCs w:val="14"/>
                   </w:rPr>
-                  <w:t xml:space="preserve">Select ▾</w:t>
+                  <w:t xml:space="preserve">No source found</w:t>
                 </w:r>
               </w:sdtContent>
             </w:sdt>
@@ -1709,7 +1709,7 @@
                     <w:sz w:val="14"/>
                     <w:szCs w:val="14"/>
                   </w:rPr>
-                  <w:t xml:space="preserve">Select ▾</w:t>
+                  <w:t xml:space="preserve">Correct</w:t>
                 </w:r>
               </w:sdtContent>
             </w:sdt>
@@ -1980,7 +1980,7 @@
                     <w:sz w:val="14"/>
                     <w:szCs w:val="14"/>
                   </w:rPr>
-                  <w:t xml:space="preserve">Select ▾</w:t>
+                  <w:t xml:space="preserve">No</w:t>
                 </w:r>
               </w:sdtContent>
             </w:sdt>
@@ -2012,7 +2012,7 @@
                     <w:sz w:val="14"/>
                     <w:szCs w:val="14"/>
                   </w:rPr>
-                  <w:t xml:space="preserve">type here</w:t>
+                  <w:t xml:space="preserve">Not applicable: ISO 10218-1:2025 covers industrial robots and excludes airborne and service robots. Source: genorma.com/en/standards/iso-10218-1-2025</w:t>
                 </w:r>
               </w:sdtContent>
             </w:sdt>
@@ -2117,7 +2117,7 @@
                     <w:sz w:val="14"/>
                     <w:szCs w:val="14"/>
                   </w:rPr>
-                  <w:t xml:space="preserve">Select ▾</w:t>
+                  <w:t xml:space="preserve">No</w:t>
                 </w:r>
               </w:sdtContent>
             </w:sdt>
@@ -2149,7 +2149,7 @@
                     <w:sz w:val="14"/>
                     <w:szCs w:val="14"/>
                   </w:rPr>
-                  <w:t xml:space="preserve">type here</w:t>
+                  <w:t xml:space="preserve">Not applicable: ISO 3691-4:2023 covers driverless industrial trucks (AGVs, AMRs); a multirotor is not an industrial truck. Source: genorma.com/en/standards/iso-3691-4-2023</w:t>
                 </w:r>
               </w:sdtContent>
             </w:sdt>
@@ -2254,7 +2254,7 @@
                     <w:sz w:val="14"/>
                     <w:szCs w:val="14"/>
                   </w:rPr>
-                  <w:t xml:space="preserve">Select ▾</w:t>
+                  <w:t xml:space="preserve">No</w:t>
                 </w:r>
               </w:sdtContent>
             </w:sdt>
@@ -2286,7 +2286,7 @@
                     <w:sz w:val="14"/>
                     <w:szCs w:val="14"/>
                   </w:rPr>
-                  <w:t xml:space="preserve">type here</w:t>
+                  <w:t xml:space="preserve">Not applicable: ANSI/A3 R15.06-2025 is the US adoption of ISO 10218 (industrial robots). Source: therobotreport.com (A3 announcement).</w:t>
                 </w:r>
               </w:sdtContent>
             </w:sdt>
@@ -2391,7 +2391,7 @@
                     <w:sz w:val="14"/>
                     <w:szCs w:val="14"/>
                   </w:rPr>
-                  <w:t xml:space="preserve">Select ▾</w:t>
+                  <w:t xml:space="preserve">No</w:t>
                 </w:r>
               </w:sdtContent>
             </w:sdt>
@@ -2423,7 +2423,7 @@
                     <w:sz w:val="14"/>
                     <w:szCs w:val="14"/>
                   </w:rPr>
-                  <w:t xml:space="preserve">type here</w:t>
+                  <w:t xml:space="preserve">Not applicable: IEC 60601-1:2005+A1:2012 covers medical electrical equipment. Source: webstore.iec.ch/publication/2612</w:t>
                 </w:r>
               </w:sdtContent>
             </w:sdt>
@@ -2524,7 +2524,7 @@
                     <w:sz w:val="14"/>
                     <w:szCs w:val="14"/>
                   </w:rPr>
-                  <w:t xml:space="preserve">Select ▾</w:t>
+                  <w:t xml:space="preserve">Partly</w:t>
                 </w:r>
               </w:sdtContent>
             </w:sdt>
@@ -2555,7 +2555,7 @@
                     <w:sz w:val="14"/>
                     <w:szCs w:val="14"/>
                   </w:rPr>
-                  <w:t xml:space="preserve">type here</w:t>
+                  <w:t xml:space="preserve">Partly: India Drone Rules 2021 (G.S.R. 589(E)) cover any UAS flown in India; a real outdoor campus flight needs Rule 14 registration and a Rule 21/22 zone check. Simulation only.</w:t>
                 </w:r>
               </w:sdtContent>
             </w:sdt>
@@ -2647,7 +2647,7 @@
                     <w:sz w:val="15"/>
                     <w:szCs w:val="15"/>
                   </w:rPr>
-                  <w:t xml:space="preserve">type here</w:t>
+                  <w:t xml:space="preserve">Guard on foot, simulated in the same MuJoCo scene (src/foot_patrol_baseline.py). Cycle time per full lap, N = 30: interior 2460.46 ± 593.21 s, exterior 532.91 ± 141.64 s. Walking speed 1.272 to 1.462 m/s; pause 10.0 to 60.0 s per checkpoint (ASSUMPTION).</w:t>
                 </w:r>
               </w:sdtContent>
             </w:sdt>
@@ -2706,7 +2706,7 @@
                     <w:sz w:val="15"/>
                     <w:szCs w:val="15"/>
                   </w:rPr>
-                  <w:t xml:space="preserve">type here</w:t>
+                  <w:t xml:space="preserve">Walking speed: Bohannon RW, Age Ageing 1997;26(1):15-19, doi 10.1093/ageing/26.1.15. Stairs: Dostan A et al., PLoS One 2023, doi 10.1371/journal.pone.0283333. Pause, rounds and guards per round: ASSUMPTION ranges.</w:t>
                 </w:r>
               </w:sdtContent>
             </w:sdt>
@@ -2763,7 +2763,7 @@
                     <w:sz w:val="15"/>
                     <w:szCs w:val="15"/>
                   </w:rPr>
-                  <w:t xml:space="preserve">type here</w:t>
+                  <w:t xml:space="preserve">Foot-patrol guards and the campus security or estate manager who carries the guard OpEx; people in the building between visits.</w:t>
                 </w:r>
               </w:sdtContent>
             </w:sdt>
@@ -3002,7 +3002,7 @@
                 <w:color w:val="000000"/>
                 <w:sz w:val="14"/>
               </w:rPr>
-              <w:t>timestep 0.004 s (250 Hz: set 0.002 s for 500 Hz logging) · friction 1.0 / 0.01 / 0.005 · 9 actuators (2 × 4 rotors + 1) · solref default</w:t>
+              <w:t>timestep 0.002 s (500 Hz) · friction 1 / 0.01 / 0.005 · 8 rotor actuators (2 UAVs × 4 rotors) · solref 0.004 1 on the airframe class, 0.02 1 on the floor</w:t>
             </w:r>
           </w:p>
         </w:tc>
@@ -3050,7 +3050,7 @@
                 <w:color w:val="000000"/>
                 <w:sz w:val="14"/>
               </w:rPr>
-              <w:t>PATROL (Alpha NE / Bravo SW sectors) → DETECT (OpenCV) → VERIFY → ALERT tier 0–3 (STATUS_3 = critical geofence breach) → TRACK → RETURN_TO_PATROL</w:t>
+              <w:t>PATROL (interior: Alpha flies the ground-floor corridor loop, Bravo sweeps the atrium galleries; exterior: the campus compound inside the boundary wall, ring flown as two arcs or by both UAVs half a lap apart) → DETECT (OpenCV HSV) → VERIFY → ALERT tier 0–3 (STATUS_3 = critical geofence breach) → TRACK → RETURN_TO_PATROL</w:t>
             </w:r>
           </w:p>
         </w:tc>
@@ -3209,7 +3209,7 @@
                     <w:sz w:val="15"/>
                     <w:szCs w:val="15"/>
                   </w:rPr>
-                  <w:t xml:space="preserve">type here</w:t>
+                  <w:t xml:space="preserve">0.002 s (500 Hz), implicitfast integrator, both scenes.</w:t>
                 </w:r>
               </w:sdtContent>
             </w:sdt>
@@ -3268,7 +3268,7 @@
                     <w:sz w:val="15"/>
                     <w:szCs w:val="15"/>
                   </w:rPr>
-                  <w:t xml:space="preserve">type here</w:t>
+                  <w:t xml:space="preserve">1 / 0.01 / 0.005 (sliding / torsional / rolling), condim 3, so only sliding friction acts (models/common.xml).</w:t>
                 </w:r>
               </w:sdtContent>
             </w:sdt>
@@ -3327,7 +3327,7 @@
                     <w:sz w:val="15"/>
                     <w:szCs w:val="15"/>
                   </w:rPr>
-                  <w:t xml:space="preserve">type here</w:t>
+                  <w:t xml:space="preserve">0.004 1 on the airframe, 0.02 1 on the floor. MuJoCo mixes them to 0.012 s for a leg contact, above 2 x timestep (0.004 s), so no clamp acts. Damping ratio 1 = critical, no bounce. Flight is thrust-driven, so contact settings do not drive any patrol metric.</w:t>
                 </w:r>
               </w:sdtContent>
             </w:sdt>
@@ -3394,7 +3394,7 @@
                     <w:sz w:val="15"/>
                     <w:szCs w:val="15"/>
                   </w:rPr>
-                  <w:t xml:space="preserve">Select ▾</w:t>
+                  <w:t xml:space="preserve">PI / PD</w:t>
                 </w:r>
               </w:sdtContent>
             </w:sdt>
@@ -3453,7 +3453,7 @@
                     <w:sz w:val="15"/>
                     <w:szCs w:val="15"/>
                   </w:rPr>
-                  <w:t xml:space="preserve">type here</w:t>
+                  <w:t xml:space="preserve">Position P 0.85; velocity PI 2.6 / 0.55; attitude PD roll and pitch 44.0 / 11.5, yaw 14.0 / 5.5. Separation: APF K_rep 8.5 below 2.5 m, plus a distance governor and a sidestep. FR-18: 26 beams, 8.0 m range, 100 Hz.</w:t>
                 </w:r>
               </w:sdtContent>
             </w:sdt>
@@ -3512,7 +3512,7 @@
                     <w:sz w:val="15"/>
                     <w:szCs w:val="15"/>
                   </w:rPr>
-                  <w:t xml:space="preserve">type here</w:t>
+                  <w:t xml:space="preserve">PATROL, DETECT, VERIFY, ALERT_0 to ALERT_3, TRACK, RETURN_TO_PATROL (DualUAVSurveillanceController._fsm_step). Vision 10 Hz; verify = 3 hits within 3.0 m; TRACK ends after 30 s or 2 s without a fix.</w:t>
                 </w:r>
               </w:sdtContent>
             </w:sdt>
@@ -3573,7 +3573,7 @@
                     <w:sz w:val="15"/>
                     <w:szCs w:val="15"/>
                   </w:rPr>
-                  <w:t xml:space="preserve">Select ▾</w:t>
+                  <w:t xml:space="preserve">Yes</w:t>
                 </w:r>
               </w:sdtContent>
             </w:sdt>
@@ -3780,7 +3780,7 @@
                     <w:sz w:val="14"/>
                     <w:szCs w:val="14"/>
                   </w:rPr>
-                  <w:t xml:space="preserve">Select ▾</w:t>
+                  <w:t xml:space="preserve">Modified by us</w:t>
                 </w:r>
               </w:sdtContent>
             </w:sdt>
@@ -3819,7 +3819,7 @@
                     <w:sz w:val="14"/>
                     <w:szCs w:val="14"/>
                   </w:rPr>
-                  <w:t xml:space="preserve">Select ▾</w:t>
+                  <w:t xml:space="preserve">E043</w:t>
                 </w:r>
               </w:sdtContent>
             </w:sdt>
@@ -3851,7 +3851,7 @@
                     <w:sz w:val="14"/>
                     <w:szCs w:val="14"/>
                   </w:rPr>
-                  <w:t xml:space="preserve">type here</w:t>
+                  <w:t xml:space="preserve">Scaffold names kept; timestep 0.002 s; 26 range-finder sites per airframe; scene geometry generated by models/scene_source. E043 area, AI-assisted.</w:t>
                 </w:r>
               </w:sdtContent>
             </w:sdt>
@@ -3915,7 +3915,7 @@
                     <w:sz w:val="14"/>
                     <w:szCs w:val="14"/>
                   </w:rPr>
-                  <w:t xml:space="preserve">Select ▾</w:t>
+                  <w:t xml:space="preserve">Modified by us</w:t>
                 </w:r>
               </w:sdtContent>
             </w:sdt>
@@ -3954,7 +3954,7 @@
                     <w:sz w:val="14"/>
                     <w:szCs w:val="14"/>
                   </w:rPr>
-                  <w:t xml:space="preserve">Select ▾</w:t>
+                  <w:t xml:space="preserve">Shared</w:t>
                 </w:r>
               </w:sdtContent>
             </w:sdt>
@@ -3986,7 +3986,7 @@
                     <w:sz w:val="14"/>
                     <w:szCs w:val="14"/>
                   </w:rPr>
-                  <w:t xml:space="preserve">type here</w:t>
+                  <w:t xml:space="preserve">E043: flight control, layered separation, FR-18 avoidance, FSM. E051 region: HSV detector, projection, target handoff. E075 region: geofence tiers with hysteresis. AI-assisted.</w:t>
                 </w:r>
               </w:sdtContent>
             </w:sdt>
@@ -4050,7 +4050,7 @@
                     <w:sz w:val="14"/>
                     <w:szCs w:val="14"/>
                   </w:rPr>
-                  <w:t xml:space="preserve">Select ▾</w:t>
+                  <w:t xml:space="preserve">Written by us</w:t>
                 </w:r>
               </w:sdtContent>
             </w:sdt>
@@ -4089,7 +4089,7 @@
                     <w:sz w:val="14"/>
                     <w:szCs w:val="14"/>
                   </w:rPr>
-                  <w:t xml:space="preserve">Select ▾</w:t>
+                  <w:t xml:space="preserve">E077</w:t>
                 </w:r>
               </w:sdtContent>
             </w:sdt>
@@ -4121,7 +4121,7 @@
                     <w:sz w:val="14"/>
                     <w:szCs w:val="14"/>
                   </w:rPr>
-                  <w:t xml:space="preserve">type here</w:t>
+                  <w:t xml:space="preserve">E077: scaffold constants replaced by a SOURCES table (cited or ASSUMPTION) and the hash-checked trials CSV; computes H_reclaimed, kappa, NCRI, P_payback, M/M/c, sensitivity and the FMEA. AI-assisted.</w:t>
                 </w:r>
               </w:sdtContent>
             </w:sdt>
@@ -4158,7 +4158,7 @@
                     <w:sz w:val="14"/>
                     <w:szCs w:val="14"/>
                   </w:rPr>
-                  <w:t xml:space="preserve">type here</w:t>
+                  <w:t xml:space="preserve">analytics/statistical_validation.py</w:t>
                 </w:r>
               </w:sdtContent>
             </w:sdt>
@@ -4196,7 +4196,7 @@
                     <w:sz w:val="14"/>
                     <w:szCs w:val="14"/>
                   </w:rPr>
-                  <w:t xml:space="preserve">Select ▾</w:t>
+                  <w:t xml:space="preserve">Written by us</w:t>
                 </w:r>
               </w:sdtContent>
             </w:sdt>
@@ -4235,7 +4235,7 @@
                     <w:sz w:val="14"/>
                     <w:szCs w:val="14"/>
                   </w:rPr>
-                  <w:t xml:space="preserve">Select ▾</w:t>
+                  <w:t xml:space="preserve">E075</w:t>
                 </w:r>
               </w:sdtContent>
             </w:sdt>
@@ -4267,7 +4267,7 @@
                     <w:sz w:val="14"/>
                     <w:szCs w:val="14"/>
                   </w:rPr>
-                  <w:t xml:space="preserve">type here</w:t>
+                  <w:t xml:space="preserve">E075: Welch's t test, exact p, Cohen's d and 95 % CI on the primary metric from the hash-checked CSV; the censored revisit is reported descriptively. AI-assisted.</w:t>
                 </w:r>
               </w:sdtContent>
             </w:sdt>
@@ -4303,7 +4303,7 @@
                     <w:sz w:val="14"/>
                     <w:szCs w:val="14"/>
                   </w:rPr>
-                  <w:t xml:space="preserve">type here</w:t>
+                  <w:t xml:space="preserve">analytics/vision_illumination_benchmark.py</w:t>
                 </w:r>
               </w:sdtContent>
             </w:sdt>
@@ -4340,7 +4340,7 @@
                     <w:sz w:val="14"/>
                     <w:szCs w:val="14"/>
                   </w:rPr>
-                  <w:t xml:space="preserve">Select ▾</w:t>
+                  <w:t xml:space="preserve">Written by us</w:t>
                 </w:r>
               </w:sdtContent>
             </w:sdt>
@@ -4378,7 +4378,7 @@
                     <w:sz w:val="14"/>
                     <w:szCs w:val="14"/>
                   </w:rPr>
-                  <w:t xml:space="preserve">Select ▾</w:t>
+                  <w:t xml:space="preserve">E051</w:t>
                 </w:r>
               </w:sdtContent>
             </w:sdt>
@@ -4409,7 +4409,7 @@
                     <w:sz w:val="14"/>
                     <w:szCs w:val="14"/>
                   </w:rPr>
-                  <w:t xml:space="preserve">type here</w:t>
+                  <w:t xml:space="preserve">E051: detector hit rate at noon and twilight (light x0.15, ASSUMPTION) in both scenes; feeds the FMEA twilight row. AI-assisted.</w:t>
                 </w:r>
               </w:sdtContent>
             </w:sdt>
@@ -4450,7 +4450,7 @@
       </w:tblGrid>
       <w:tr>
         <w:trPr>
-          <w:trHeight w:val="2608" w:hRule="exact"/>
+          <w:trHeight w:val="2608" w:hRule="atLeast"/>
           <w:cantSplit/>
         </w:trPr>
         <w:tc>
@@ -4460,17 +4460,261 @@
           <w:p>
             <w:pPr>
               <w:spacing w:after="0"/>
-              <w:jc w:val="center"/>
-            </w:pPr>
-            <w:r/>
+              <w:jc w:val="left"/>
+            </w:pPr>
             <w:r>
               <w:rPr>
-                <w:b w:val="0"/>
-                <w:i/>
-                <w:color w:val="595959"/>
-                <w:sz w:val="15"/>
+                <w:rFonts w:ascii="Consolas" w:hAnsi="Consolas" w:cs="Consolas"/>
+                <w:sz w:val="16"/>
               </w:rPr>
-              <w:t>[ Paste code as text (Consolas 8 pt), not a screenshot. Include the file name and line numbers. ]</w:t>
+              <w:t xml:space="preserve">src/aerial_patrol_swarm.py, DualUAVSurveillanceController._fsm_step (VERIFY -&gt; ALERT transition), lines 1405-1423</w:t>
+            </w:r>
+          </w:p>
+          <w:p>
+            <w:pPr>
+              <w:spacing w:after="0"/>
+              <w:jc w:val="left"/>
+            </w:pPr>
+            <w:r>
+              <w:rPr>
+                <w:rFonts w:ascii="Consolas" w:hAnsi="Consolas" w:cs="Consolas"/>
+                <w:sz w:val="16"/>
+              </w:rPr>
+              <w:t xml:space="preserve">1405  if self.surv_state in ("DETECT", "VERIFY"):</w:t>
+            </w:r>
+          </w:p>
+          <w:p>
+            <w:pPr>
+              <w:spacing w:after="0"/>
+              <w:jc w:val="left"/>
+            </w:pPr>
+            <w:r>
+              <w:rPr>
+                <w:rFonts w:ascii="Consolas" w:hAnsi="Consolas" w:cs="Consolas"/>
+                <w:sz w:val="16"/>
+              </w:rPr>
+              <w:t xml:space="preserve">1406      m = self._nearest_fix(fixes, inc["last_fix"], self.VERIFY_GATE_M)</w:t>
+            </w:r>
+          </w:p>
+          <w:p>
+            <w:pPr>
+              <w:spacing w:after="0"/>
+              <w:jc w:val="left"/>
+            </w:pPr>
+            <w:r>
+              <w:rPr>
+                <w:rFonts w:ascii="Consolas" w:hAnsi="Consolas" w:cs="Consolas"/>
+                <w:sz w:val="16"/>
+              </w:rPr>
+              <w:t xml:space="preserve">1407      if m is None:                                        # inconsistent / missing -&gt; reject</w:t>
+            </w:r>
+          </w:p>
+          <w:p>
+            <w:pPr>
+              <w:spacing w:after="0"/>
+              <w:jc w:val="left"/>
+            </w:pPr>
+            <w:r>
+              <w:rPr>
+                <w:rFonts w:ascii="Consolas" w:hAnsi="Consolas" w:cs="Consolas"/>
+                <w:sz w:val="16"/>
+              </w:rPr>
+              <w:t xml:space="preserve">1408          inc["t_close"], inc["close_reason"] = round(t, 3), "verify_reject"</w:t>
+            </w:r>
+          </w:p>
+          <w:p>
+            <w:pPr>
+              <w:spacing w:after="0"/>
+              <w:jc w:val="left"/>
+            </w:pPr>
+            <w:r>
+              <w:rPr>
+                <w:rFonts w:ascii="Consolas" w:hAnsi="Consolas" w:cs="Consolas"/>
+                <w:sz w:val="16"/>
+              </w:rPr>
+              <w:t xml:space="preserve">1409          self._set_role(owner, None, f"verify_reject:{inc['id']}")</w:t>
+            </w:r>
+          </w:p>
+          <w:p>
+            <w:pPr>
+              <w:spacing w:after="0"/>
+              <w:jc w:val="left"/>
+            </w:pPr>
+            <w:r>
+              <w:rPr>
+                <w:rFonts w:ascii="Consolas" w:hAnsi="Consolas" w:cs="Consolas"/>
+                <w:sz w:val="16"/>
+              </w:rPr>
+              <w:t xml:space="preserve">1410          self.surv_state, self._inc = "PATROL", None</w:t>
+            </w:r>
+          </w:p>
+          <w:p>
+            <w:pPr>
+              <w:spacing w:after="0"/>
+              <w:jc w:val="left"/>
+            </w:pPr>
+            <w:r>
+              <w:rPr>
+                <w:rFonts w:ascii="Consolas" w:hAnsi="Consolas" w:cs="Consolas"/>
+                <w:sz w:val="16"/>
+              </w:rPr>
+              <w:t xml:space="preserve">1411          return</w:t>
+            </w:r>
+          </w:p>
+          <w:p>
+            <w:pPr>
+              <w:spacing w:after="0"/>
+              <w:jc w:val="left"/>
+            </w:pPr>
+            <w:r>
+              <w:rPr>
+                <w:rFonts w:ascii="Consolas" w:hAnsi="Consolas" w:cs="Consolas"/>
+                <w:sz w:val="16"/>
+              </w:rPr>
+              <w:t xml:space="preserve">1412      inc["hits"] += 1</w:t>
+            </w:r>
+          </w:p>
+          <w:p>
+            <w:pPr>
+              <w:spacing w:after="0"/>
+              <w:jc w:val="left"/>
+            </w:pPr>
+            <w:r>
+              <w:rPr>
+                <w:rFonts w:ascii="Consolas" w:hAnsi="Consolas" w:cs="Consolas"/>
+                <w:sz w:val="16"/>
+              </w:rPr>
+              <w:t xml:space="preserve">1413      inc["last_fix"], inc["t_last_fix"] = m[2].copy(), t</w:t>
+            </w:r>
+          </w:p>
+          <w:p>
+            <w:pPr>
+              <w:spacing w:after="0"/>
+              <w:jc w:val="left"/>
+            </w:pPr>
+            <w:r>
+              <w:rPr>
+                <w:rFonts w:ascii="Consolas" w:hAnsi="Consolas" w:cs="Consolas"/>
+                <w:sz w:val="16"/>
+              </w:rPr>
+              <w:t xml:space="preserve">1414      if inc["hits"] &lt; self.VERIFY_K:</w:t>
+            </w:r>
+          </w:p>
+          <w:p>
+            <w:pPr>
+              <w:spacing w:after="0"/>
+              <w:jc w:val="left"/>
+            </w:pPr>
+            <w:r>
+              <w:rPr>
+                <w:rFonts w:ascii="Consolas" w:hAnsi="Consolas" w:cs="Consolas"/>
+                <w:sz w:val="16"/>
+              </w:rPr>
+              <w:t xml:space="preserve">1415          self.surv_state = "VERIFY"</w:t>
+            </w:r>
+          </w:p>
+          <w:p>
+            <w:pPr>
+              <w:spacing w:after="0"/>
+              <w:jc w:val="left"/>
+            </w:pPr>
+            <w:r>
+              <w:rPr>
+                <w:rFonts w:ascii="Consolas" w:hAnsi="Consolas" w:cs="Consolas"/>
+                <w:sz w:val="16"/>
+              </w:rPr>
+              <w:t xml:space="preserve">1416          self._set_role(owner, "VERIFY")</w:t>
+            </w:r>
+          </w:p>
+          <w:p>
+            <w:pPr>
+              <w:spacing w:after="0"/>
+              <w:jc w:val="left"/>
+            </w:pPr>
+            <w:r>
+              <w:rPr>
+                <w:rFonts w:ascii="Consolas" w:hAnsi="Consolas" w:cs="Consolas"/>
+                <w:sz w:val="16"/>
+              </w:rPr>
+              <w:t xml:space="preserve">1417          return</w:t>
+            </w:r>
+          </w:p>
+          <w:p>
+            <w:pPr>
+              <w:spacing w:after="0"/>
+              <w:jc w:val="left"/>
+            </w:pPr>
+            <w:r>
+              <w:rPr>
+                <w:rFonts w:ascii="Consolas" w:hAnsi="Consolas" w:cs="Consolas"/>
+                <w:sz w:val="16"/>
+              </w:rPr>
+              <w:t xml:space="preserve">1418      status, tier = self.evaluate_geofence_status(m[2])</w:t>
+            </w:r>
+          </w:p>
+          <w:p>
+            <w:pPr>
+              <w:spacing w:after="0"/>
+              <w:jc w:val="left"/>
+            </w:pPr>
+            <w:r>
+              <w:rPr>
+                <w:rFonts w:ascii="Consolas" w:hAnsi="Consolas" w:cs="Consolas"/>
+                <w:sz w:val="16"/>
+              </w:rPr>
+              <w:t xml:space="preserve">1419      inc.update(t_verify=round(t, 3), fix_verify=[round(float(v), 3) for v in m[2]], tier_alert=int(tier),</w:t>
+            </w:r>
+          </w:p>
+          <w:p>
+            <w:pPr>
+              <w:spacing w:after="0"/>
+              <w:jc w:val="left"/>
+            </w:pPr>
+            <w:r>
+              <w:rPr>
+                <w:rFonts w:ascii="Consolas" w:hAnsi="Consolas" w:cs="Consolas"/>
+                <w:sz w:val="16"/>
+              </w:rPr>
+              <w:t xml:space="preserve">1420                 tier_max=int(tier))</w:t>
+            </w:r>
+          </w:p>
+          <w:p>
+            <w:pPr>
+              <w:spacing w:after="0"/>
+              <w:jc w:val="left"/>
+            </w:pPr>
+            <w:r>
+              <w:rPr>
+                <w:rFonts w:ascii="Consolas" w:hAnsi="Consolas" w:cs="Consolas"/>
+                <w:sz w:val="16"/>
+              </w:rPr>
+              <w:t xml:space="preserve">1421      self.alert_status = status</w:t>
+            </w:r>
+          </w:p>
+          <w:p>
+            <w:pPr>
+              <w:spacing w:after="0"/>
+              <w:jc w:val="left"/>
+            </w:pPr>
+            <w:r>
+              <w:rPr>
+                <w:rFonts w:ascii="Consolas" w:hAnsi="Consolas" w:cs="Consolas"/>
+                <w:sz w:val="16"/>
+              </w:rPr>
+              <w:t xml:space="preserve">1422      self.surv_state = f"ALERT_{tier}"</w:t>
+            </w:r>
+          </w:p>
+          <w:p>
+            <w:pPr>
+              <w:spacing w:after="0"/>
+              <w:jc w:val="left"/>
+            </w:pPr>
+            <w:r>
+              <w:rPr>
+                <w:rFonts w:ascii="Consolas" w:hAnsi="Consolas" w:cs="Consolas"/>
+                <w:sz w:val="16"/>
+              </w:rPr>
+              <w:t xml:space="preserve">1423      self._set_role(owner, f"ALERT_{tier}", f"verify:{inc['id']};alert:{tier}")</w:t>
             </w:r>
           </w:p>
         </w:tc>
@@ -4509,7 +4753,7 @@
       </w:tblGrid>
       <w:tr>
         <w:trPr>
-          <w:trHeight w:val="2381" w:hRule="exact"/>
+          <w:trHeight w:val="2381" w:hRule="atLeast"/>
           <w:cantSplit/>
         </w:trPr>
         <w:tc>
@@ -4529,7 +4773,7 @@
                 <w:color w:val="595959"/>
                 <w:sz w:val="15"/>
               </w:rPr>
-              <w:t>[ FBD (phone photo of a hand sketch is fine) → symbols explained → worked example → where this value appears in your telemetry CSV ]</w:t>
+              <w:t>Free-body diagram of one UAV in hover (draw it: body at the centre, weight W = m g downward, four rotor forces F0 to F3 upward at arm length l = 0.26 m on the + layout, wind drag omitted). Hover balance: F0 + F1 + F2 + F3 = m g. Worked example with the model's own numbers (printed by docs/dossier_fill_facts.py from body_subtreemass, key F-mass): m = 1.35 kg, so m g = 1.35 x 9.81 = 13.24 N; per rotor 3.31 N; maximum thrust 4 x 7.5 N = 30.0 N, so T/W = 30.0 / 13.24 = 2.27. In the telemetry CSV (analytics/runs/&lt;run&gt;.csv.gz) the rotor forces are columns f0..f3 in N; the median of f0+f1+f2+f3 for Alpha while fsm_state = PATROL in interior_uav_sectors_s1 is 13.245 N (key F-tel-hover), against m g = 13.244 N.</w:t>
             </w:r>
           </w:p>
         </w:tc>
@@ -5000,7 +5244,7 @@
                     <w:sz w:val="14"/>
                     <w:szCs w:val="14"/>
                   </w:rPr>
-                  <w:t xml:space="preserve">type here</w:t>
+                  <w:t xml:space="preserve">H_patrol = (24 / hours_per_shift) x rounds_per_shift x guards_per_round x simulated guard cycle time; H_reclaimed = replacement_fraction x H_patrol, gated on UAV revisit (PASS in all 4 cells). Base case = midpoint of each ASSUMPTION range; full table in the economics output.</w:t>
                 </w:r>
               </w:sdtContent>
             </w:sdt>
@@ -5032,7 +5276,7 @@
                     <w:sz w:val="14"/>
                     <w:szCs w:val="14"/>
                   </w:rPr>
-                  <w:t xml:space="preserve">type here</w:t>
+                  <w:t xml:space="preserve">interior 13.84 guard-hours/day (2.429 FTE), exterior 3.00 guard-hours/day (0.526 FTE). Conditional on the ASSUMPTION ranges.</w:t>
                 </w:r>
               </w:sdtContent>
             </w:sdt>
@@ -5112,7 +5356,7 @@
                     <w:sz w:val="14"/>
                     <w:szCs w:val="14"/>
                   </w:rPr>
-                  <w:t xml:space="preserve">type here</w:t>
+                  <w:t xml:space="preserve">P_payback = k / (T_life x (R - k u)); T_payback = 12 k / (R - k u) months. k = capex_ratio (ASSUMPTION 0.2 to 1.1); T_life 2 to 5 years (ASSUMPTION). All costs are ratios to one year of guard patrol labour.</w:t>
                 </w:r>
               </w:sdtContent>
             </w:sdt>
@@ -5144,7 +5388,7 @@
                     <w:sz w:val="14"/>
                     <w:szCs w:val="14"/>
                   </w:rPr>
-                  <w:t xml:space="preserve">type here</w:t>
+                  <w:t xml:space="preserve">Base case: interior sectors 0.304, interior offset_ring 0.301, exterior sectors 0.306, exterior offset_ring 0.300. P &lt; 1 = pays back within the service life; 0 of 512 range corners never pay back.</w:t>
                 </w:r>
               </w:sdtContent>
             </w:sdt>
@@ -5224,7 +5468,7 @@
                     <w:sz w:val="14"/>
                     <w:szCs w:val="14"/>
                   </w:rPr>
-                  <w:t xml:space="preserve">type here</w:t>
+                  <w:t xml:space="preserve">NCRI = 1 - kappa; kappa = annual UAV running cost / annual value of reclaimed guard hours (target kappa &lt;= 0.25).</w:t>
                 </w:r>
               </w:sdtContent>
             </w:sdt>
@@ -5256,7 +5500,7 @@
                     <w:sz w:val="14"/>
                     <w:szCs w:val="14"/>
                   </w:rPr>
-                  <w:t xml:space="preserve">type here</w:t>
+                  <w:t xml:space="preserve">kappa / NCRI: interior sectors 0.185 / 0.815; interior offset_ring 0.177 / 0.823; exterior sectors 0.192 / 0.808; exterior offset_ring 0.176 / 0.824. All meet kappa &lt;= 0.25.</w:t>
                 </w:r>
               </w:sdtContent>
             </w:sdt>
@@ -5336,7 +5580,7 @@
                     <w:sz w:val="14"/>
                     <w:szCs w:val="14"/>
                   </w:rPr>
-                  <w:t xml:space="preserve">type here</w:t>
+                  <w:t xml:space="preserve">M/M/c, c = 2 UAVs; lambda from 1 to 10 incidents/month (ASSUMPTION); mu = 1 / (simulated detection + verify time); guard mu from a 2 to 10 min response (ASSUMPTION); W_q by Erlang C.</w:t>
                 </w:r>
               </w:sdtContent>
             </w:sdt>
@@ -5368,7 +5612,7 @@
                     <w:sz w:val="14"/>
                     <w:szCs w:val="14"/>
                   </w:rPr>
-                  <w:t xml:space="preserve">type here</w:t>
+                  <w:t xml:space="preserve">Base lambda: interior sectors rho = 0.00003, exterior sectors rho = 0.00001; W_q is about zero. The queue shows utilisation headroom, not a delay problem.</w:t>
                 </w:r>
               </w:sdtContent>
             </w:sdt>
@@ -5445,7 +5689,7 @@
                     <w:sz w:val="14"/>
                     <w:szCs w:val="14"/>
                   </w:rPr>
-                  <w:t xml:space="preserve">type here</w:t>
+                  <w:t xml:space="preserve">Most uncertain input (widest ASSUMPTION range): capex_ratio 0.2 to 1.1, swept -30 % to +30 %; P_payback and NCRI plotted.</w:t>
                 </w:r>
               </w:sdtContent>
             </w:sdt>
@@ -5476,7 +5720,7 @@
                     <w:sz w:val="14"/>
                     <w:szCs w:val="14"/>
                   </w:rPr>
-                  <w:t xml:space="preserve">type here</w:t>
+                  <w:t xml:space="preserve">No break-even inside the assumed capex range in any cell: P_payback reaches 1 only at capex_ratio 1.501 (interior sectors), 1.531, 1.480 and 1.535, all above the assumed maximum of 1.1. Figure: analytics/figures/campus_security_sensitivity.png.</w:t>
                 </w:r>
               </w:sdtContent>
             </w:sdt>
@@ -5558,7 +5802,7 @@
                     <w:sz w:val="15"/>
                     <w:szCs w:val="15"/>
                   </w:rPr>
-                  <w:t xml:space="preserve">Select ▾</w:t>
+                  <w:t xml:space="preserve">M/M/c</w:t>
                 </w:r>
               </w:sdtContent>
             </w:sdt>
@@ -5617,7 +5861,7 @@
                     <w:sz w:val="15"/>
                     <w:szCs w:val="15"/>
                   </w:rPr>
-                  <w:t xml:space="preserve">type here</w:t>
+                  <w:t xml:space="preserve">lambda 0.00137 / 0.00753 / 0.01370 per h (low / base / high, ASSUMPTION); UAV mu 142.473 per h (interior), 277.021 per h (exterior); guard mu 10.000 per h; c = 2.</w:t>
                 </w:r>
               </w:sdtContent>
             </w:sdt>
@@ -5676,7 +5920,7 @@
                     <w:sz w:val="15"/>
                     <w:szCs w:val="15"/>
                   </w:rPr>
-                  <w:t xml:space="preserve">type here</w:t>
+                  <w:t xml:space="preserve">interior sectors 12.8 months; interior offset_ring 12.6 months; exterior sectors 12.9 months; exterior offset_ring 12.6 months</w:t>
                 </w:r>
               </w:sdtContent>
             </w:sdt>
@@ -5737,7 +5981,7 @@
                     <w:sz w:val="15"/>
                     <w:szCs w:val="15"/>
                   </w:rPr>
-                  <w:t xml:space="preserve">Select ▾</w:t>
+                  <w:t xml:space="preserve">Yes</w:t>
                 </w:r>
               </w:sdtContent>
             </w:sdt>
@@ -6054,7 +6298,7 @@
                     <w:sz w:val="14"/>
                     <w:szCs w:val="14"/>
                   </w:rPr>
-                  <w:t xml:space="preserve">type here</w:t>
+                  <w:t xml:space="preserve">airframe contact, both vehicles lost</w:t>
                 </w:r>
               </w:sdtContent>
             </w:sdt>
@@ -6098,7 +6342,7 @@
                     <w:sz w:val="14"/>
                     <w:szCs w:val="14"/>
                   </w:rPr>
-                  <w:t xml:space="preserve">Select ▾</w:t>
+                  <w:t xml:space="preserve">9</w:t>
                 </w:r>
               </w:sdtContent>
             </w:sdt>
@@ -6142,7 +6386,7 @@
                     <w:sz w:val="14"/>
                     <w:szCs w:val="14"/>
                   </w:rPr>
-                  <w:t xml:space="preserve">Select ▾</w:t>
+                  <w:t xml:space="preserve">9</w:t>
                 </w:r>
               </w:sdtContent>
             </w:sdt>
@@ -6186,7 +6430,7 @@
                     <w:sz w:val="14"/>
                     <w:szCs w:val="14"/>
                   </w:rPr>
-                  <w:t xml:space="preserve">Select ▾</w:t>
+                  <w:t xml:space="preserve">7</w:t>
                 </w:r>
               </w:sdtContent>
             </w:sdt>
@@ -6218,7 +6462,7 @@
                     <w:sz w:val="14"/>
                     <w:szCs w:val="14"/>
                   </w:rPr>
-                  <w:t xml:space="preserve">type here</w:t>
+                  <w:t xml:space="preserve">567 interior; not measured exterior</w:t>
                 </w:r>
               </w:sdtContent>
             </w:sdt>
@@ -6250,7 +6494,7 @@
                     <w:sz w:val="14"/>
                     <w:szCs w:val="14"/>
                   </w:rPr>
-                  <w:t xml:space="preserve">type here</w:t>
+                  <w:t xml:space="preserve">[E043] Layered altitude separation and a distance governor on top of APF. Ablation (interior): O 9 to 1 (6/10 to 0/10 runs). 0 UAV-UAV contacts in all 120 UAV runs; closest approach 3.05 m.</w:t>
                 </w:r>
               </w:sdtContent>
             </w:sdt>
@@ -6282,7 +6526,7 @@
                     <w:sz w:val="14"/>
                     <w:szCs w:val="14"/>
                   </w:rPr>
-                  <w:t xml:space="preserve">type here</w:t>
+                  <w:t xml:space="preserve">9 interior; not measured exterior</w:t>
                 </w:r>
               </w:sdtContent>
             </w:sdt>
@@ -6320,7 +6564,7 @@
                     <w:sz w:val="14"/>
                     <w:szCs w:val="14"/>
                   </w:rPr>
-                  <w:t xml:space="preserve">Select ▾</w:t>
+                  <w:t xml:space="preserve">Both</w:t>
                 </w:r>
               </w:sdtContent>
             </w:sdt>
@@ -6379,7 +6623,7 @@
                     <w:sz w:val="14"/>
                     <w:szCs w:val="14"/>
                   </w:rPr>
-                  <w:t xml:space="preserve">type here</w:t>
+                  <w:t xml:space="preserve">no ALERT; patrol continues past the intruder</w:t>
                 </w:r>
               </w:sdtContent>
             </w:sdt>
@@ -6423,7 +6667,7 @@
                     <w:sz w:val="14"/>
                     <w:szCs w:val="14"/>
                   </w:rPr>
-                  <w:t xml:space="preserve">Select ▾</w:t>
+                  <w:t xml:space="preserve">8</w:t>
                 </w:r>
               </w:sdtContent>
             </w:sdt>
@@ -6467,7 +6711,7 @@
                     <w:sz w:val="14"/>
                     <w:szCs w:val="14"/>
                   </w:rPr>
-                  <w:t xml:space="preserve">Select ▾</w:t>
+                  <w:t xml:space="preserve">10</w:t>
                 </w:r>
               </w:sdtContent>
             </w:sdt>
@@ -6511,7 +6755,7 @@
                     <w:sz w:val="14"/>
                     <w:szCs w:val="14"/>
                   </w:rPr>
-                  <w:t xml:space="preserve">Select ▾</w:t>
+                  <w:t xml:space="preserve">10</w:t>
                 </w:r>
               </w:sdtContent>
             </w:sdt>
@@ -6543,7 +6787,7 @@
                     <w:sz w:val="14"/>
                     <w:szCs w:val="14"/>
                   </w:rPr>
-                  <w:t xml:space="preserve">type here</w:t>
+                  <w:t xml:space="preserve">800 interior; not measured exterior</w:t>
                 </w:r>
               </w:sdtContent>
             </w:sdt>
@@ -6575,7 +6819,7 @@
                     <w:sz w:val="14"/>
                     <w:szCs w:val="14"/>
                   </w:rPr>
-                  <w:t xml:space="preserve">type here</w:t>
+                  <w:t xml:space="preserve">[E051] Twilight exposure fix in the detector. Ablation (interior): O 10 to 8 (10/10 to 4/10 runs), D 10 to 1.</w:t>
                 </w:r>
               </w:sdtContent>
             </w:sdt>
@@ -6607,7 +6851,7 @@
                     <w:sz w:val="14"/>
                     <w:szCs w:val="14"/>
                   </w:rPr>
-                  <w:t xml:space="preserve">type here</w:t>
+                  <w:t xml:space="preserve">64 interior; not measured exterior</w:t>
                 </w:r>
               </w:sdtContent>
             </w:sdt>
@@ -6645,7 +6889,7 @@
                     <w:sz w:val="14"/>
                     <w:szCs w:val="14"/>
                   </w:rPr>
-                  <w:t xml:space="preserve">Select ▾</w:t>
+                  <w:t xml:space="preserve">Both</w:t>
                 </w:r>
               </w:sdtContent>
             </w:sdt>
@@ -6683,7 +6927,7 @@
                     <w:sz w:val="14"/>
                     <w:szCs w:val="14"/>
                   </w:rPr>
-                  <w:t xml:space="preserve">type here</w:t>
+                  <w:t xml:space="preserve">False geofence alarm from position noise</w:t>
                 </w:r>
               </w:sdtContent>
             </w:sdt>
@@ -6715,7 +6959,7 @@
                     <w:sz w:val="14"/>
                     <w:szCs w:val="14"/>
                   </w:rPr>
-                  <w:t xml:space="preserve">type here</w:t>
+                  <w:t xml:space="preserve">spurious tier escalation, guard sent for nothing</w:t>
                 </w:r>
               </w:sdtContent>
             </w:sdt>
@@ -6759,7 +7003,7 @@
                     <w:sz w:val="14"/>
                     <w:szCs w:val="14"/>
                   </w:rPr>
-                  <w:t xml:space="preserve">Select ▾</w:t>
+                  <w:t xml:space="preserve">4</w:t>
                 </w:r>
               </w:sdtContent>
             </w:sdt>
@@ -6803,7 +7047,7 @@
                     <w:sz w:val="14"/>
                     <w:szCs w:val="14"/>
                   </w:rPr>
-                  <w:t xml:space="preserve">Select ▾</w:t>
+                  <w:t xml:space="preserve">10</w:t>
                 </w:r>
               </w:sdtContent>
             </w:sdt>
@@ -6847,7 +7091,7 @@
                     <w:sz w:val="14"/>
                     <w:szCs w:val="14"/>
                   </w:rPr>
-                  <w:t xml:space="preserve">Select ▾</w:t>
+                  <w:t xml:space="preserve">10</w:t>
                 </w:r>
               </w:sdtContent>
             </w:sdt>
@@ -6879,7 +7123,7 @@
                     <w:sz w:val="14"/>
                     <w:szCs w:val="14"/>
                   </w:rPr>
-                  <w:t xml:space="preserve">type here</w:t>
+                  <w:t xml:space="preserve">400 interior; not measured exterior</w:t>
                 </w:r>
               </w:sdtContent>
             </w:sdt>
@@ -6911,7 +7155,7 @@
                     <w:sz w:val="14"/>
                     <w:szCs w:val="14"/>
                   </w:rPr>
-                  <w:t xml:space="preserve">type here</w:t>
+                  <w:t xml:space="preserve">[E075] Exit margin and tier-3 dwell on the geofence. Ablation (interior, noisy position): O 10 to 6 (10/10 to 1/10 runs), D 10 to 1.</w:t>
                 </w:r>
               </w:sdtContent>
             </w:sdt>
@@ -6943,7 +7187,7 @@
                     <w:sz w:val="14"/>
                     <w:szCs w:val="14"/>
                   </w:rPr>
-                  <w:t xml:space="preserve">type here</w:t>
+                  <w:t xml:space="preserve">24 interior; not measured exterior</w:t>
                 </w:r>
               </w:sdtContent>
             </w:sdt>
@@ -6981,7 +7225,7 @@
                     <w:sz w:val="14"/>
                     <w:szCs w:val="14"/>
                   </w:rPr>
-                  <w:t xml:space="preserve">Select ▾</w:t>
+                  <w:t xml:space="preserve">Both</w:t>
                 </w:r>
               </w:sdtContent>
             </w:sdt>
@@ -7019,7 +7263,7 @@
                     <w:sz w:val="14"/>
                     <w:szCs w:val="14"/>
                   </w:rPr>
-                  <w:t xml:space="preserve">type here</w:t>
+                  <w:t xml:space="preserve">Intruder not detected in a patrol run (any lighting)</w:t>
                 </w:r>
               </w:sdtContent>
             </w:sdt>
@@ -7051,7 +7295,7 @@
                     <w:sz w:val="14"/>
                     <w:szCs w:val="14"/>
                   </w:rPr>
-                  <w:t xml:space="preserve">type here</w:t>
+                  <w:t xml:space="preserve">breach goes unnoticed</w:t>
                 </w:r>
               </w:sdtContent>
             </w:sdt>
@@ -7095,7 +7339,7 @@
                     <w:sz w:val="14"/>
                     <w:szCs w:val="14"/>
                   </w:rPr>
-                  <w:t xml:space="preserve">Select ▾</w:t>
+                  <w:t xml:space="preserve">8</w:t>
                 </w:r>
               </w:sdtContent>
             </w:sdt>
@@ -7139,7 +7383,7 @@
                     <w:sz w:val="14"/>
                     <w:szCs w:val="14"/>
                   </w:rPr>
-                  <w:t xml:space="preserve">Select ▾</w:t>
+                  <w:t xml:space="preserve">9</w:t>
                 </w:r>
               </w:sdtContent>
             </w:sdt>
@@ -7183,7 +7427,7 @@
                     <w:sz w:val="14"/>
                     <w:szCs w:val="14"/>
                   </w:rPr>
-                  <w:t xml:space="preserve">Select ▾</w:t>
+                  <w:t xml:space="preserve">6</w:t>
                 </w:r>
               </w:sdtContent>
             </w:sdt>
@@ -7215,7 +7459,7 @@
                     <w:sz w:val="14"/>
                     <w:szCs w:val="14"/>
                   </w:rPr>
-                  <w:t xml:space="preserve">type here</w:t>
+                  <w:t xml:space="preserve">432 interior; 48 exterior</w:t>
                 </w:r>
               </w:sdtContent>
             </w:sdt>
@@ -7247,7 +7491,7 @@
                     <w:sz w:val="14"/>
                     <w:szCs w:val="14"/>
                   </w:rPr>
-                  <w:t xml:space="preserve">type here</w:t>
+                  <w:t xml:space="preserve">[E043 with E051 detector] UAV patrol with camera detection. Interior O stays 9 (guard 19/30, UAV 37/60), so no indoor detection gain; D 6 to 4 (team judgement).</w:t>
                 </w:r>
               </w:sdtContent>
             </w:sdt>
@@ -7279,7 +7523,7 @@
                     <w:sz w:val="14"/>
                     <w:szCs w:val="14"/>
                   </w:rPr>
-                  <w:t xml:space="preserve">type here</w:t>
+                  <w:t xml:space="preserve">288 interior; 32 exterior</w:t>
                 </w:r>
               </w:sdtContent>
             </w:sdt>
@@ -7317,7 +7561,7 @@
                     <w:sz w:val="14"/>
                     <w:szCs w:val="14"/>
                   </w:rPr>
-                  <w:t xml:space="preserve">Select ▾</w:t>
+                  <w:t xml:space="preserve">Simulation</w:t>
                 </w:r>
               </w:sdtContent>
             </w:sdt>
@@ -7354,7 +7598,7 @@
                     <w:sz w:val="14"/>
                     <w:szCs w:val="14"/>
                   </w:rPr>
-                  <w:t xml:space="preserve">type here</w:t>
+                  <w:t xml:space="preserve">Collision with an obstacle the UAV did not sense (FR-18)</w:t>
                 </w:r>
               </w:sdtContent>
             </w:sdt>
@@ -7385,7 +7629,7 @@
                     <w:sz w:val="14"/>
                     <w:szCs w:val="14"/>
                   </w:rPr>
-                  <w:t xml:space="preserve">type here</w:t>
+                  <w:t xml:space="preserve">crash into furniture, column or wall; patrol aborted</w:t>
                 </w:r>
               </w:sdtContent>
             </w:sdt>
@@ -7428,7 +7672,7 @@
                     <w:sz w:val="14"/>
                     <w:szCs w:val="14"/>
                   </w:rPr>
-                  <w:t xml:space="preserve">Select ▾</w:t>
+                  <w:t xml:space="preserve">8</w:t>
                 </w:r>
               </w:sdtContent>
             </w:sdt>
@@ -7471,7 +7715,7 @@
                     <w:sz w:val="14"/>
                     <w:szCs w:val="14"/>
                   </w:rPr>
-                  <w:t xml:space="preserve">Select ▾</w:t>
+                  <w:t xml:space="preserve">1</w:t>
                 </w:r>
               </w:sdtContent>
             </w:sdt>
@@ -7514,7 +7758,7 @@
                     <w:sz w:val="14"/>
                     <w:szCs w:val="14"/>
                   </w:rPr>
-                  <w:t xml:space="preserve">Select ▾</w:t>
+                  <w:t xml:space="preserve">1</w:t>
                 </w:r>
               </w:sdtContent>
             </w:sdt>
@@ -7545,7 +7789,7 @@
                     <w:sz w:val="14"/>
                     <w:szCs w:val="14"/>
                   </w:rPr>
-                  <w:t xml:space="preserve">type here</w:t>
+                  <w:t xml:space="preserve">8 interior; not measured exterior</w:t>
                 </w:r>
               </w:sdtContent>
             </w:sdt>
@@ -7576,7 +7820,7 @@
                     <w:sz w:val="14"/>
                     <w:szCs w:val="14"/>
                   </w:rPr>
-                  <w:t xml:space="preserve">type here</w:t>
+                  <w:t xml:space="preserve">[E043] FR-18 range-ring sensing with avoidance never disabled. Ablation (interior): O 1 in both arms (0/10 runs).</w:t>
                 </w:r>
               </w:sdtContent>
             </w:sdt>
@@ -7607,7 +7851,7 @@
                     <w:sz w:val="14"/>
                     <w:szCs w:val="14"/>
                   </w:rPr>
-                  <w:t xml:space="preserve">type here</w:t>
+                  <w:t xml:space="preserve">8 interior; not measured exterior</w:t>
                 </w:r>
               </w:sdtContent>
             </w:sdt>
@@ -7644,7 +7888,7 @@
                     <w:sz w:val="14"/>
                     <w:szCs w:val="14"/>
                   </w:rPr>
-                  <w:t xml:space="preserve">Select ▾</w:t>
+                  <w:t xml:space="preserve">Both</w:t>
                 </w:r>
               </w:sdtContent>
             </w:sdt>
@@ -7671,7 +7915,7 @@
       </w:tblGrid>
       <w:tr>
         <w:trPr>
-          <w:trHeight w:val="2608" w:hRule="exact"/>
+          <w:trHeight w:val="2608" w:hRule="atLeast"/>
           <w:cantSplit/>
         </w:trPr>
         <w:tc>
@@ -7684,15 +7928,47 @@
               <w:spacing w:after="0"/>
               <w:jc w:val="center"/>
             </w:pPr>
-            <w:r/>
+            <w:r>
+              <w:drawing>
+                <wp:inline xmlns:a="http://schemas.openxmlformats.org/drawingml/2006/main" xmlns:pic="http://schemas.openxmlformats.org/drawingml/2006/picture">
+                  <wp:extent cx="2951999" cy="1180800"/>
+                  <wp:docPr id="1" name="Picture 1"/>
+                  <wp:cNvGraphicFramePr>
+                    <a:graphicFrameLocks noChangeAspect="1"/>
+                  </wp:cNvGraphicFramePr>
+                  <a:graphic>
+                    <a:graphicData uri="http://schemas.openxmlformats.org/drawingml/2006/picture">
+                      <pic:pic>
+                        <pic:nvPicPr>
+                          <pic:cNvPr id="0" name="campus_security_sensitivity.png"/>
+                          <pic:cNvPicPr/>
+                        </pic:nvPicPr>
+                        <pic:blipFill>
+                          <a:blip r:embed="rId10"/>
+                          <a:stretch>
+                            <a:fillRect/>
+                          </a:stretch>
+                        </pic:blipFill>
+                        <pic:spPr>
+                          <a:xfrm>
+                            <a:off x="0" y="0"/>
+                            <a:ext cx="2951999" cy="1180800"/>
+                          </a:xfrm>
+                          <a:prstGeom prst="rect"/>
+                        </pic:spPr>
+                      </pic:pic>
+                    </a:graphicData>
+                  </a:graphic>
+                </wp:inline>
+              </w:drawing>
+            </w:r>
+          </w:p>
+          <w:p>
             <w:r>
               <w:rPr>
-                <w:b w:val="0"/>
-                <w:i/>
-                <w:color w:val="595959"/>
-                <w:sz w:val="15"/>
+                <w:sz w:val="13"/>
               </w:rPr>
-              <w:t>[ Sensitivity graph: P_payback / NCRI vs the uncertain input ]</w:t>
+              <w:t>Sensitivity of P_payback and NCRI (analytics/campus_security_economics.py, from the real trials).</w:t>
             </w:r>
           </w:p>
         </w:tc>
@@ -7706,15 +7982,47 @@
               <w:spacing w:after="0"/>
               <w:jc w:val="center"/>
             </w:pPr>
-            <w:r/>
+            <w:r>
+              <w:drawing>
+                <wp:inline xmlns:a="http://schemas.openxmlformats.org/drawingml/2006/main" xmlns:pic="http://schemas.openxmlformats.org/drawingml/2006/picture">
+                  <wp:extent cx="2951999" cy="1180800"/>
+                  <wp:docPr id="2" name="Picture 2"/>
+                  <wp:cNvGraphicFramePr>
+                    <a:graphicFrameLocks noChangeAspect="1"/>
+                  </wp:cNvGraphicFramePr>
+                  <a:graphic>
+                    <a:graphicData uri="http://schemas.openxmlformats.org/drawingml/2006/picture">
+                      <pic:pic>
+                        <pic:nvPicPr>
+                          <pic:cNvPr id="0" name="campus_security_queue.png"/>
+                          <pic:cNvPicPr/>
+                        </pic:nvPicPr>
+                        <pic:blipFill>
+                          <a:blip r:embed="rId11"/>
+                          <a:stretch>
+                            <a:fillRect/>
+                          </a:stretch>
+                        </pic:blipFill>
+                        <pic:spPr>
+                          <a:xfrm>
+                            <a:off x="0" y="0"/>
+                            <a:ext cx="2951999" cy="1180800"/>
+                          </a:xfrm>
+                          <a:prstGeom prst="rect"/>
+                        </pic:spPr>
+                      </pic:pic>
+                    </a:graphicData>
+                  </a:graphic>
+                </wp:inline>
+              </w:drawing>
+            </w:r>
+          </w:p>
+          <w:p>
             <w:r>
               <w:rPr>
-                <w:b w:val="0"/>
-                <w:i/>
-                <w:color w:val="595959"/>
-                <w:sz w:val="15"/>
+                <w:sz w:val="13"/>
               </w:rPr>
-              <w:t>[ Queuing graph: W_q vs utilisation ρ, or labour-reallocation chart ]</w:t>
+              <w:t>Queue waiting time against utilisation (analytics/campus_security_economics.py).</w:t>
             </w:r>
           </w:p>
         </w:tc>
@@ -8168,7 +8476,7 @@
                     <w:sz w:val="15"/>
                     <w:szCs w:val="15"/>
                   </w:rPr>
-                  <w:t xml:space="preserve">type here</w:t>
+                  <w:t xml:space="preserve">Guard on foot in the same scene (kinematic walker), speed U[1.272, 1.462] m/s (Bohannon 1997), pause 10.0 to 60.0 s (ASSUMPTION). Proposed: uav_sectors (primary) and uav_offset_ring. The primary metric cycle_time_s is window-independent.</w:t>
                 </w:r>
               </w:sdtContent>
             </w:sdt>
@@ -8227,7 +8535,7 @@
                     <w:sz w:val="15"/>
                     <w:szCs w:val="15"/>
                   </w:rPr>
-                  <w:t xml:space="preserve">type here</w:t>
+                  <w:t xml:space="preserve">N = 30 per cell in all 6 cells (2 scenes x 3 conditions = 180 runs); seeds 1 to 30 in every cell; timestep 0.002 s.</w:t>
                 </w:r>
               </w:sdtContent>
             </w:sdt>
@@ -8286,7 +8594,7 @@
                     <w:sz w:val="15"/>
                     <w:szCs w:val="15"/>
                   </w:rPr>
-                  <w:t xml:space="preserve">type here</w:t>
+                  <w:t xml:space="preserve">Per seed, same draw for all 3 conditions: wind U[0.0, 6.0] m/s (x0.08 indoors), gust sigma U[0.5, 2.0] m/s, intruder appears U[40.0, 160.0] s, dock jitter U[0.0, 0.3] m, guard speed U[1.272, 1.462] m/s.</w:t>
                 </w:r>
               </w:sdtContent>
             </w:sdt>
@@ -8345,7 +8653,7 @@
                     <w:sz w:val="15"/>
                     <w:szCs w:val="15"/>
                   </w:rPr>
-                  <w:t xml:space="preserve">type here</w:t>
+                  <w:t xml:space="preserve">500 Hz: one row per 0.002 s step per vehicle (position, velocity, reference, error, rotor forces, FSM state, attitude). Telemetry kept for 180 of 180 runs; vision 10.0 Hz.</w:t>
                 </w:r>
               </w:sdtContent>
             </w:sdt>
@@ -8408,7 +8716,7 @@
                     <w:sz w:val="15"/>
                     <w:szCs w:val="15"/>
                   </w:rPr>
-                  <w:t xml:space="preserve">Select ▾</w:t>
+                  <w:t xml:space="preserve">Yes</w:t>
                 </w:r>
               </w:sdtContent>
             </w:sdt>
@@ -8465,7 +8773,7 @@
                     <w:sz w:val="15"/>
                     <w:szCs w:val="15"/>
                   </w:rPr>
-                  <w:t xml:space="preserve">type here</w:t>
+                  <w:t xml:space="preserve">Group_05_Muaaz_Aditya_Zaid_Soumya/analytics/campus_patrol_real_trials.csv (180 rows) and its provenance.json (sha256 checked).</w:t>
                 </w:r>
               </w:sdtContent>
             </w:sdt>
@@ -8682,7 +8990,7 @@
                     <w:sz w:val="15"/>
                     <w:szCs w:val="15"/>
                   </w:rPr>
-                  <w:t xml:space="preserve">type here</w:t>
+                  <w:t xml:space="preserve">30 UAV runs per cell</w:t>
                 </w:r>
               </w:sdtContent>
             </w:sdt>
@@ -8714,7 +9022,7 @@
                     <w:sz w:val="15"/>
                     <w:szCs w:val="15"/>
                   </w:rPr>
-                  <w:t xml:space="preserve">type here</w:t>
+                  <w:t xml:space="preserve">not applicable (guard is a kinematic walker; no controller)</w:t>
                 </w:r>
               </w:sdtContent>
             </w:sdt>
@@ -8746,7 +9054,7 @@
                     <w:sz w:val="15"/>
                     <w:szCs w:val="15"/>
                   </w:rPr>
-                  <w:t xml:space="preserve">type here</w:t>
+                  <w:t xml:space="preserve">Cross-track: sectors interior 0.4972 ± 0.0712, exterior 0.2586 ± 0.0206; offset_ring interior 0.3579 ± 0.1646, exterior 0.9690 ± 0.2416.</w:t>
                 </w:r>
               </w:sdtContent>
             </w:sdt>
@@ -8778,7 +9086,7 @@
                     <w:sz w:val="15"/>
                     <w:szCs w:val="15"/>
                   </w:rPr>
-                  <w:t xml:space="preserve">type here</w:t>
+                  <w:t xml:space="preserve">m (cross-track deviation from the active route leg)</w:t>
                 </w:r>
               </w:sdtContent>
             </w:sdt>
@@ -8814,7 +9122,7 @@
                     <w:sz w:val="14"/>
                     <w:szCs w:val="14"/>
                   </w:rPr>
-                  <w:t xml:space="preserve">Select ▾</w:t>
+                  <w:t xml:space="preserve">Lower is better</w:t>
                 </w:r>
               </w:sdtContent>
             </w:sdt>
@@ -8872,7 +9180,7 @@
                     <w:sz w:val="15"/>
                     <w:szCs w:val="15"/>
                   </w:rPr>
-                  <w:t xml:space="preserve">type here</w:t>
+                  <w:t xml:space="preserve">30 UAV runs per cell</w:t>
                 </w:r>
               </w:sdtContent>
             </w:sdt>
@@ -8904,7 +9212,7 @@
                     <w:sz w:val="15"/>
                     <w:szCs w:val="15"/>
                   </w:rPr>
-                  <w:t xml:space="preserve">type here</w:t>
+                  <w:t xml:space="preserve">not applicable (no actuators on the guard model)</w:t>
                 </w:r>
               </w:sdtContent>
             </w:sdt>
@@ -8936,7 +9244,7 @@
                     <w:sz w:val="15"/>
                     <w:szCs w:val="15"/>
                   </w:rPr>
-                  <w:t xml:space="preserve">type here</w:t>
+                  <w:t xml:space="preserve">Thrust effort (sum F^2 dt): sectors interior 26742.7 ± 13.4, exterior 28080.5 ± 51.0; offset_ring interior 26731.6 ± 15.9, exterior 28242.2 ± 56.1.</w:t>
                 </w:r>
               </w:sdtContent>
             </w:sdt>
@@ -8968,7 +9276,7 @@
                     <w:sz w:val="15"/>
                     <w:szCs w:val="15"/>
                   </w:rPr>
-                  <w:t xml:space="preserve">type here</w:t>
+                  <w:t xml:space="preserve">N^2 s for thrust (sum over the rotors of F^2 dt; the airframe is driven by rotor forces); N^2 m^2 s for body torque (integral |tau|^2 dt)</w:t>
                 </w:r>
               </w:sdtContent>
             </w:sdt>
@@ -9004,7 +9312,7 @@
                     <w:sz w:val="14"/>
                     <w:szCs w:val="14"/>
                   </w:rPr>
-                  <w:t xml:space="preserve">Select ▾</w:t>
+                  <w:t xml:space="preserve">Lower is better</w:t>
                 </w:r>
               </w:sdtContent>
             </w:sdt>
@@ -9040,7 +9348,7 @@
                     <w:sz w:val="15"/>
                     <w:szCs w:val="15"/>
                   </w:rPr>
-                  <w:t xml:space="preserve">type here</w:t>
+                  <w:t xml:space="preserve">cycle_time_s: mean time per completed full ground lap (primary, window-independent)</w:t>
                 </w:r>
               </w:sdtContent>
             </w:sdt>
@@ -9071,7 +9379,7 @@
                     <w:sz w:val="15"/>
                     <w:szCs w:val="15"/>
                   </w:rPr>
-                  <w:t xml:space="preserve">type here</w:t>
+                  <w:t xml:space="preserve">30 per cell</w:t>
                 </w:r>
               </w:sdtContent>
             </w:sdt>
@@ -9102,7 +9410,7 @@
                     <w:sz w:val="15"/>
                     <w:szCs w:val="15"/>
                   </w:rPr>
-                  <w:t xml:space="preserve">type here</w:t>
+                  <w:t xml:space="preserve">guard_baseline cycle_time_s: interior 2460.46 ± 593.21 s; exterior 532.91 ± 141.64 s.</w:t>
                 </w:r>
               </w:sdtContent>
             </w:sdt>
@@ -9133,7 +9441,7 @@
                     <w:sz w:val="15"/>
                     <w:szCs w:val="15"/>
                   </w:rPr>
-                  <w:t xml:space="preserve">type here</w:t>
+                  <w:t xml:space="preserve">uav_sectors cycle_time_s: interior 57.41 ± 5.93 s; exterior 71.82 ± 8.22 s (offset_ring 37.97 ± 2.27 / 35.58 ± 6.36 s).</w:t>
                 </w:r>
               </w:sdtContent>
             </w:sdt>
@@ -9164,7 +9472,7 @@
                     <w:sz w:val="15"/>
                     <w:szCs w:val="15"/>
                   </w:rPr>
-                  <w:t xml:space="preserve">type here</w:t>
+                  <w:t xml:space="preserve">s</w:t>
                 </w:r>
               </w:sdtContent>
             </w:sdt>
@@ -9199,7 +9507,7 @@
                     <w:sz w:val="14"/>
                     <w:szCs w:val="14"/>
                   </w:rPr>
-                  <w:t xml:space="preserve">Select ▾</w:t>
+                  <w:t xml:space="preserve">Lower is better</w:t>
                 </w:r>
               </w:sdtContent>
             </w:sdt>
@@ -9282,7 +9590,7 @@
                     <w:sz w:val="15"/>
                     <w:szCs w:val="15"/>
                   </w:rPr>
-                  <w:t xml:space="preserve">Select ▾</w:t>
+                  <w:t xml:space="preserve">Welch's t-test</w:t>
                 </w:r>
               </w:sdtContent>
             </w:sdt>
@@ -9341,7 +9649,7 @@
                     <w:sz w:val="15"/>
                     <w:szCs w:val="15"/>
                   </w:rPr>
-                  <w:t xml:space="preserve">type here</w:t>
+                  <w:t xml:space="preserve">Welch, guard vs uav_sectors: interior t = 22.1870, df = 29.006, p = 9.62908e-20; exterior t = 17.8000, df = 29.196, p = 3.22330e-17.</w:t>
                 </w:r>
               </w:sdtContent>
             </w:sdt>
@@ -9400,7 +9708,7 @@
                     <w:sz w:val="15"/>
                     <w:szCs w:val="15"/>
                   </w:rPr>
-                  <w:t xml:space="preserve">type here</w:t>
+                  <w:t xml:space="preserve">guard vs uav_sectors: interior d = 5.7286, exterior d = 4.5959 (pooled SD). Secondary: interior 4.3299, exterior 4.9292.</w:t>
                 </w:r>
               </w:sdtContent>
             </w:sdt>
@@ -9457,7 +9765,7 @@
                     <w:sz w:val="15"/>
                     <w:szCs w:val="15"/>
                   </w:rPr>
-                  <w:t xml:space="preserve">type here</w:t>
+                  <w:t xml:space="preserve">guard - uav_sectors: interior [2181.5396, 2624.5707] s; exterior [408.1221, 514.0494] s.</w:t>
                 </w:r>
               </w:sdtContent>
             </w:sdt>
@@ -9484,7 +9792,7 @@
       </w:tblGrid>
       <w:tr>
         <w:trPr>
-          <w:trHeight w:val="2608" w:hRule="exact"/>
+          <w:trHeight w:val="2608" w:hRule="atLeast"/>
           <w:cantSplit/>
         </w:trPr>
         <w:tc>
@@ -9497,15 +9805,91 @@
               <w:spacing w:after="0"/>
               <w:jc w:val="center"/>
             </w:pPr>
-            <w:r/>
+            <w:r>
+              <w:drawing>
+                <wp:inline xmlns:a="http://schemas.openxmlformats.org/drawingml/2006/main" xmlns:pic="http://schemas.openxmlformats.org/drawingml/2006/picture">
+                  <wp:extent cx="2951999" cy="1810559"/>
+                  <wp:docPr id="3" name="Picture 3"/>
+                  <wp:cNvGraphicFramePr>
+                    <a:graphicFrameLocks noChangeAspect="1"/>
+                  </wp:cNvGraphicFramePr>
+                  <a:graphic>
+                    <a:graphicData uri="http://schemas.openxmlformats.org/drawingml/2006/picture">
+                      <pic:pic>
+                        <pic:nvPicPr>
+                          <pic:cNvPr id="0" name="trajectory_interior.png"/>
+                          <pic:cNvPicPr/>
+                        </pic:nvPicPr>
+                        <pic:blipFill>
+                          <a:blip r:embed="rId12"/>
+                          <a:stretch>
+                            <a:fillRect/>
+                          </a:stretch>
+                        </pic:blipFill>
+                        <pic:spPr>
+                          <a:xfrm>
+                            <a:off x="0" y="0"/>
+                            <a:ext cx="2951999" cy="1810559"/>
+                          </a:xfrm>
+                          <a:prstGeom prst="rect"/>
+                        </pic:spPr>
+                      </pic:pic>
+                    </a:graphicData>
+                  </a:graphic>
+                </wp:inline>
+              </w:drawing>
+            </w:r>
+          </w:p>
+          <w:p>
             <w:r>
               <w:rPr>
-                <w:b w:val="0"/>
-                <w:i/>
-                <w:color w:val="595959"/>
-                <w:sz w:val="15"/>
+                <w:sz w:val="13"/>
               </w:rPr>
-              <w:t>[ Trajectory plot: reference vs actual, one representative run ]</w:t>
+              <w:t>Interior: one representative run per condition (rule stated on the figure), from analytics/runs telemetry.</w:t>
+            </w:r>
+          </w:p>
+          <w:p>
+            <w:r>
+              <w:drawing>
+                <wp:inline xmlns:a="http://schemas.openxmlformats.org/drawingml/2006/main" xmlns:pic="http://schemas.openxmlformats.org/drawingml/2006/picture">
+                  <wp:extent cx="2951999" cy="1810559"/>
+                  <wp:docPr id="4" name="Picture 4"/>
+                  <wp:cNvGraphicFramePr>
+                    <a:graphicFrameLocks noChangeAspect="1"/>
+                  </wp:cNvGraphicFramePr>
+                  <a:graphic>
+                    <a:graphicData uri="http://schemas.openxmlformats.org/drawingml/2006/picture">
+                      <pic:pic>
+                        <pic:nvPicPr>
+                          <pic:cNvPr id="0" name="trajectory_exterior.png"/>
+                          <pic:cNvPicPr/>
+                        </pic:nvPicPr>
+                        <pic:blipFill>
+                          <a:blip r:embed="rId13"/>
+                          <a:stretch>
+                            <a:fillRect/>
+                          </a:stretch>
+                        </pic:blipFill>
+                        <pic:spPr>
+                          <a:xfrm>
+                            <a:off x="0" y="0"/>
+                            <a:ext cx="2951999" cy="1810559"/>
+                          </a:xfrm>
+                          <a:prstGeom prst="rect"/>
+                        </pic:spPr>
+                      </pic:pic>
+                    </a:graphicData>
+                  </a:graphic>
+                </wp:inline>
+              </w:drawing>
+            </w:r>
+          </w:p>
+          <w:p>
+            <w:r>
+              <w:rPr>
+                <w:sz w:val="13"/>
+              </w:rPr>
+              <w:t>Exterior: same rule.</w:t>
             </w:r>
           </w:p>
         </w:tc>
@@ -9519,15 +9903,91 @@
               <w:spacing w:after="0"/>
               <w:jc w:val="center"/>
             </w:pPr>
-            <w:r/>
+            <w:r>
+              <w:drawing>
+                <wp:inline xmlns:a="http://schemas.openxmlformats.org/drawingml/2006/main" xmlns:pic="http://schemas.openxmlformats.org/drawingml/2006/picture">
+                  <wp:extent cx="2951999" cy="1317046"/>
+                  <wp:docPr id="5" name="Picture 5"/>
+                  <wp:cNvGraphicFramePr>
+                    <a:graphicFrameLocks noChangeAspect="1"/>
+                  </wp:cNvGraphicFramePr>
+                  <a:graphic>
+                    <a:graphicData uri="http://schemas.openxmlformats.org/drawingml/2006/picture">
+                      <pic:pic>
+                        <pic:nvPicPr>
+                          <pic:cNvPr id="0" name="revisit_boxplot_interior.png"/>
+                          <pic:cNvPicPr/>
+                        </pic:nvPicPr>
+                        <pic:blipFill>
+                          <a:blip r:embed="rId14"/>
+                          <a:stretch>
+                            <a:fillRect/>
+                          </a:stretch>
+                        </pic:blipFill>
+                        <pic:spPr>
+                          <a:xfrm>
+                            <a:off x="0" y="0"/>
+                            <a:ext cx="2951999" cy="1317046"/>
+                          </a:xfrm>
+                          <a:prstGeom prst="rect"/>
+                        </pic:spPr>
+                      </pic:pic>
+                    </a:graphicData>
+                  </a:graphic>
+                </wp:inline>
+              </w:drawing>
+            </w:r>
+          </w:p>
+          <w:p>
             <w:r>
               <w:rPr>
-                <w:b w:val="0"/>
-                <w:i/>
-                <w:color w:val="595959"/>
-                <w:sz w:val="15"/>
+                <w:sz w:val="13"/>
               </w:rPr>
-              <w:t>[ Box-plot of the primary metric: baseline vs proposed, N runs each ]</w:t>
+              <w:t>Interior: cycle time per lap (primary) and equal-window worst revisit, N = 30 per condition.</w:t>
+            </w:r>
+          </w:p>
+          <w:p>
+            <w:r>
+              <w:drawing>
+                <wp:inline xmlns:a="http://schemas.openxmlformats.org/drawingml/2006/main" xmlns:pic="http://schemas.openxmlformats.org/drawingml/2006/picture">
+                  <wp:extent cx="2951999" cy="1317046"/>
+                  <wp:docPr id="6" name="Picture 6"/>
+                  <wp:cNvGraphicFramePr>
+                    <a:graphicFrameLocks noChangeAspect="1"/>
+                  </wp:cNvGraphicFramePr>
+                  <a:graphic>
+                    <a:graphicData uri="http://schemas.openxmlformats.org/drawingml/2006/picture">
+                      <pic:pic>
+                        <pic:nvPicPr>
+                          <pic:cNvPr id="0" name="revisit_boxplot_exterior.png"/>
+                          <pic:cNvPicPr/>
+                        </pic:nvPicPr>
+                        <pic:blipFill>
+                          <a:blip r:embed="rId15"/>
+                          <a:stretch>
+                            <a:fillRect/>
+                          </a:stretch>
+                        </pic:blipFill>
+                        <pic:spPr>
+                          <a:xfrm>
+                            <a:off x="0" y="0"/>
+                            <a:ext cx="2951999" cy="1317046"/>
+                          </a:xfrm>
+                          <a:prstGeom prst="rect"/>
+                        </pic:spPr>
+                      </pic:pic>
+                    </a:graphicData>
+                  </a:graphic>
+                </wp:inline>
+              </w:drawing>
+            </w:r>
+          </w:p>
+          <w:p>
+            <w:r>
+              <w:rPr>
+                <w:sz w:val="13"/>
+              </w:rPr>
+              <w:t>Exterior: same two metrics, N = 30 per condition.</w:t>
             </w:r>
           </w:p>
         </w:tc>
@@ -9621,7 +10081,7 @@
                     <w:sz w:val="15"/>
                     <w:szCs w:val="15"/>
                   </w:rPr>
-                  <w:t xml:space="preserve">Select ▾</w:t>
+                  <w:t xml:space="preserve">Yes</w:t>
                 </w:r>
               </w:sdtContent>
             </w:sdt>
@@ -9684,7 +10144,7 @@
                     <w:sz w:val="15"/>
                     <w:szCs w:val="15"/>
                   </w:rPr>
-                  <w:t xml:space="preserve">Select ▾</w:t>
+                  <w:t xml:space="preserve">Yes</w:t>
                 </w:r>
               </w:sdtContent>
             </w:sdt>
@@ -9747,7 +10207,7 @@
                     <w:sz w:val="15"/>
                     <w:szCs w:val="15"/>
                   </w:rPr>
-                  <w:t xml:space="preserve">Select ▾</w:t>
+                  <w:t xml:space="preserve">Yes</w:t>
                 </w:r>
               </w:sdtContent>
             </w:sdt>
@@ -9808,7 +10268,7 @@
                     <w:sz w:val="15"/>
                     <w:szCs w:val="15"/>
                   </w:rPr>
-                  <w:t xml:space="preserve">Select ▾</w:t>
+                  <w:t xml:space="preserve">Yes</w:t>
                 </w:r>
               </w:sdtContent>
             </w:sdt>
@@ -9912,7 +10372,7 @@
                     <w:sz w:val="15"/>
                     <w:szCs w:val="15"/>
                   </w:rPr>
-                  <w:t xml:space="preserve">type here</w:t>
+                  <w:t xml:space="preserve">https://lnkd.in/p/ddww8s-J</w:t>
                 </w:r>
               </w:sdtContent>
             </w:sdt>
@@ -9971,7 +10431,7 @@
                     <w:sz w:val="15"/>
                     <w:szCs w:val="15"/>
                   </w:rPr>
-                  <w:t xml:space="preserve">type here</w:t>
+                  <w:t xml:space="preserve">3:17</w:t>
                 </w:r>
               </w:sdtContent>
             </w:sdt>
@@ -10034,7 +10494,7 @@
                     <w:sz w:val="15"/>
                     <w:szCs w:val="15"/>
                   </w:rPr>
-                  <w:t xml:space="preserve">Select ▾</w:t>
+                  <w:t xml:space="preserve">Yes</w:t>
                 </w:r>
               </w:sdtContent>
             </w:sdt>
@@ -10097,7 +10557,7 @@
                     <w:sz w:val="15"/>
                     <w:szCs w:val="15"/>
                   </w:rPr>
-                  <w:t xml:space="preserve">Select ▾</w:t>
+                  <w:t xml:space="preserve">Yes</w:t>
                 </w:r>
               </w:sdtContent>
             </w:sdt>
@@ -10158,7 +10618,7 @@
                     <w:sz w:val="15"/>
                     <w:szCs w:val="15"/>
                   </w:rPr>
-                  <w:t xml:space="preserve">Select ▾</w:t>
+                  <w:t xml:space="preserve">Yes</w:t>
                 </w:r>
               </w:sdtContent>
             </w:sdt>
@@ -10438,7 +10898,7 @@
                     <w:sz w:val="14"/>
                     <w:szCs w:val="14"/>
                   </w:rPr>
-                  <w:t xml:space="preserve">Select ▾</w:t>
+                  <w:t xml:space="preserve">Claude</w:t>
                 </w:r>
               </w:sdtContent>
             </w:sdt>
@@ -10470,7 +10930,7 @@
                     <w:sz w:val="14"/>
                     <w:szCs w:val="14"/>
                   </w:rPr>
-                  <w:t xml:space="preserve">type here</w:t>
+                  <w:t xml:space="preserve">Group AI use: code, tests and documents were first drafted by Claude (Anthropic); we ran, tested and corrected them. Case: the region-ownership gate (src/check_region_ownership.py) matched nothing.</w:t>
                 </w:r>
               </w:sdtContent>
             </w:sdt>
@@ -10511,7 +10971,7 @@
                     <w:sz w:val="14"/>
                     <w:szCs w:val="14"/>
                   </w:rPr>
-                  <w:t xml:space="preserve">Select ▾</w:t>
+                  <w:t xml:space="preserve">Ran / tested the code or simulation</w:t>
                 </w:r>
               </w:sdtContent>
             </w:sdt>
@@ -10543,7 +11003,7 @@
                     <w:sz w:val="14"/>
                     <w:szCs w:val="14"/>
                   </w:rPr>
-                  <w:t xml:space="preserve">type here</w:t>
+                  <w:t xml:space="preserve">git reports repository-root paths while the ownership globs assumed group-folder paths, so no region ever matched and every change was attributed to E043. Fixed in commit 40a811f.</w:t>
                 </w:r>
               </w:sdtContent>
             </w:sdt>
@@ -10585,7 +11045,7 @@
                     <w:sz w:val="14"/>
                     <w:szCs w:val="14"/>
                   </w:rPr>
-                  <w:t xml:space="preserve">Select ▾</w:t>
+                  <w:t xml:space="preserve">Wrong code / MuJoCo API</w:t>
                 </w:r>
               </w:sdtContent>
             </w:sdt>
@@ -10622,7 +11082,7 @@
                     <w:sz w:val="14"/>
                     <w:szCs w:val="14"/>
                   </w:rPr>
-                  <w:t xml:space="preserve">Select ▾</w:t>
+                  <w:t xml:space="preserve">Corrected</w:t>
                 </w:r>
               </w:sdtContent>
             </w:sdt>
@@ -10690,7 +11150,7 @@
                     <w:sz w:val="14"/>
                     <w:szCs w:val="14"/>
                   </w:rPr>
-                  <w:t xml:space="preserve">Select ▾</w:t>
+                  <w:t xml:space="preserve">Claude</w:t>
                 </w:r>
               </w:sdtContent>
             </w:sdt>
@@ -10722,7 +11182,7 @@
                     <w:sz w:val="14"/>
                     <w:szCs w:val="14"/>
                   </w:rPr>
-                  <w:t xml:space="preserve">type here</w:t>
+                  <w:t xml:space="preserve">The compute_apf_separation docstring claimed APF alone would "guarantee minimum separation distance d &gt;= 2.5 m".</w:t>
                 </w:r>
               </w:sdtContent>
             </w:sdt>
@@ -10763,7 +11223,7 @@
                     <w:sz w:val="14"/>
                     <w:szCs w:val="14"/>
                   </w:rPr>
-                  <w:t xml:space="preserve">Select ▾</w:t>
+                  <w:t xml:space="preserve">Ran / tested the code or simulation</w:t>
                 </w:r>
               </w:sdtContent>
             </w:sdt>
@@ -10795,7 +11255,7 @@
                     <w:sz w:val="14"/>
                     <w:szCs w:val="14"/>
                   </w:rPr>
-                  <w:t xml:space="preserve">type here</w:t>
+                  <w:t xml:space="preserve">False: head-on at 6 m/s each, APF alone came to 0.43 m (contact); the layered version held 7.12 m. Proof: tests/test_e043_separation.py.</w:t>
                 </w:r>
               </w:sdtContent>
             </w:sdt>
@@ -10837,7 +11297,7 @@
                     <w:sz w:val="14"/>
                     <w:szCs w:val="14"/>
                   </w:rPr>
-                  <w:t xml:space="preserve">Select ▾</w:t>
+                  <w:t xml:space="preserve">Wrong physics / equation</w:t>
                 </w:r>
               </w:sdtContent>
             </w:sdt>
@@ -10874,7 +11334,7 @@
                     <w:sz w:val="14"/>
                     <w:szCs w:val="14"/>
                   </w:rPr>
-                  <w:t xml:space="preserve">Select ▾</w:t>
+                  <w:t xml:space="preserve">Corrected</w:t>
                 </w:r>
               </w:sdtContent>
             </w:sdt>
@@ -10940,7 +11400,7 @@
                     <w:sz w:val="14"/>
                     <w:szCs w:val="14"/>
                   </w:rPr>
-                  <w:t xml:space="preserve">Select ▾</w:t>
+                  <w:t xml:space="preserve">Claude</w:t>
                 </w:r>
               </w:sdtContent>
             </w:sdt>
@@ -10971,7 +11431,7 @@
                     <w:sz w:val="14"/>
                     <w:szCs w:val="14"/>
                   </w:rPr>
-                  <w:t xml:space="preserve">type here</w:t>
+                  <w:t xml:space="preserve">The contact-parameter note said solref 0.004 s equals 2 x the 0.002 s timestep, so the leg contact is used as written, and that at the earlier 0.004 s timestep MuJoCo "silently clamped it".</w:t>
                 </w:r>
               </w:sdtContent>
             </w:sdt>
@@ -11011,7 +11471,7 @@
                     <w:sz w:val="14"/>
                     <w:szCs w:val="14"/>
                   </w:rPr>
-                  <w:t xml:space="preserve">Select ▾</w:t>
+                  <w:t xml:space="preserve">Ran / tested the code or simulation</w:t>
                 </w:r>
               </w:sdtContent>
             </w:sdt>
@@ -11042,7 +11502,7 @@
                     <w:sz w:val="14"/>
                     <w:szCs w:val="14"/>
                   </w:rPr>
-                  <w:t xml:space="preserve">type here</w:t>
+                  <w:t xml:space="preserve">Wrong number: MuJoCo mixes the leg's 0.004 with the surface's 0.02, giving 0.012 s, which is above 2 x timestep at both 0.002 s and 0.004 s, so no clamp acted. Proof: viva_contact_solref_mix.txt.</w:t>
                 </w:r>
               </w:sdtContent>
             </w:sdt>
@@ -11083,7 +11543,7 @@
                     <w:sz w:val="14"/>
                     <w:szCs w:val="14"/>
                   </w:rPr>
-                  <w:t xml:space="preserve">Select ▾</w:t>
+                  <w:t xml:space="preserve">Wrong code / MuJoCo API</w:t>
                 </w:r>
               </w:sdtContent>
             </w:sdt>
@@ -11119,7 +11579,7 @@
                     <w:sz w:val="14"/>
                     <w:szCs w:val="14"/>
                   </w:rPr>
-                  <w:t xml:space="preserve">Select ▾</w:t>
+                  <w:t xml:space="preserve">Corrected</w:t>
                 </w:r>
               </w:sdtContent>
             </w:sdt>
@@ -11403,7 +11863,7 @@
                     <w:sz w:val="14"/>
                     <w:szCs w:val="14"/>
                   </w:rPr>
-                  <w:t xml:space="preserve">Select ▾</w:t>
+                  <w:t xml:space="preserve">2</w:t>
                 </w:r>
               </w:sdtContent>
             </w:sdt>
@@ -11440,7 +11900,7 @@
                     <w:sz w:val="14"/>
                     <w:szCs w:val="14"/>
                   </w:rPr>
-                  <w:t xml:space="preserve">Select ▾</w:t>
+                  <w:t xml:space="preserve">2</w:t>
                 </w:r>
               </w:sdtContent>
             </w:sdt>
@@ -11477,7 +11937,7 @@
                     <w:sz w:val="14"/>
                     <w:szCs w:val="14"/>
                   </w:rPr>
-                  <w:t xml:space="preserve">Select ▾</w:t>
+                  <w:t xml:space="preserve">2</w:t>
                 </w:r>
               </w:sdtContent>
             </w:sdt>
@@ -11514,7 +11974,7 @@
                     <w:sz w:val="14"/>
                     <w:szCs w:val="14"/>
                   </w:rPr>
-                  <w:t xml:space="preserve">Select ▾</w:t>
+                  <w:t xml:space="preserve">2</w:t>
                 </w:r>
               </w:sdtContent>
             </w:sdt>
@@ -11551,7 +12011,7 @@
                     <w:sz w:val="14"/>
                     <w:szCs w:val="14"/>
                   </w:rPr>
-                  <w:t xml:space="preserve">Select ▾</w:t>
+                  <w:t xml:space="preserve">2</w:t>
                 </w:r>
               </w:sdtContent>
             </w:sdt>
@@ -11583,7 +12043,7 @@
                     <w:sz w:val="14"/>
                     <w:szCs w:val="14"/>
                   </w:rPr>
-                  <w:t xml:space="preserve">type here</w:t>
+                  <w:t xml:space="preserve">0:05</w:t>
                 </w:r>
               </w:sdtContent>
             </w:sdt>
@@ -11615,7 +12075,7 @@
                     <w:sz w:val="14"/>
                     <w:szCs w:val="14"/>
                   </w:rPr>
-                  <w:t xml:space="preserve">type here</w:t>
+                  <w:t xml:space="preserve">How does the crawler keep traction on a wet, tilted panel, and how much slip did you measure in the simulation?</w:t>
                 </w:r>
               </w:sdtContent>
             </w:sdt>
@@ -11677,7 +12137,7 @@
                     <w:sz w:val="14"/>
                     <w:szCs w:val="14"/>
                   </w:rPr>
-                  <w:t xml:space="preserve">Select ▾</w:t>
+                  <w:t xml:space="preserve">2</w:t>
                 </w:r>
               </w:sdtContent>
             </w:sdt>
@@ -11713,7 +12173,7 @@
                     <w:sz w:val="14"/>
                     <w:szCs w:val="14"/>
                   </w:rPr>
-                  <w:t xml:space="preserve">Select ▾</w:t>
+                  <w:t xml:space="preserve">2</w:t>
                 </w:r>
               </w:sdtContent>
             </w:sdt>
@@ -11749,7 +12209,7 @@
                     <w:sz w:val="14"/>
                     <w:szCs w:val="14"/>
                   </w:rPr>
-                  <w:t xml:space="preserve">Select ▾</w:t>
+                  <w:t xml:space="preserve">2</w:t>
                 </w:r>
               </w:sdtContent>
             </w:sdt>
@@ -11785,7 +12245,7 @@
                     <w:sz w:val="14"/>
                     <w:szCs w:val="14"/>
                   </w:rPr>
-                  <w:t xml:space="preserve">Select ▾</w:t>
+                  <w:t xml:space="preserve">2</w:t>
                 </w:r>
               </w:sdtContent>
             </w:sdt>
@@ -11821,7 +12281,7 @@
                     <w:sz w:val="14"/>
                     <w:szCs w:val="14"/>
                   </w:rPr>
-                  <w:t xml:space="preserve">Select ▾</w:t>
+                  <w:t xml:space="preserve">2</w:t>
                 </w:r>
               </w:sdtContent>
             </w:sdt>
@@ -11852,7 +12312,7 @@
                     <w:sz w:val="14"/>
                     <w:szCs w:val="14"/>
                   </w:rPr>
-                  <w:t xml:space="preserve">type here</w:t>
+                  <w:t xml:space="preserve">0:30</w:t>
                 </w:r>
               </w:sdtContent>
             </w:sdt>
@@ -11883,7 +12343,7 @@
                     <w:sz w:val="14"/>
                     <w:szCs w:val="14"/>
                   </w:rPr>
-                  <w:t xml:space="preserve">type here</w:t>
+                  <w:t xml:space="preserve">What false-positive rate does your defect detector show on clean panels, and how did you measure it?</w:t>
                 </w:r>
               </w:sdtContent>
             </w:sdt>
@@ -12189,7 +12649,7 @@
                     <w:sz w:val="14"/>
                     <w:szCs w:val="14"/>
                   </w:rPr>
-                  <w:t xml:space="preserve">type here</w:t>
+                  <w:t xml:space="preserve">35</w:t>
                 </w:r>
               </w:sdtContent>
             </w:sdt>
@@ -12228,7 +12688,7 @@
                     <w:sz w:val="14"/>
                     <w:szCs w:val="14"/>
                   </w:rPr>
-                  <w:t xml:space="preserve">Select ▾</w:t>
+                  <w:t xml:space="preserve">5</w:t>
                 </w:r>
               </w:sdtContent>
             </w:sdt>
@@ -12264,7 +12724,7 @@
                     <w:sz w:val="14"/>
                     <w:szCs w:val="14"/>
                   </w:rPr>
-                  <w:t xml:space="preserve">Select ▾</w:t>
+                  <w:t xml:space="preserve">Yes</w:t>
                 </w:r>
               </w:sdtContent>
             </w:sdt>
@@ -12296,7 +12756,7 @@
                     <w:sz w:val="14"/>
                     <w:szCs w:val="14"/>
                   </w:rPr>
-                  <w:t xml:space="preserve">type here</w:t>
+                  <w:t xml:space="preserve">aerial_patrol_swarm.py (flight, separation, FSM), foot_patrol_baseline.py, run_benchmark.py, scene generators, test_e043_*</w:t>
                 </w:r>
               </w:sdtContent>
             </w:sdt>
@@ -12328,7 +12788,7 @@
                     <w:sz w:val="14"/>
                     <w:szCs w:val="14"/>
                   </w:rPr>
-                  <w:t xml:space="preserve">type here</w:t>
+                  <w:t xml:space="preserve">116 of 116 (the merged tree was pushed from E043's account)</w:t>
                 </w:r>
               </w:sdtContent>
             </w:sdt>
@@ -12366,7 +12826,7 @@
                     <w:sz w:val="14"/>
                     <w:szCs w:val="14"/>
                   </w:rPr>
-                  <w:t xml:space="preserve">Select ▾</w:t>
+                  <w:t xml:space="preserve">76–100 %</w:t>
                 </w:r>
               </w:sdtContent>
             </w:sdt>
@@ -12404,7 +12864,7 @@
                     <w:sz w:val="14"/>
                     <w:szCs w:val="14"/>
                   </w:rPr>
-                  <w:t xml:space="preserve">Select ▾</w:t>
+                  <w:t xml:space="preserve">3–5</w:t>
                 </w:r>
               </w:sdtContent>
             </w:sdt>
@@ -12463,7 +12923,7 @@
                     <w:sz w:val="14"/>
                     <w:szCs w:val="14"/>
                   </w:rPr>
-                  <w:t xml:space="preserve">type here</w:t>
+                  <w:t xml:space="preserve">35</w:t>
                 </w:r>
               </w:sdtContent>
             </w:sdt>
@@ -12502,7 +12962,7 @@
                     <w:sz w:val="14"/>
                     <w:szCs w:val="14"/>
                   </w:rPr>
-                  <w:t xml:space="preserve">Select ▾</w:t>
+                  <w:t xml:space="preserve">5</w:t>
                 </w:r>
               </w:sdtContent>
             </w:sdt>
@@ -12538,7 +12998,7 @@
                     <w:sz w:val="14"/>
                     <w:szCs w:val="14"/>
                   </w:rPr>
-                  <w:t xml:space="preserve">Select ▾</w:t>
+                  <w:t xml:space="preserve">Yes</w:t>
                 </w:r>
               </w:sdtContent>
             </w:sdt>
@@ -12570,7 +13030,7 @@
                     <w:sz w:val="14"/>
                     <w:szCs w:val="14"/>
                   </w:rPr>
-                  <w:t xml:space="preserve">type here</w:t>
+                  <w:t xml:space="preserve">aerial_patrol_swarm.py E051 region, vision_illumination_benchmark.py, test_e051_vision.py</w:t>
                 </w:r>
               </w:sdtContent>
             </w:sdt>
@@ -12602,7 +13062,7 @@
                     <w:sz w:val="14"/>
                     <w:szCs w:val="14"/>
                   </w:rPr>
-                  <w:t xml:space="preserve">type here</w:t>
+                  <w:t xml:space="preserve">0 own commits; I worked on my code area (Section 2.2), merged through E043's account</w:t>
                 </w:r>
               </w:sdtContent>
             </w:sdt>
@@ -12640,7 +13100,7 @@
                     <w:sz w:val="14"/>
                     <w:szCs w:val="14"/>
                   </w:rPr>
-                  <w:t xml:space="preserve">Select ▾</w:t>
+                  <w:t xml:space="preserve">76–100 %</w:t>
                 </w:r>
               </w:sdtContent>
             </w:sdt>
@@ -12678,7 +13138,7 @@
                     <w:sz w:val="14"/>
                     <w:szCs w:val="14"/>
                   </w:rPr>
-                  <w:t xml:space="preserve">Select ▾</w:t>
+                  <w:t xml:space="preserve">1–2</w:t>
                 </w:r>
               </w:sdtContent>
             </w:sdt>
@@ -12737,7 +13197,7 @@
                     <w:sz w:val="14"/>
                     <w:szCs w:val="14"/>
                   </w:rPr>
-                  <w:t xml:space="preserve">type here</w:t>
+                  <w:t xml:space="preserve">35</w:t>
                 </w:r>
               </w:sdtContent>
             </w:sdt>
@@ -12776,7 +13236,7 @@
                     <w:sz w:val="14"/>
                     <w:szCs w:val="14"/>
                   </w:rPr>
-                  <w:t xml:space="preserve">Select ▾</w:t>
+                  <w:t xml:space="preserve">5</w:t>
                 </w:r>
               </w:sdtContent>
             </w:sdt>
@@ -12812,7 +13272,7 @@
                     <w:sz w:val="14"/>
                     <w:szCs w:val="14"/>
                   </w:rPr>
-                  <w:t xml:space="preserve">Select ▾</w:t>
+                  <w:t xml:space="preserve">Yes</w:t>
                 </w:r>
               </w:sdtContent>
             </w:sdt>
@@ -12844,7 +13304,7 @@
                     <w:sz w:val="14"/>
                     <w:szCs w:val="14"/>
                   </w:rPr>
-                  <w:t xml:space="preserve">type here</w:t>
+                  <w:t xml:space="preserve">aerial_patrol_swarm.py E075 region, statistical_validation.py, geofence_noise_demo.py, test_e075_geofence_stats.py</w:t>
                 </w:r>
               </w:sdtContent>
             </w:sdt>
@@ -12876,7 +13336,7 @@
                     <w:sz w:val="14"/>
                     <w:szCs w:val="14"/>
                   </w:rPr>
-                  <w:t xml:space="preserve">type here</w:t>
+                  <w:t xml:space="preserve">0 own commits; I worked on my code area (Section 2.2), merged through E043's account</w:t>
                 </w:r>
               </w:sdtContent>
             </w:sdt>
@@ -12914,7 +13374,7 @@
                     <w:sz w:val="14"/>
                     <w:szCs w:val="14"/>
                   </w:rPr>
-                  <w:t xml:space="preserve">Select ▾</w:t>
+                  <w:t xml:space="preserve">76–100 %</w:t>
                 </w:r>
               </w:sdtContent>
             </w:sdt>
@@ -12952,7 +13412,7 @@
                     <w:sz w:val="14"/>
                     <w:szCs w:val="14"/>
                   </w:rPr>
-                  <w:t xml:space="preserve">Select ▾</w:t>
+                  <w:t xml:space="preserve">1–2</w:t>
                 </w:r>
               </w:sdtContent>
             </w:sdt>
@@ -13009,7 +13469,7 @@
                     <w:sz w:val="14"/>
                     <w:szCs w:val="14"/>
                   </w:rPr>
-                  <w:t xml:space="preserve">type here</w:t>
+                  <w:t xml:space="preserve">35</w:t>
                 </w:r>
               </w:sdtContent>
             </w:sdt>
@@ -13047,7 +13507,7 @@
                     <w:sz w:val="14"/>
                     <w:szCs w:val="14"/>
                   </w:rPr>
-                  <w:t xml:space="preserve">Select ▾</w:t>
+                  <w:t xml:space="preserve">5</w:t>
                 </w:r>
               </w:sdtContent>
             </w:sdt>
@@ -13082,7 +13542,7 @@
                     <w:sz w:val="14"/>
                     <w:szCs w:val="14"/>
                   </w:rPr>
-                  <w:t xml:space="preserve">Select ▾</w:t>
+                  <w:t xml:space="preserve">Yes</w:t>
                 </w:r>
               </w:sdtContent>
             </w:sdt>
@@ -13113,7 +13573,7 @@
                     <w:sz w:val="14"/>
                     <w:szCs w:val="14"/>
                   </w:rPr>
-                  <w:t xml:space="preserve">type here</w:t>
+                  <w:t xml:space="preserve">campus_security_economics.py, campus_security_fmea.py, test_e077_economics.py</w:t>
                 </w:r>
               </w:sdtContent>
             </w:sdt>
@@ -13144,7 +13604,7 @@
                     <w:sz w:val="14"/>
                     <w:szCs w:val="14"/>
                   </w:rPr>
-                  <w:t xml:space="preserve">type here</w:t>
+                  <w:t xml:space="preserve">18 own commits (e077 branches, PRs #1 to #5)</w:t>
                 </w:r>
               </w:sdtContent>
             </w:sdt>
@@ -13181,7 +13641,7 @@
                     <w:sz w:val="14"/>
                     <w:szCs w:val="14"/>
                   </w:rPr>
-                  <w:t xml:space="preserve">Select ▾</w:t>
+                  <w:t xml:space="preserve">76–100 %</w:t>
                 </w:r>
               </w:sdtContent>
             </w:sdt>
@@ -13218,7 +13678,7 @@
                     <w:sz w:val="14"/>
                     <w:szCs w:val="14"/>
                   </w:rPr>
-                  <w:t xml:space="preserve">Select ▾</w:t>
+                  <w:t xml:space="preserve">1–2</w:t>
                 </w:r>
               </w:sdtContent>
             </w:sdt>
@@ -13394,7 +13854,7 @@
                     <w:sz w:val="14"/>
                     <w:szCs w:val="14"/>
                   </w:rPr>
-                  <w:t xml:space="preserve">Select ▾</w:t>
+                  <w:t xml:space="preserve">No</w:t>
                 </w:r>
               </w:sdtContent>
             </w:sdt>
@@ -13426,7 +13886,7 @@
                     <w:sz w:val="14"/>
                     <w:szCs w:val="14"/>
                   </w:rPr>
-                  <w:t xml:space="preserve">type here</w:t>
+                  <w:t xml:space="preserve">A result only counts once a test can break it: the head-on test showed APF alone fails, which led to the layered separation.</w:t>
                 </w:r>
               </w:sdtContent>
             </w:sdt>
@@ -13458,7 +13918,7 @@
                     <w:sz w:val="14"/>
                     <w:szCs w:val="14"/>
                   </w:rPr>
-                  <w:t xml:space="preserve">type here</w:t>
+                  <w:t xml:space="preserve">Set up per-member commits from day one, so each member's work shows under their own account.</w:t>
                 </w:r>
               </w:sdtContent>
             </w:sdt>
@@ -13521,7 +13981,7 @@
                     <w:sz w:val="14"/>
                     <w:szCs w:val="14"/>
                   </w:rPr>
-                  <w:t xml:space="preserve">Select ▾</w:t>
+                  <w:t xml:space="preserve">No</w:t>
                 </w:r>
               </w:sdtContent>
             </w:sdt>
@@ -13553,7 +14013,7 @@
                     <w:sz w:val="14"/>
                     <w:szCs w:val="14"/>
                   </w:rPr>
-                  <w:t xml:space="preserve">type here</w:t>
+                  <w:t xml:space="preserve">Labelled test frames catch detector errors a demo hides: the terracotta carpet false positive, fixed from 86 to 100 percent.</w:t>
                 </w:r>
               </w:sdtContent>
             </w:sdt>
@@ -13585,7 +14045,7 @@
                     <w:sz w:val="14"/>
                     <w:szCs w:val="14"/>
                   </w:rPr>
-                  <w:t xml:space="preserve">type here</w:t>
+                  <w:t xml:space="preserve">Test the detector in dim indoor light early; indoor detection stayed at about 1 in 3.</w:t>
                 </w:r>
               </w:sdtContent>
             </w:sdt>
@@ -13648,7 +14108,7 @@
                     <w:sz w:val="14"/>
                     <w:szCs w:val="14"/>
                   </w:rPr>
-                  <w:t xml:space="preserve">Select ▾</w:t>
+                  <w:t xml:space="preserve">No</w:t>
                 </w:r>
               </w:sdtContent>
             </w:sdt>
@@ -13680,7 +14140,7 @@
                     <w:sz w:val="14"/>
                     <w:szCs w:val="14"/>
                   </w:rPr>
-                  <w:t xml:space="preserve">type here</w:t>
+                  <w:t xml:space="preserve">The right test matters: Welch's t test, because guard and drone times vary so differently.</w:t>
                 </w:r>
               </w:sdtContent>
             </w:sdt>
@@ -13712,7 +14172,7 @@
                     <w:sz w:val="14"/>
                     <w:szCs w:val="14"/>
                   </w:rPr>
-                  <w:t xml:space="preserve">type here</w:t>
+                  <w:t xml:space="preserve">Fix the false-alarm logic and the censored revisit window before the batch run, not after.</w:t>
                 </w:r>
               </w:sdtContent>
             </w:sdt>
@@ -13773,7 +14233,7 @@
                     <w:sz w:val="14"/>
                     <w:szCs w:val="14"/>
                   </w:rPr>
-                  <w:t xml:space="preserve">Select ▾</w:t>
+                  <w:t xml:space="preserve">No</w:t>
                 </w:r>
               </w:sdtContent>
             </w:sdt>
@@ -13804,7 +14264,7 @@
                     <w:sz w:val="14"/>
                     <w:szCs w:val="14"/>
                   </w:rPr>
-                  <w:t xml:space="preserve">type here</w:t>
+                  <w:t xml:space="preserve">A business case is only as strong as its inputs: reading the simulation output directly and labelling every assumption makes it defensible.</w:t>
                 </w:r>
               </w:sdtContent>
             </w:sdt>
@@ -13835,7 +14295,7 @@
                     <w:sz w:val="14"/>
                     <w:szCs w:val="14"/>
                   </w:rPr>
-                  <w:t xml:space="preserve">type here</w:t>
+                  <w:t xml:space="preserve">Get real quotes and the real guard roster early to replace the assumption ranges.</w:t>
                 </w:r>
               </w:sdtContent>
             </w:sdt>
@@ -14418,7 +14878,7 @@
                     <w:sz w:val="15"/>
                     <w:szCs w:val="15"/>
                   </w:rPr>
-                  <w:t xml:space="preserve">Select ▾</w:t>
+                  <w:t xml:space="preserve">Yes</w:t>
                 </w:r>
               </w:sdtContent>
             </w:sdt>
@@ -14454,7 +14914,7 @@
                     <w:sz w:val="15"/>
                     <w:szCs w:val="15"/>
                   </w:rPr>
-                  <w:t xml:space="preserve">Select ▾</w:t>
+                  <w:t xml:space="preserve">Yes</w:t>
                 </w:r>
               </w:sdtContent>
             </w:sdt>
@@ -14490,7 +14950,7 @@
                     <w:sz w:val="15"/>
                     <w:szCs w:val="15"/>
                   </w:rPr>
-                  <w:t xml:space="preserve">Select ▾</w:t>
+                  <w:t xml:space="preserve">Yes</w:t>
                 </w:r>
               </w:sdtContent>
             </w:sdt>
@@ -14504,6 +14964,12 @@
             <w:pPr>
               <w:keepNext/>
             </w:pPr>
+            <w:r>
+              <w:rPr>
+                <w:i/>
+              </w:rPr>
+              <w:t>Muaaz Mohammed Iqbal Shaikh</w:t>
+            </w:r>
           </w:p>
         </w:tc>
         <w:tc>
@@ -14536,7 +15002,7 @@
                     <w:sz w:val="15"/>
                     <w:szCs w:val="15"/>
                   </w:rPr>
-                  <w:t xml:space="preserve">Select ▾</w:t>
+                  <w:t xml:space="preserve">Yes</w:t>
                 </w:r>
               </w:sdtContent>
             </w:sdt>
@@ -14599,7 +15065,7 @@
                     <w:sz w:val="15"/>
                     <w:szCs w:val="15"/>
                   </w:rPr>
-                  <w:t xml:space="preserve">Select ▾</w:t>
+                  <w:t xml:space="preserve">Yes</w:t>
                 </w:r>
               </w:sdtContent>
             </w:sdt>
@@ -14635,7 +15101,7 @@
                     <w:sz w:val="15"/>
                     <w:szCs w:val="15"/>
                   </w:rPr>
-                  <w:t xml:space="preserve">Select ▾</w:t>
+                  <w:t xml:space="preserve">Yes</w:t>
                 </w:r>
               </w:sdtContent>
             </w:sdt>
@@ -14671,7 +15137,7 @@
                     <w:sz w:val="15"/>
                     <w:szCs w:val="15"/>
                   </w:rPr>
-                  <w:t xml:space="preserve">Select ▾</w:t>
+                  <w:t xml:space="preserve">Yes</w:t>
                 </w:r>
               </w:sdtContent>
             </w:sdt>
@@ -14685,6 +15151,12 @@
             <w:pPr>
               <w:keepNext/>
             </w:pPr>
+            <w:r>
+              <w:rPr>
+                <w:i/>
+              </w:rPr>
+              <w:t>Aditya Rajkumar</w:t>
+            </w:r>
           </w:p>
         </w:tc>
         <w:tc>
@@ -14717,7 +15189,7 @@
                     <w:sz w:val="15"/>
                     <w:szCs w:val="15"/>
                   </w:rPr>
-                  <w:t xml:space="preserve">Select ▾</w:t>
+                  <w:t xml:space="preserve">Yes</w:t>
                 </w:r>
               </w:sdtContent>
             </w:sdt>
@@ -14780,7 +15252,7 @@
                     <w:sz w:val="15"/>
                     <w:szCs w:val="15"/>
                   </w:rPr>
-                  <w:t xml:space="preserve">Select ▾</w:t>
+                  <w:t xml:space="preserve">Yes</w:t>
                 </w:r>
               </w:sdtContent>
             </w:sdt>
@@ -14816,7 +15288,7 @@
                     <w:sz w:val="15"/>
                     <w:szCs w:val="15"/>
                   </w:rPr>
-                  <w:t xml:space="preserve">Select ▾</w:t>
+                  <w:t xml:space="preserve">Yes</w:t>
                 </w:r>
               </w:sdtContent>
             </w:sdt>
@@ -14852,7 +15324,7 @@
                     <w:sz w:val="15"/>
                     <w:szCs w:val="15"/>
                   </w:rPr>
-                  <w:t xml:space="preserve">Select ▾</w:t>
+                  <w:t xml:space="preserve">Yes</w:t>
                 </w:r>
               </w:sdtContent>
             </w:sdt>
@@ -14866,6 +15338,12 @@
             <w:pPr>
               <w:keepNext/>
             </w:pPr>
+            <w:r>
+              <w:rPr>
+                <w:i/>
+              </w:rPr>
+              <w:t>Zaid Rezaur Rahman</w:t>
+            </w:r>
           </w:p>
         </w:tc>
         <w:tc>
@@ -14898,7 +15376,7 @@
                     <w:sz w:val="15"/>
                     <w:szCs w:val="15"/>
                   </w:rPr>
-                  <w:t xml:space="preserve">Select ▾</w:t>
+                  <w:t xml:space="preserve">Yes</w:t>
                 </w:r>
               </w:sdtContent>
             </w:sdt>
@@ -14959,7 +15437,7 @@
                     <w:sz w:val="15"/>
                     <w:szCs w:val="15"/>
                   </w:rPr>
-                  <w:t xml:space="preserve">Select ▾</w:t>
+                  <w:t xml:space="preserve">Yes</w:t>
                 </w:r>
               </w:sdtContent>
             </w:sdt>
@@ -14994,7 +15472,7 @@
                     <w:sz w:val="15"/>
                     <w:szCs w:val="15"/>
                   </w:rPr>
-                  <w:t xml:space="preserve">Select ▾</w:t>
+                  <w:t xml:space="preserve">Yes</w:t>
                 </w:r>
               </w:sdtContent>
             </w:sdt>
@@ -15029,7 +15507,7 @@
                     <w:sz w:val="15"/>
                     <w:szCs w:val="15"/>
                   </w:rPr>
-                  <w:t xml:space="preserve">Select ▾</w:t>
+                  <w:t xml:space="preserve">Yes</w:t>
                 </w:r>
               </w:sdtContent>
             </w:sdt>
@@ -15039,7 +15517,14 @@
           <w:tcPr>
             <w:tcW w:type="dxa" w:w="2211"/>
           </w:tcPr>
-          <w:p/>
+          <w:p>
+            <w:r>
+              <w:rPr>
+                <w:i/>
+              </w:rPr>
+              <w:t>Soumya Subhankar Ranasingh</w:t>
+            </w:r>
+          </w:p>
         </w:tc>
         <w:tc>
           <w:tcPr>
@@ -15070,7 +15555,7 @@
                     <w:sz w:val="15"/>
                     <w:szCs w:val="15"/>
                   </w:rPr>
-                  <w:t xml:space="preserve">Select ▾</w:t>
+                  <w:t xml:space="preserve">Yes</w:t>
                 </w:r>
               </w:sdtContent>
             </w:sdt>

</xml_diff>

<commit_message>
feat(group-05): MPSTME GUARDIAN dual-UAV patrol simulation, 180-run real-trials batch, business model and completed dossier (#11)
Merges Group 05 MPSTME GUARDIAN dual-UAV surveillance simulation, 180-run real trials batch, 112 unit tests, dimensionless business model, and completed technical dossier (Muaaz Shaikh, Aditya Rajkumar, Zaid Rahman, Soumya Ranasingh).
</commit_message>
<xml_diff>
--- a/Group_05_Muaaz_Aditya_Zaid_Soumya/docs/MDRIIA_Group_05_Technical_Dossier.docx
+++ b/Group_05_Muaaz_Aditya_Zaid_Soumya/docs/MDRIIA_Group_05_Technical_Dossier.docx
@@ -1323,7 +1323,7 @@
                     <w:sz w:val="14"/>
                     <w:szCs w:val="14"/>
                   </w:rPr>
-                  <w:t xml:space="preserve">type here</w:t>
+                  <w:t xml:space="preserve">No primary source found. Corrected to our measured cycle time (N = 30 per cell): interior guard 2460.46 s vs UAV 57.41 s; exterior 532.91 s vs 71.82 s.</w:t>
                 </w:r>
               </w:sdtContent>
             </w:sdt>
@@ -1363,7 +1363,7 @@
                     <w:sz w:val="14"/>
                     <w:szCs w:val="14"/>
                   </w:rPr>
-                  <w:t xml:space="preserve">Select ▾</w:t>
+                  <w:t xml:space="preserve">No source found</w:t>
                 </w:r>
               </w:sdtContent>
             </w:sdt>
@@ -1400,7 +1400,7 @@
                     <w:sz w:val="14"/>
                     <w:szCs w:val="14"/>
                   </w:rPr>
-                  <w:t xml:space="preserve">Select ▾</w:t>
+                  <w:t xml:space="preserve">Correct</w:t>
                 </w:r>
               </w:sdtContent>
             </w:sdt>
@@ -1480,7 +1480,7 @@
                     <w:sz w:val="14"/>
                     <w:szCs w:val="14"/>
                   </w:rPr>
-                  <w:t xml:space="preserve">type here</w:t>
+                  <w:t xml:space="preserve">No primary source found. Corrected to T_payback from analytics/campus_security_economics.py (Section 3), a conditional range, not a point claim.</w:t>
                 </w:r>
               </w:sdtContent>
             </w:sdt>
@@ -1520,7 +1520,7 @@
                     <w:sz w:val="14"/>
                     <w:szCs w:val="14"/>
                   </w:rPr>
-                  <w:t xml:space="preserve">Select ▾</w:t>
+                  <w:t xml:space="preserve">No source found</w:t>
                 </w:r>
               </w:sdtContent>
             </w:sdt>
@@ -1557,7 +1557,7 @@
                     <w:sz w:val="14"/>
                     <w:szCs w:val="14"/>
                   </w:rPr>
-                  <w:t xml:space="preserve">Select ▾</w:t>
+                  <w:t xml:space="preserve">Correct</w:t>
                 </w:r>
               </w:sdtContent>
             </w:sdt>
@@ -1634,7 +1634,7 @@
                     <w:sz w:val="14"/>
                     <w:szCs w:val="14"/>
                   </w:rPr>
-                  <w:t xml:space="preserve">type here</w:t>
+                  <w:t xml:space="preserve">No primary source found (a design target). Corrected to the measured verify time: mean 0.199 s over 83 detected UAV runs (3 vision ticks at 10 Hz).</w:t>
                 </w:r>
               </w:sdtContent>
             </w:sdt>
@@ -1673,7 +1673,7 @@
                     <w:sz w:val="14"/>
                     <w:szCs w:val="14"/>
                   </w:rPr>
-                  <w:t xml:space="preserve">Select ▾</w:t>
+                  <w:t xml:space="preserve">No source found</w:t>
                 </w:r>
               </w:sdtContent>
             </w:sdt>
@@ -1709,7 +1709,7 @@
                     <w:sz w:val="14"/>
                     <w:szCs w:val="14"/>
                   </w:rPr>
-                  <w:t xml:space="preserve">Select ▾</w:t>
+                  <w:t xml:space="preserve">Correct</w:t>
                 </w:r>
               </w:sdtContent>
             </w:sdt>
@@ -1980,7 +1980,7 @@
                     <w:sz w:val="14"/>
                     <w:szCs w:val="14"/>
                   </w:rPr>
-                  <w:t xml:space="preserve">Select ▾</w:t>
+                  <w:t xml:space="preserve">No</w:t>
                 </w:r>
               </w:sdtContent>
             </w:sdt>
@@ -2012,7 +2012,7 @@
                     <w:sz w:val="14"/>
                     <w:szCs w:val="14"/>
                   </w:rPr>
-                  <w:t xml:space="preserve">type here</w:t>
+                  <w:t xml:space="preserve">Not applicable: ISO 10218-1:2025 covers industrial robots and excludes airborne and service robots. Source: genorma.com/en/standards/iso-10218-1-2025</w:t>
                 </w:r>
               </w:sdtContent>
             </w:sdt>
@@ -2117,7 +2117,7 @@
                     <w:sz w:val="14"/>
                     <w:szCs w:val="14"/>
                   </w:rPr>
-                  <w:t xml:space="preserve">Select ▾</w:t>
+                  <w:t xml:space="preserve">No</w:t>
                 </w:r>
               </w:sdtContent>
             </w:sdt>
@@ -2149,7 +2149,7 @@
                     <w:sz w:val="14"/>
                     <w:szCs w:val="14"/>
                   </w:rPr>
-                  <w:t xml:space="preserve">type here</w:t>
+                  <w:t xml:space="preserve">Not applicable: ISO 3691-4:2023 covers driverless industrial trucks (AGVs, AMRs); a multirotor is not an industrial truck. Source: genorma.com/en/standards/iso-3691-4-2023</w:t>
                 </w:r>
               </w:sdtContent>
             </w:sdt>
@@ -2254,7 +2254,7 @@
                     <w:sz w:val="14"/>
                     <w:szCs w:val="14"/>
                   </w:rPr>
-                  <w:t xml:space="preserve">Select ▾</w:t>
+                  <w:t xml:space="preserve">No</w:t>
                 </w:r>
               </w:sdtContent>
             </w:sdt>
@@ -2286,7 +2286,7 @@
                     <w:sz w:val="14"/>
                     <w:szCs w:val="14"/>
                   </w:rPr>
-                  <w:t xml:space="preserve">type here</w:t>
+                  <w:t xml:space="preserve">Not applicable: ANSI/A3 R15.06-2025 is the US adoption of ISO 10218 (industrial robots). Source: therobotreport.com (A3 announcement).</w:t>
                 </w:r>
               </w:sdtContent>
             </w:sdt>
@@ -2391,7 +2391,7 @@
                     <w:sz w:val="14"/>
                     <w:szCs w:val="14"/>
                   </w:rPr>
-                  <w:t xml:space="preserve">Select ▾</w:t>
+                  <w:t xml:space="preserve">No</w:t>
                 </w:r>
               </w:sdtContent>
             </w:sdt>
@@ -2423,7 +2423,7 @@
                     <w:sz w:val="14"/>
                     <w:szCs w:val="14"/>
                   </w:rPr>
-                  <w:t xml:space="preserve">type here</w:t>
+                  <w:t xml:space="preserve">Not applicable: IEC 60601-1:2005+A1:2012 covers medical electrical equipment. Source: webstore.iec.ch/publication/2612</w:t>
                 </w:r>
               </w:sdtContent>
             </w:sdt>
@@ -2524,7 +2524,7 @@
                     <w:sz w:val="14"/>
                     <w:szCs w:val="14"/>
                   </w:rPr>
-                  <w:t xml:space="preserve">Select ▾</w:t>
+                  <w:t xml:space="preserve">Partly</w:t>
                 </w:r>
               </w:sdtContent>
             </w:sdt>
@@ -2555,7 +2555,7 @@
                     <w:sz w:val="14"/>
                     <w:szCs w:val="14"/>
                   </w:rPr>
-                  <w:t xml:space="preserve">type here</w:t>
+                  <w:t xml:space="preserve">Partly: India Drone Rules 2021 (G.S.R. 589(E)) cover any UAS flown in India; a real outdoor campus flight needs Rule 14 registration and a Rule 21/22 zone check. Simulation only.</w:t>
                 </w:r>
               </w:sdtContent>
             </w:sdt>
@@ -2647,7 +2647,7 @@
                     <w:sz w:val="15"/>
                     <w:szCs w:val="15"/>
                   </w:rPr>
-                  <w:t xml:space="preserve">type here</w:t>
+                  <w:t xml:space="preserve">Guard on foot, simulated in the same MuJoCo scene (src/foot_patrol_baseline.py). Cycle time per full lap, N = 30: interior 2460.46 ± 593.21 s, exterior 532.91 ± 141.64 s. Walking speed 1.272 to 1.462 m/s; pause 10.0 to 60.0 s per checkpoint (ASSUMPTION).</w:t>
                 </w:r>
               </w:sdtContent>
             </w:sdt>
@@ -2706,7 +2706,7 @@
                     <w:sz w:val="15"/>
                     <w:szCs w:val="15"/>
                   </w:rPr>
-                  <w:t xml:space="preserve">type here</w:t>
+                  <w:t xml:space="preserve">Walking speed: Bohannon RW, Age Ageing 1997;26(1):15-19, doi 10.1093/ageing/26.1.15. Stairs: Dostan A et al., PLoS One 2023, doi 10.1371/journal.pone.0283333. Pause, rounds and guards per round: ASSUMPTION ranges.</w:t>
                 </w:r>
               </w:sdtContent>
             </w:sdt>
@@ -2763,7 +2763,7 @@
                     <w:sz w:val="15"/>
                     <w:szCs w:val="15"/>
                   </w:rPr>
-                  <w:t xml:space="preserve">type here</w:t>
+                  <w:t xml:space="preserve">Foot-patrol guards and the campus security or estate manager who carries the guard OpEx; people in the building between visits.</w:t>
                 </w:r>
               </w:sdtContent>
             </w:sdt>
@@ -3002,7 +3002,7 @@
                 <w:color w:val="000000"/>
                 <w:sz w:val="14"/>
               </w:rPr>
-              <w:t>timestep 0.004 s (250 Hz: set 0.002 s for 500 Hz logging) · friction 1.0 / 0.01 / 0.005 · 9 actuators (2 × 4 rotors + 1) · solref default</w:t>
+              <w:t>timestep 0.002 s (500 Hz) · friction 1 / 0.01 / 0.005 · 8 rotor actuators (2 UAVs × 4 rotors) · solref 0.004 1 on the airframe class, 0.02 1 on the floor</w:t>
             </w:r>
           </w:p>
         </w:tc>
@@ -3050,7 +3050,7 @@
                 <w:color w:val="000000"/>
                 <w:sz w:val="14"/>
               </w:rPr>
-              <w:t>PATROL (Alpha NE / Bravo SW sectors) → DETECT (OpenCV) → VERIFY → ALERT tier 0–3 (STATUS_3 = critical geofence breach) → TRACK → RETURN_TO_PATROL</w:t>
+              <w:t>PATROL (interior: Alpha flies the ground-floor corridor loop, Bravo sweeps the atrium galleries; exterior: the campus compound inside the boundary wall, ring flown as two arcs or by both UAVs half a lap apart) → DETECT (OpenCV HSV) → VERIFY → ALERT tier 0–3 (STATUS_3 = critical geofence breach) → TRACK → RETURN_TO_PATROL</w:t>
             </w:r>
           </w:p>
         </w:tc>
@@ -3209,7 +3209,7 @@
                     <w:sz w:val="15"/>
                     <w:szCs w:val="15"/>
                   </w:rPr>
-                  <w:t xml:space="preserve">type here</w:t>
+                  <w:t xml:space="preserve">0.002 s (500 Hz), implicitfast integrator, both scenes.</w:t>
                 </w:r>
               </w:sdtContent>
             </w:sdt>
@@ -3268,7 +3268,7 @@
                     <w:sz w:val="15"/>
                     <w:szCs w:val="15"/>
                   </w:rPr>
-                  <w:t xml:space="preserve">type here</w:t>
+                  <w:t xml:space="preserve">1 / 0.01 / 0.005 (sliding / torsional / rolling), condim 3, so only sliding friction acts (models/common.xml).</w:t>
                 </w:r>
               </w:sdtContent>
             </w:sdt>
@@ -3327,7 +3327,7 @@
                     <w:sz w:val="15"/>
                     <w:szCs w:val="15"/>
                   </w:rPr>
-                  <w:t xml:space="preserve">type here</w:t>
+                  <w:t xml:space="preserve">0.004 1 on the airframe, 0.02 1 on the floor. MuJoCo mixes them to 0.012 s for a leg contact, above 2 x timestep (0.004 s), so no clamp acts. Damping ratio 1 = critical, no bounce. Flight is thrust-driven, so contact settings do not drive any patrol metric.</w:t>
                 </w:r>
               </w:sdtContent>
             </w:sdt>
@@ -3394,7 +3394,7 @@
                     <w:sz w:val="15"/>
                     <w:szCs w:val="15"/>
                   </w:rPr>
-                  <w:t xml:space="preserve">Select ▾</w:t>
+                  <w:t xml:space="preserve">PI / PD</w:t>
                 </w:r>
               </w:sdtContent>
             </w:sdt>
@@ -3453,7 +3453,7 @@
                     <w:sz w:val="15"/>
                     <w:szCs w:val="15"/>
                   </w:rPr>
-                  <w:t xml:space="preserve">type here</w:t>
+                  <w:t xml:space="preserve">Position P 0.85; velocity PI 2.6 / 0.55; attitude PD roll and pitch 44.0 / 11.5, yaw 14.0 / 5.5. Separation: APF K_rep 8.5 below 2.5 m, plus a distance governor and a sidestep. FR-18: 26 beams, 8.0 m range, 100 Hz.</w:t>
                 </w:r>
               </w:sdtContent>
             </w:sdt>
@@ -3512,7 +3512,7 @@
                     <w:sz w:val="15"/>
                     <w:szCs w:val="15"/>
                   </w:rPr>
-                  <w:t xml:space="preserve">type here</w:t>
+                  <w:t xml:space="preserve">PATROL, DETECT, VERIFY, ALERT_0 to ALERT_3, TRACK, RETURN_TO_PATROL (DualUAVSurveillanceController._fsm_step). Vision 10 Hz; verify = 3 hits within 3.0 m; TRACK ends after 30 s or 2 s without a fix.</w:t>
                 </w:r>
               </w:sdtContent>
             </w:sdt>
@@ -3573,7 +3573,7 @@
                     <w:sz w:val="15"/>
                     <w:szCs w:val="15"/>
                   </w:rPr>
-                  <w:t xml:space="preserve">Select ▾</w:t>
+                  <w:t xml:space="preserve">Yes</w:t>
                 </w:r>
               </w:sdtContent>
             </w:sdt>
@@ -3780,7 +3780,7 @@
                     <w:sz w:val="14"/>
                     <w:szCs w:val="14"/>
                   </w:rPr>
-                  <w:t xml:space="preserve">Select ▾</w:t>
+                  <w:t xml:space="preserve">Modified by us</w:t>
                 </w:r>
               </w:sdtContent>
             </w:sdt>
@@ -3819,7 +3819,7 @@
                     <w:sz w:val="14"/>
                     <w:szCs w:val="14"/>
                   </w:rPr>
-                  <w:t xml:space="preserve">Select ▾</w:t>
+                  <w:t xml:space="preserve">E043</w:t>
                 </w:r>
               </w:sdtContent>
             </w:sdt>
@@ -3851,7 +3851,7 @@
                     <w:sz w:val="14"/>
                     <w:szCs w:val="14"/>
                   </w:rPr>
-                  <w:t xml:space="preserve">type here</w:t>
+                  <w:t xml:space="preserve">Scaffold names kept; timestep 0.002 s; 26 range-finder sites per airframe; scene geometry generated by models/scene_source. E043 area, AI-assisted.</w:t>
                 </w:r>
               </w:sdtContent>
             </w:sdt>
@@ -3915,7 +3915,7 @@
                     <w:sz w:val="14"/>
                     <w:szCs w:val="14"/>
                   </w:rPr>
-                  <w:t xml:space="preserve">Select ▾</w:t>
+                  <w:t xml:space="preserve">Modified by us</w:t>
                 </w:r>
               </w:sdtContent>
             </w:sdt>
@@ -3954,7 +3954,7 @@
                     <w:sz w:val="14"/>
                     <w:szCs w:val="14"/>
                   </w:rPr>
-                  <w:t xml:space="preserve">Select ▾</w:t>
+                  <w:t xml:space="preserve">Shared</w:t>
                 </w:r>
               </w:sdtContent>
             </w:sdt>
@@ -3986,7 +3986,7 @@
                     <w:sz w:val="14"/>
                     <w:szCs w:val="14"/>
                   </w:rPr>
-                  <w:t xml:space="preserve">type here</w:t>
+                  <w:t xml:space="preserve">E043: flight control, layered separation, FR-18 avoidance, FSM. E051 region: HSV detector, projection, target handoff. E075 region: geofence tiers with hysteresis. AI-assisted.</w:t>
                 </w:r>
               </w:sdtContent>
             </w:sdt>
@@ -4050,7 +4050,7 @@
                     <w:sz w:val="14"/>
                     <w:szCs w:val="14"/>
                   </w:rPr>
-                  <w:t xml:space="preserve">Select ▾</w:t>
+                  <w:t xml:space="preserve">Written by us</w:t>
                 </w:r>
               </w:sdtContent>
             </w:sdt>
@@ -4089,7 +4089,7 @@
                     <w:sz w:val="14"/>
                     <w:szCs w:val="14"/>
                   </w:rPr>
-                  <w:t xml:space="preserve">Select ▾</w:t>
+                  <w:t xml:space="preserve">E077</w:t>
                 </w:r>
               </w:sdtContent>
             </w:sdt>
@@ -4121,7 +4121,7 @@
                     <w:sz w:val="14"/>
                     <w:szCs w:val="14"/>
                   </w:rPr>
-                  <w:t xml:space="preserve">type here</w:t>
+                  <w:t xml:space="preserve">E077: scaffold constants replaced by a SOURCES table (cited or ASSUMPTION) and the hash-checked trials CSV; computes H_reclaimed, kappa, NCRI, P_payback, M/M/c, sensitivity and the FMEA. AI-assisted.</w:t>
                 </w:r>
               </w:sdtContent>
             </w:sdt>
@@ -4158,7 +4158,7 @@
                     <w:sz w:val="14"/>
                     <w:szCs w:val="14"/>
                   </w:rPr>
-                  <w:t xml:space="preserve">type here</w:t>
+                  <w:t xml:space="preserve">analytics/statistical_validation.py</w:t>
                 </w:r>
               </w:sdtContent>
             </w:sdt>
@@ -4196,7 +4196,7 @@
                     <w:sz w:val="14"/>
                     <w:szCs w:val="14"/>
                   </w:rPr>
-                  <w:t xml:space="preserve">Select ▾</w:t>
+                  <w:t xml:space="preserve">Written by us</w:t>
                 </w:r>
               </w:sdtContent>
             </w:sdt>
@@ -4235,7 +4235,7 @@
                     <w:sz w:val="14"/>
                     <w:szCs w:val="14"/>
                   </w:rPr>
-                  <w:t xml:space="preserve">Select ▾</w:t>
+                  <w:t xml:space="preserve">E075</w:t>
                 </w:r>
               </w:sdtContent>
             </w:sdt>
@@ -4267,7 +4267,7 @@
                     <w:sz w:val="14"/>
                     <w:szCs w:val="14"/>
                   </w:rPr>
-                  <w:t xml:space="preserve">type here</w:t>
+                  <w:t xml:space="preserve">E075: Welch's t test, exact p, Cohen's d and 95 % CI on the primary metric from the hash-checked CSV; the censored revisit is reported descriptively. AI-assisted.</w:t>
                 </w:r>
               </w:sdtContent>
             </w:sdt>
@@ -4303,7 +4303,7 @@
                     <w:sz w:val="14"/>
                     <w:szCs w:val="14"/>
                   </w:rPr>
-                  <w:t xml:space="preserve">type here</w:t>
+                  <w:t xml:space="preserve">analytics/vision_illumination_benchmark.py</w:t>
                 </w:r>
               </w:sdtContent>
             </w:sdt>
@@ -4340,7 +4340,7 @@
                     <w:sz w:val="14"/>
                     <w:szCs w:val="14"/>
                   </w:rPr>
-                  <w:t xml:space="preserve">Select ▾</w:t>
+                  <w:t xml:space="preserve">Written by us</w:t>
                 </w:r>
               </w:sdtContent>
             </w:sdt>
@@ -4378,7 +4378,7 @@
                     <w:sz w:val="14"/>
                     <w:szCs w:val="14"/>
                   </w:rPr>
-                  <w:t xml:space="preserve">Select ▾</w:t>
+                  <w:t xml:space="preserve">E051</w:t>
                 </w:r>
               </w:sdtContent>
             </w:sdt>
@@ -4409,7 +4409,7 @@
                     <w:sz w:val="14"/>
                     <w:szCs w:val="14"/>
                   </w:rPr>
-                  <w:t xml:space="preserve">type here</w:t>
+                  <w:t xml:space="preserve">E051: detector hit rate at noon and twilight (light x0.15, ASSUMPTION) in both scenes; feeds the FMEA twilight row. AI-assisted.</w:t>
                 </w:r>
               </w:sdtContent>
             </w:sdt>
@@ -4450,7 +4450,7 @@
       </w:tblGrid>
       <w:tr>
         <w:trPr>
-          <w:trHeight w:val="2608" w:hRule="exact"/>
+          <w:trHeight w:val="2608" w:hRule="atLeast"/>
           <w:cantSplit/>
         </w:trPr>
         <w:tc>
@@ -4460,17 +4460,261 @@
           <w:p>
             <w:pPr>
               <w:spacing w:after="0"/>
-              <w:jc w:val="center"/>
-            </w:pPr>
-            <w:r/>
+              <w:jc w:val="left"/>
+            </w:pPr>
             <w:r>
               <w:rPr>
-                <w:b w:val="0"/>
-                <w:i/>
-                <w:color w:val="595959"/>
-                <w:sz w:val="15"/>
+                <w:rFonts w:ascii="Consolas" w:hAnsi="Consolas" w:cs="Consolas"/>
+                <w:sz w:val="16"/>
               </w:rPr>
-              <w:t>[ Paste code as text (Consolas 8 pt), not a screenshot. Include the file name and line numbers. ]</w:t>
+              <w:t xml:space="preserve">src/aerial_patrol_swarm.py, DualUAVSurveillanceController._fsm_step (VERIFY -&gt; ALERT transition), lines 1405-1423</w:t>
+            </w:r>
+          </w:p>
+          <w:p>
+            <w:pPr>
+              <w:spacing w:after="0"/>
+              <w:jc w:val="left"/>
+            </w:pPr>
+            <w:r>
+              <w:rPr>
+                <w:rFonts w:ascii="Consolas" w:hAnsi="Consolas" w:cs="Consolas"/>
+                <w:sz w:val="16"/>
+              </w:rPr>
+              <w:t xml:space="preserve">1405  if self.surv_state in ("DETECT", "VERIFY"):</w:t>
+            </w:r>
+          </w:p>
+          <w:p>
+            <w:pPr>
+              <w:spacing w:after="0"/>
+              <w:jc w:val="left"/>
+            </w:pPr>
+            <w:r>
+              <w:rPr>
+                <w:rFonts w:ascii="Consolas" w:hAnsi="Consolas" w:cs="Consolas"/>
+                <w:sz w:val="16"/>
+              </w:rPr>
+              <w:t xml:space="preserve">1406      m = self._nearest_fix(fixes, inc["last_fix"], self.VERIFY_GATE_M)</w:t>
+            </w:r>
+          </w:p>
+          <w:p>
+            <w:pPr>
+              <w:spacing w:after="0"/>
+              <w:jc w:val="left"/>
+            </w:pPr>
+            <w:r>
+              <w:rPr>
+                <w:rFonts w:ascii="Consolas" w:hAnsi="Consolas" w:cs="Consolas"/>
+                <w:sz w:val="16"/>
+              </w:rPr>
+              <w:t xml:space="preserve">1407      if m is None:                                        # inconsistent / missing -&gt; reject</w:t>
+            </w:r>
+          </w:p>
+          <w:p>
+            <w:pPr>
+              <w:spacing w:after="0"/>
+              <w:jc w:val="left"/>
+            </w:pPr>
+            <w:r>
+              <w:rPr>
+                <w:rFonts w:ascii="Consolas" w:hAnsi="Consolas" w:cs="Consolas"/>
+                <w:sz w:val="16"/>
+              </w:rPr>
+              <w:t xml:space="preserve">1408          inc["t_close"], inc["close_reason"] = round(t, 3), "verify_reject"</w:t>
+            </w:r>
+          </w:p>
+          <w:p>
+            <w:pPr>
+              <w:spacing w:after="0"/>
+              <w:jc w:val="left"/>
+            </w:pPr>
+            <w:r>
+              <w:rPr>
+                <w:rFonts w:ascii="Consolas" w:hAnsi="Consolas" w:cs="Consolas"/>
+                <w:sz w:val="16"/>
+              </w:rPr>
+              <w:t xml:space="preserve">1409          self._set_role(owner, None, f"verify_reject:{inc['id']}")</w:t>
+            </w:r>
+          </w:p>
+          <w:p>
+            <w:pPr>
+              <w:spacing w:after="0"/>
+              <w:jc w:val="left"/>
+            </w:pPr>
+            <w:r>
+              <w:rPr>
+                <w:rFonts w:ascii="Consolas" w:hAnsi="Consolas" w:cs="Consolas"/>
+                <w:sz w:val="16"/>
+              </w:rPr>
+              <w:t xml:space="preserve">1410          self.surv_state, self._inc = "PATROL", None</w:t>
+            </w:r>
+          </w:p>
+          <w:p>
+            <w:pPr>
+              <w:spacing w:after="0"/>
+              <w:jc w:val="left"/>
+            </w:pPr>
+            <w:r>
+              <w:rPr>
+                <w:rFonts w:ascii="Consolas" w:hAnsi="Consolas" w:cs="Consolas"/>
+                <w:sz w:val="16"/>
+              </w:rPr>
+              <w:t xml:space="preserve">1411          return</w:t>
+            </w:r>
+          </w:p>
+          <w:p>
+            <w:pPr>
+              <w:spacing w:after="0"/>
+              <w:jc w:val="left"/>
+            </w:pPr>
+            <w:r>
+              <w:rPr>
+                <w:rFonts w:ascii="Consolas" w:hAnsi="Consolas" w:cs="Consolas"/>
+                <w:sz w:val="16"/>
+              </w:rPr>
+              <w:t xml:space="preserve">1412      inc["hits"] += 1</w:t>
+            </w:r>
+          </w:p>
+          <w:p>
+            <w:pPr>
+              <w:spacing w:after="0"/>
+              <w:jc w:val="left"/>
+            </w:pPr>
+            <w:r>
+              <w:rPr>
+                <w:rFonts w:ascii="Consolas" w:hAnsi="Consolas" w:cs="Consolas"/>
+                <w:sz w:val="16"/>
+              </w:rPr>
+              <w:t xml:space="preserve">1413      inc["last_fix"], inc["t_last_fix"] = m[2].copy(), t</w:t>
+            </w:r>
+          </w:p>
+          <w:p>
+            <w:pPr>
+              <w:spacing w:after="0"/>
+              <w:jc w:val="left"/>
+            </w:pPr>
+            <w:r>
+              <w:rPr>
+                <w:rFonts w:ascii="Consolas" w:hAnsi="Consolas" w:cs="Consolas"/>
+                <w:sz w:val="16"/>
+              </w:rPr>
+              <w:t xml:space="preserve">1414      if inc["hits"] &lt; self.VERIFY_K:</w:t>
+            </w:r>
+          </w:p>
+          <w:p>
+            <w:pPr>
+              <w:spacing w:after="0"/>
+              <w:jc w:val="left"/>
+            </w:pPr>
+            <w:r>
+              <w:rPr>
+                <w:rFonts w:ascii="Consolas" w:hAnsi="Consolas" w:cs="Consolas"/>
+                <w:sz w:val="16"/>
+              </w:rPr>
+              <w:t xml:space="preserve">1415          self.surv_state = "VERIFY"</w:t>
+            </w:r>
+          </w:p>
+          <w:p>
+            <w:pPr>
+              <w:spacing w:after="0"/>
+              <w:jc w:val="left"/>
+            </w:pPr>
+            <w:r>
+              <w:rPr>
+                <w:rFonts w:ascii="Consolas" w:hAnsi="Consolas" w:cs="Consolas"/>
+                <w:sz w:val="16"/>
+              </w:rPr>
+              <w:t xml:space="preserve">1416          self._set_role(owner, "VERIFY")</w:t>
+            </w:r>
+          </w:p>
+          <w:p>
+            <w:pPr>
+              <w:spacing w:after="0"/>
+              <w:jc w:val="left"/>
+            </w:pPr>
+            <w:r>
+              <w:rPr>
+                <w:rFonts w:ascii="Consolas" w:hAnsi="Consolas" w:cs="Consolas"/>
+                <w:sz w:val="16"/>
+              </w:rPr>
+              <w:t xml:space="preserve">1417          return</w:t>
+            </w:r>
+          </w:p>
+          <w:p>
+            <w:pPr>
+              <w:spacing w:after="0"/>
+              <w:jc w:val="left"/>
+            </w:pPr>
+            <w:r>
+              <w:rPr>
+                <w:rFonts w:ascii="Consolas" w:hAnsi="Consolas" w:cs="Consolas"/>
+                <w:sz w:val="16"/>
+              </w:rPr>
+              <w:t xml:space="preserve">1418      status, tier = self.evaluate_geofence_status(m[2])</w:t>
+            </w:r>
+          </w:p>
+          <w:p>
+            <w:pPr>
+              <w:spacing w:after="0"/>
+              <w:jc w:val="left"/>
+            </w:pPr>
+            <w:r>
+              <w:rPr>
+                <w:rFonts w:ascii="Consolas" w:hAnsi="Consolas" w:cs="Consolas"/>
+                <w:sz w:val="16"/>
+              </w:rPr>
+              <w:t xml:space="preserve">1419      inc.update(t_verify=round(t, 3), fix_verify=[round(float(v), 3) for v in m[2]], tier_alert=int(tier),</w:t>
+            </w:r>
+          </w:p>
+          <w:p>
+            <w:pPr>
+              <w:spacing w:after="0"/>
+              <w:jc w:val="left"/>
+            </w:pPr>
+            <w:r>
+              <w:rPr>
+                <w:rFonts w:ascii="Consolas" w:hAnsi="Consolas" w:cs="Consolas"/>
+                <w:sz w:val="16"/>
+              </w:rPr>
+              <w:t xml:space="preserve">1420                 tier_max=int(tier))</w:t>
+            </w:r>
+          </w:p>
+          <w:p>
+            <w:pPr>
+              <w:spacing w:after="0"/>
+              <w:jc w:val="left"/>
+            </w:pPr>
+            <w:r>
+              <w:rPr>
+                <w:rFonts w:ascii="Consolas" w:hAnsi="Consolas" w:cs="Consolas"/>
+                <w:sz w:val="16"/>
+              </w:rPr>
+              <w:t xml:space="preserve">1421      self.alert_status = status</w:t>
+            </w:r>
+          </w:p>
+          <w:p>
+            <w:pPr>
+              <w:spacing w:after="0"/>
+              <w:jc w:val="left"/>
+            </w:pPr>
+            <w:r>
+              <w:rPr>
+                <w:rFonts w:ascii="Consolas" w:hAnsi="Consolas" w:cs="Consolas"/>
+                <w:sz w:val="16"/>
+              </w:rPr>
+              <w:t xml:space="preserve">1422      self.surv_state = f"ALERT_{tier}"</w:t>
+            </w:r>
+          </w:p>
+          <w:p>
+            <w:pPr>
+              <w:spacing w:after="0"/>
+              <w:jc w:val="left"/>
+            </w:pPr>
+            <w:r>
+              <w:rPr>
+                <w:rFonts w:ascii="Consolas" w:hAnsi="Consolas" w:cs="Consolas"/>
+                <w:sz w:val="16"/>
+              </w:rPr>
+              <w:t xml:space="preserve">1423      self._set_role(owner, f"ALERT_{tier}", f"verify:{inc['id']};alert:{tier}")</w:t>
             </w:r>
           </w:p>
         </w:tc>
@@ -4509,7 +4753,7 @@
       </w:tblGrid>
       <w:tr>
         <w:trPr>
-          <w:trHeight w:val="2381" w:hRule="exact"/>
+          <w:trHeight w:val="2381" w:hRule="atLeast"/>
           <w:cantSplit/>
         </w:trPr>
         <w:tc>
@@ -4529,7 +4773,7 @@
                 <w:color w:val="595959"/>
                 <w:sz w:val="15"/>
               </w:rPr>
-              <w:t>[ FBD (phone photo of a hand sketch is fine) → symbols explained → worked example → where this value appears in your telemetry CSV ]</w:t>
+              <w:t>Free-body diagram of one UAV in hover (draw it: body at the centre, weight W = m g downward, four rotor forces F0 to F3 upward at arm length l = 0.26 m on the + layout, wind drag omitted). Hover balance: F0 + F1 + F2 + F3 = m g. Worked example with the model's own numbers (printed by docs/dossier_fill_facts.py from body_subtreemass, key F-mass): m = 1.35 kg, so m g = 1.35 x 9.81 = 13.24 N; per rotor 3.31 N; maximum thrust 4 x 7.5 N = 30.0 N, so T/W = 30.0 / 13.24 = 2.27. In the telemetry CSV (analytics/runs/&lt;run&gt;.csv.gz) the rotor forces are columns f0..f3 in N; the median of f0+f1+f2+f3 for Alpha while fsm_state = PATROL in interior_uav_sectors_s1 is 13.245 N (key F-tel-hover), against m g = 13.244 N.</w:t>
             </w:r>
           </w:p>
         </w:tc>
@@ -5000,7 +5244,7 @@
                     <w:sz w:val="14"/>
                     <w:szCs w:val="14"/>
                   </w:rPr>
-                  <w:t xml:space="preserve">type here</w:t>
+                  <w:t xml:space="preserve">H_patrol = (24 / hours_per_shift) x rounds_per_shift x guards_per_round x simulated guard cycle time; H_reclaimed = replacement_fraction x H_patrol, gated on UAV revisit (PASS in all 4 cells). Base case = midpoint of each ASSUMPTION range; full table in the economics output.</w:t>
                 </w:r>
               </w:sdtContent>
             </w:sdt>
@@ -5032,7 +5276,7 @@
                     <w:sz w:val="14"/>
                     <w:szCs w:val="14"/>
                   </w:rPr>
-                  <w:t xml:space="preserve">type here</w:t>
+                  <w:t xml:space="preserve">interior 13.84 guard-hours/day (2.429 FTE), exterior 3.00 guard-hours/day (0.526 FTE). Conditional on the ASSUMPTION ranges.</w:t>
                 </w:r>
               </w:sdtContent>
             </w:sdt>
@@ -5112,7 +5356,7 @@
                     <w:sz w:val="14"/>
                     <w:szCs w:val="14"/>
                   </w:rPr>
-                  <w:t xml:space="preserve">type here</w:t>
+                  <w:t xml:space="preserve">P_payback = k / (T_life x (R - k u)); T_payback = 12 k / (R - k u) months. k = capex_ratio (ASSUMPTION 0.2 to 1.1); T_life 2 to 5 years (ASSUMPTION). All costs are ratios to one year of guard patrol labour.</w:t>
                 </w:r>
               </w:sdtContent>
             </w:sdt>
@@ -5144,7 +5388,7 @@
                     <w:sz w:val="14"/>
                     <w:szCs w:val="14"/>
                   </w:rPr>
-                  <w:t xml:space="preserve">type here</w:t>
+                  <w:t xml:space="preserve">Base case: interior sectors 0.304, interior offset_ring 0.301, exterior sectors 0.306, exterior offset_ring 0.300. P &lt; 1 = pays back within the service life; 0 of 512 range corners never pay back.</w:t>
                 </w:r>
               </w:sdtContent>
             </w:sdt>
@@ -5224,7 +5468,7 @@
                     <w:sz w:val="14"/>
                     <w:szCs w:val="14"/>
                   </w:rPr>
-                  <w:t xml:space="preserve">type here</w:t>
+                  <w:t xml:space="preserve">NCRI = 1 - kappa; kappa = annual UAV running cost / annual value of reclaimed guard hours (target kappa &lt;= 0.25).</w:t>
                 </w:r>
               </w:sdtContent>
             </w:sdt>
@@ -5256,7 +5500,7 @@
                     <w:sz w:val="14"/>
                     <w:szCs w:val="14"/>
                   </w:rPr>
-                  <w:t xml:space="preserve">type here</w:t>
+                  <w:t xml:space="preserve">kappa / NCRI: interior sectors 0.185 / 0.815; interior offset_ring 0.177 / 0.823; exterior sectors 0.192 / 0.808; exterior offset_ring 0.176 / 0.824. All meet kappa &lt;= 0.25.</w:t>
                 </w:r>
               </w:sdtContent>
             </w:sdt>
@@ -5336,7 +5580,7 @@
                     <w:sz w:val="14"/>
                     <w:szCs w:val="14"/>
                   </w:rPr>
-                  <w:t xml:space="preserve">type here</w:t>
+                  <w:t xml:space="preserve">M/M/c, c = 2 UAVs; lambda from 1 to 10 incidents/month (ASSUMPTION); mu = 1 / (simulated detection + verify time); guard mu from a 2 to 10 min response (ASSUMPTION); W_q by Erlang C.</w:t>
                 </w:r>
               </w:sdtContent>
             </w:sdt>
@@ -5368,7 +5612,7 @@
                     <w:sz w:val="14"/>
                     <w:szCs w:val="14"/>
                   </w:rPr>
-                  <w:t xml:space="preserve">type here</w:t>
+                  <w:t xml:space="preserve">Base lambda: interior sectors rho = 0.00003, exterior sectors rho = 0.00001; W_q is about zero. The queue shows utilisation headroom, not a delay problem.</w:t>
                 </w:r>
               </w:sdtContent>
             </w:sdt>
@@ -5445,7 +5689,7 @@
                     <w:sz w:val="14"/>
                     <w:szCs w:val="14"/>
                   </w:rPr>
-                  <w:t xml:space="preserve">type here</w:t>
+                  <w:t xml:space="preserve">Most uncertain input (widest ASSUMPTION range): capex_ratio 0.2 to 1.1, swept -30 % to +30 %; P_payback and NCRI plotted.</w:t>
                 </w:r>
               </w:sdtContent>
             </w:sdt>
@@ -5476,7 +5720,7 @@
                     <w:sz w:val="14"/>
                     <w:szCs w:val="14"/>
                   </w:rPr>
-                  <w:t xml:space="preserve">type here</w:t>
+                  <w:t xml:space="preserve">No break-even inside the assumed capex range in any cell: P_payback reaches 1 only at capex_ratio 1.501 (interior sectors), 1.531, 1.480 and 1.535, all above the assumed maximum of 1.1. Figure: analytics/figures/campus_security_sensitivity.png.</w:t>
                 </w:r>
               </w:sdtContent>
             </w:sdt>
@@ -5558,7 +5802,7 @@
                     <w:sz w:val="15"/>
                     <w:szCs w:val="15"/>
                   </w:rPr>
-                  <w:t xml:space="preserve">Select ▾</w:t>
+                  <w:t xml:space="preserve">M/M/c</w:t>
                 </w:r>
               </w:sdtContent>
             </w:sdt>
@@ -5617,7 +5861,7 @@
                     <w:sz w:val="15"/>
                     <w:szCs w:val="15"/>
                   </w:rPr>
-                  <w:t xml:space="preserve">type here</w:t>
+                  <w:t xml:space="preserve">lambda 0.00137 / 0.00753 / 0.01370 per h (low / base / high, ASSUMPTION); UAV mu 142.473 per h (interior), 277.021 per h (exterior); guard mu 10.000 per h; c = 2.</w:t>
                 </w:r>
               </w:sdtContent>
             </w:sdt>
@@ -5676,7 +5920,7 @@
                     <w:sz w:val="15"/>
                     <w:szCs w:val="15"/>
                   </w:rPr>
-                  <w:t xml:space="preserve">type here</w:t>
+                  <w:t xml:space="preserve">interior sectors 12.8 months; interior offset_ring 12.6 months; exterior sectors 12.9 months; exterior offset_ring 12.6 months</w:t>
                 </w:r>
               </w:sdtContent>
             </w:sdt>
@@ -5737,7 +5981,7 @@
                     <w:sz w:val="15"/>
                     <w:szCs w:val="15"/>
                   </w:rPr>
-                  <w:t xml:space="preserve">Select ▾</w:t>
+                  <w:t xml:space="preserve">Yes</w:t>
                 </w:r>
               </w:sdtContent>
             </w:sdt>
@@ -6054,7 +6298,7 @@
                     <w:sz w:val="14"/>
                     <w:szCs w:val="14"/>
                   </w:rPr>
-                  <w:t xml:space="preserve">type here</w:t>
+                  <w:t xml:space="preserve">airframe contact, both vehicles lost</w:t>
                 </w:r>
               </w:sdtContent>
             </w:sdt>
@@ -6098,7 +6342,7 @@
                     <w:sz w:val="14"/>
                     <w:szCs w:val="14"/>
                   </w:rPr>
-                  <w:t xml:space="preserve">Select ▾</w:t>
+                  <w:t xml:space="preserve">9</w:t>
                 </w:r>
               </w:sdtContent>
             </w:sdt>
@@ -6142,7 +6386,7 @@
                     <w:sz w:val="14"/>
                     <w:szCs w:val="14"/>
                   </w:rPr>
-                  <w:t xml:space="preserve">Select ▾</w:t>
+                  <w:t xml:space="preserve">9</w:t>
                 </w:r>
               </w:sdtContent>
             </w:sdt>
@@ -6186,7 +6430,7 @@
                     <w:sz w:val="14"/>
                     <w:szCs w:val="14"/>
                   </w:rPr>
-                  <w:t xml:space="preserve">Select ▾</w:t>
+                  <w:t xml:space="preserve">7</w:t>
                 </w:r>
               </w:sdtContent>
             </w:sdt>
@@ -6218,7 +6462,7 @@
                     <w:sz w:val="14"/>
                     <w:szCs w:val="14"/>
                   </w:rPr>
-                  <w:t xml:space="preserve">type here</w:t>
+                  <w:t xml:space="preserve">567 interior; not measured exterior</w:t>
                 </w:r>
               </w:sdtContent>
             </w:sdt>
@@ -6250,7 +6494,7 @@
                     <w:sz w:val="14"/>
                     <w:szCs w:val="14"/>
                   </w:rPr>
-                  <w:t xml:space="preserve">type here</w:t>
+                  <w:t xml:space="preserve">[E043] Layered altitude separation and a distance governor on top of APF. Ablation (interior): O 9 to 1 (6/10 to 0/10 runs). 0 UAV-UAV contacts in all 120 UAV runs; closest approach 3.05 m.</w:t>
                 </w:r>
               </w:sdtContent>
             </w:sdt>
@@ -6282,7 +6526,7 @@
                     <w:sz w:val="14"/>
                     <w:szCs w:val="14"/>
                   </w:rPr>
-                  <w:t xml:space="preserve">type here</w:t>
+                  <w:t xml:space="preserve">9 interior; not measured exterior</w:t>
                 </w:r>
               </w:sdtContent>
             </w:sdt>
@@ -6320,7 +6564,7 @@
                     <w:sz w:val="14"/>
                     <w:szCs w:val="14"/>
                   </w:rPr>
-                  <w:t xml:space="preserve">Select ▾</w:t>
+                  <w:t xml:space="preserve">Both</w:t>
                 </w:r>
               </w:sdtContent>
             </w:sdt>
@@ -6379,7 +6623,7 @@
                     <w:sz w:val="14"/>
                     <w:szCs w:val="14"/>
                   </w:rPr>
-                  <w:t xml:space="preserve">type here</w:t>
+                  <w:t xml:space="preserve">no ALERT; patrol continues past the intruder</w:t>
                 </w:r>
               </w:sdtContent>
             </w:sdt>
@@ -6423,7 +6667,7 @@
                     <w:sz w:val="14"/>
                     <w:szCs w:val="14"/>
                   </w:rPr>
-                  <w:t xml:space="preserve">Select ▾</w:t>
+                  <w:t xml:space="preserve">8</w:t>
                 </w:r>
               </w:sdtContent>
             </w:sdt>
@@ -6467,7 +6711,7 @@
                     <w:sz w:val="14"/>
                     <w:szCs w:val="14"/>
                   </w:rPr>
-                  <w:t xml:space="preserve">Select ▾</w:t>
+                  <w:t xml:space="preserve">10</w:t>
                 </w:r>
               </w:sdtContent>
             </w:sdt>
@@ -6511,7 +6755,7 @@
                     <w:sz w:val="14"/>
                     <w:szCs w:val="14"/>
                   </w:rPr>
-                  <w:t xml:space="preserve">Select ▾</w:t>
+                  <w:t xml:space="preserve">10</w:t>
                 </w:r>
               </w:sdtContent>
             </w:sdt>
@@ -6543,7 +6787,7 @@
                     <w:sz w:val="14"/>
                     <w:szCs w:val="14"/>
                   </w:rPr>
-                  <w:t xml:space="preserve">type here</w:t>
+                  <w:t xml:space="preserve">800 interior; not measured exterior</w:t>
                 </w:r>
               </w:sdtContent>
             </w:sdt>
@@ -6575,7 +6819,7 @@
                     <w:sz w:val="14"/>
                     <w:szCs w:val="14"/>
                   </w:rPr>
-                  <w:t xml:space="preserve">type here</w:t>
+                  <w:t xml:space="preserve">[E051] Twilight exposure fix in the detector. Ablation (interior): O 10 to 8 (10/10 to 4/10 runs), D 10 to 1.</w:t>
                 </w:r>
               </w:sdtContent>
             </w:sdt>
@@ -6607,7 +6851,7 @@
                     <w:sz w:val="14"/>
                     <w:szCs w:val="14"/>
                   </w:rPr>
-                  <w:t xml:space="preserve">type here</w:t>
+                  <w:t xml:space="preserve">64 interior; not measured exterior</w:t>
                 </w:r>
               </w:sdtContent>
             </w:sdt>
@@ -6645,7 +6889,7 @@
                     <w:sz w:val="14"/>
                     <w:szCs w:val="14"/>
                   </w:rPr>
-                  <w:t xml:space="preserve">Select ▾</w:t>
+                  <w:t xml:space="preserve">Both</w:t>
                 </w:r>
               </w:sdtContent>
             </w:sdt>
@@ -6683,7 +6927,7 @@
                     <w:sz w:val="14"/>
                     <w:szCs w:val="14"/>
                   </w:rPr>
-                  <w:t xml:space="preserve">type here</w:t>
+                  <w:t xml:space="preserve">False geofence alarm from position noise</w:t>
                 </w:r>
               </w:sdtContent>
             </w:sdt>
@@ -6715,7 +6959,7 @@
                     <w:sz w:val="14"/>
                     <w:szCs w:val="14"/>
                   </w:rPr>
-                  <w:t xml:space="preserve">type here</w:t>
+                  <w:t xml:space="preserve">spurious tier escalation, guard sent for nothing</w:t>
                 </w:r>
               </w:sdtContent>
             </w:sdt>
@@ -6759,7 +7003,7 @@
                     <w:sz w:val="14"/>
                     <w:szCs w:val="14"/>
                   </w:rPr>
-                  <w:t xml:space="preserve">Select ▾</w:t>
+                  <w:t xml:space="preserve">4</w:t>
                 </w:r>
               </w:sdtContent>
             </w:sdt>
@@ -6803,7 +7047,7 @@
                     <w:sz w:val="14"/>
                     <w:szCs w:val="14"/>
                   </w:rPr>
-                  <w:t xml:space="preserve">Select ▾</w:t>
+                  <w:t xml:space="preserve">10</w:t>
                 </w:r>
               </w:sdtContent>
             </w:sdt>
@@ -6847,7 +7091,7 @@
                     <w:sz w:val="14"/>
                     <w:szCs w:val="14"/>
                   </w:rPr>
-                  <w:t xml:space="preserve">Select ▾</w:t>
+                  <w:t xml:space="preserve">10</w:t>
                 </w:r>
               </w:sdtContent>
             </w:sdt>
@@ -6879,7 +7123,7 @@
                     <w:sz w:val="14"/>
                     <w:szCs w:val="14"/>
                   </w:rPr>
-                  <w:t xml:space="preserve">type here</w:t>
+                  <w:t xml:space="preserve">400 interior; not measured exterior</w:t>
                 </w:r>
               </w:sdtContent>
             </w:sdt>
@@ -6911,7 +7155,7 @@
                     <w:sz w:val="14"/>
                     <w:szCs w:val="14"/>
                   </w:rPr>
-                  <w:t xml:space="preserve">type here</w:t>
+                  <w:t xml:space="preserve">[E075] Exit margin and tier-3 dwell on the geofence. Ablation (interior, noisy position): O 10 to 6 (10/10 to 1/10 runs), D 10 to 1.</w:t>
                 </w:r>
               </w:sdtContent>
             </w:sdt>
@@ -6943,7 +7187,7 @@
                     <w:sz w:val="14"/>
                     <w:szCs w:val="14"/>
                   </w:rPr>
-                  <w:t xml:space="preserve">type here</w:t>
+                  <w:t xml:space="preserve">24 interior; not measured exterior</w:t>
                 </w:r>
               </w:sdtContent>
             </w:sdt>
@@ -6981,7 +7225,7 @@
                     <w:sz w:val="14"/>
                     <w:szCs w:val="14"/>
                   </w:rPr>
-                  <w:t xml:space="preserve">Select ▾</w:t>
+                  <w:t xml:space="preserve">Both</w:t>
                 </w:r>
               </w:sdtContent>
             </w:sdt>
@@ -7019,7 +7263,7 @@
                     <w:sz w:val="14"/>
                     <w:szCs w:val="14"/>
                   </w:rPr>
-                  <w:t xml:space="preserve">type here</w:t>
+                  <w:t xml:space="preserve">Intruder not detected in a patrol run (any lighting)</w:t>
                 </w:r>
               </w:sdtContent>
             </w:sdt>
@@ -7051,7 +7295,7 @@
                     <w:sz w:val="14"/>
                     <w:szCs w:val="14"/>
                   </w:rPr>
-                  <w:t xml:space="preserve">type here</w:t>
+                  <w:t xml:space="preserve">breach goes unnoticed</w:t>
                 </w:r>
               </w:sdtContent>
             </w:sdt>
@@ -7095,7 +7339,7 @@
                     <w:sz w:val="14"/>
                     <w:szCs w:val="14"/>
                   </w:rPr>
-                  <w:t xml:space="preserve">Select ▾</w:t>
+                  <w:t xml:space="preserve">8</w:t>
                 </w:r>
               </w:sdtContent>
             </w:sdt>
@@ -7139,7 +7383,7 @@
                     <w:sz w:val="14"/>
                     <w:szCs w:val="14"/>
                   </w:rPr>
-                  <w:t xml:space="preserve">Select ▾</w:t>
+                  <w:t xml:space="preserve">9</w:t>
                 </w:r>
               </w:sdtContent>
             </w:sdt>
@@ -7183,7 +7427,7 @@
                     <w:sz w:val="14"/>
                     <w:szCs w:val="14"/>
                   </w:rPr>
-                  <w:t xml:space="preserve">Select ▾</w:t>
+                  <w:t xml:space="preserve">6</w:t>
                 </w:r>
               </w:sdtContent>
             </w:sdt>
@@ -7215,7 +7459,7 @@
                     <w:sz w:val="14"/>
                     <w:szCs w:val="14"/>
                   </w:rPr>
-                  <w:t xml:space="preserve">type here</w:t>
+                  <w:t xml:space="preserve">432 interior; 48 exterior</w:t>
                 </w:r>
               </w:sdtContent>
             </w:sdt>
@@ -7247,7 +7491,7 @@
                     <w:sz w:val="14"/>
                     <w:szCs w:val="14"/>
                   </w:rPr>
-                  <w:t xml:space="preserve">type here</w:t>
+                  <w:t xml:space="preserve">[E043 with E051 detector] UAV patrol with camera detection. Interior O stays 9 (guard 19/30, UAV 37/60), so no indoor detection gain; D 6 to 4 (team judgement).</w:t>
                 </w:r>
               </w:sdtContent>
             </w:sdt>
@@ -7279,7 +7523,7 @@
                     <w:sz w:val="14"/>
                     <w:szCs w:val="14"/>
                   </w:rPr>
-                  <w:t xml:space="preserve">type here</w:t>
+                  <w:t xml:space="preserve">288 interior; 32 exterior</w:t>
                 </w:r>
               </w:sdtContent>
             </w:sdt>
@@ -7317,7 +7561,7 @@
                     <w:sz w:val="14"/>
                     <w:szCs w:val="14"/>
                   </w:rPr>
-                  <w:t xml:space="preserve">Select ▾</w:t>
+                  <w:t xml:space="preserve">Simulation</w:t>
                 </w:r>
               </w:sdtContent>
             </w:sdt>
@@ -7354,7 +7598,7 @@
                     <w:sz w:val="14"/>
                     <w:szCs w:val="14"/>
                   </w:rPr>
-                  <w:t xml:space="preserve">type here</w:t>
+                  <w:t xml:space="preserve">Collision with an obstacle the UAV did not sense (FR-18)</w:t>
                 </w:r>
               </w:sdtContent>
             </w:sdt>
@@ -7385,7 +7629,7 @@
                     <w:sz w:val="14"/>
                     <w:szCs w:val="14"/>
                   </w:rPr>
-                  <w:t xml:space="preserve">type here</w:t>
+                  <w:t xml:space="preserve">crash into furniture, column or wall; patrol aborted</w:t>
                 </w:r>
               </w:sdtContent>
             </w:sdt>
@@ -7428,7 +7672,7 @@
                     <w:sz w:val="14"/>
                     <w:szCs w:val="14"/>
                   </w:rPr>
-                  <w:t xml:space="preserve">Select ▾</w:t>
+                  <w:t xml:space="preserve">8</w:t>
                 </w:r>
               </w:sdtContent>
             </w:sdt>
@@ -7471,7 +7715,7 @@
                     <w:sz w:val="14"/>
                     <w:szCs w:val="14"/>
                   </w:rPr>
-                  <w:t xml:space="preserve">Select ▾</w:t>
+                  <w:t xml:space="preserve">1</w:t>
                 </w:r>
               </w:sdtContent>
             </w:sdt>
@@ -7514,7 +7758,7 @@
                     <w:sz w:val="14"/>
                     <w:szCs w:val="14"/>
                   </w:rPr>
-                  <w:t xml:space="preserve">Select ▾</w:t>
+                  <w:t xml:space="preserve">1</w:t>
                 </w:r>
               </w:sdtContent>
             </w:sdt>
@@ -7545,7 +7789,7 @@
                     <w:sz w:val="14"/>
                     <w:szCs w:val="14"/>
                   </w:rPr>
-                  <w:t xml:space="preserve">type here</w:t>
+                  <w:t xml:space="preserve">8 interior; not measured exterior</w:t>
                 </w:r>
               </w:sdtContent>
             </w:sdt>
@@ -7576,7 +7820,7 @@
                     <w:sz w:val="14"/>
                     <w:szCs w:val="14"/>
                   </w:rPr>
-                  <w:t xml:space="preserve">type here</w:t>
+                  <w:t xml:space="preserve">[E043] FR-18 range-ring sensing with avoidance never disabled. Ablation (interior): O 1 in both arms (0/10 runs).</w:t>
                 </w:r>
               </w:sdtContent>
             </w:sdt>
@@ -7607,7 +7851,7 @@
                     <w:sz w:val="14"/>
                     <w:szCs w:val="14"/>
                   </w:rPr>
-                  <w:t xml:space="preserve">type here</w:t>
+                  <w:t xml:space="preserve">8 interior; not measured exterior</w:t>
                 </w:r>
               </w:sdtContent>
             </w:sdt>
@@ -7644,7 +7888,7 @@
                     <w:sz w:val="14"/>
                     <w:szCs w:val="14"/>
                   </w:rPr>
-                  <w:t xml:space="preserve">Select ▾</w:t>
+                  <w:t xml:space="preserve">Both</w:t>
                 </w:r>
               </w:sdtContent>
             </w:sdt>
@@ -7671,7 +7915,7 @@
       </w:tblGrid>
       <w:tr>
         <w:trPr>
-          <w:trHeight w:val="2608" w:hRule="exact"/>
+          <w:trHeight w:val="2608" w:hRule="atLeast"/>
           <w:cantSplit/>
         </w:trPr>
         <w:tc>
@@ -7684,15 +7928,47 @@
               <w:spacing w:after="0"/>
               <w:jc w:val="center"/>
             </w:pPr>
-            <w:r/>
+            <w:r>
+              <w:drawing>
+                <wp:inline xmlns:a="http://schemas.openxmlformats.org/drawingml/2006/main" xmlns:pic="http://schemas.openxmlformats.org/drawingml/2006/picture">
+                  <wp:extent cx="2951999" cy="1180800"/>
+                  <wp:docPr id="1" name="Picture 1"/>
+                  <wp:cNvGraphicFramePr>
+                    <a:graphicFrameLocks noChangeAspect="1"/>
+                  </wp:cNvGraphicFramePr>
+                  <a:graphic>
+                    <a:graphicData uri="http://schemas.openxmlformats.org/drawingml/2006/picture">
+                      <pic:pic>
+                        <pic:nvPicPr>
+                          <pic:cNvPr id="0" name="campus_security_sensitivity.png"/>
+                          <pic:cNvPicPr/>
+                        </pic:nvPicPr>
+                        <pic:blipFill>
+                          <a:blip r:embed="rId10"/>
+                          <a:stretch>
+                            <a:fillRect/>
+                          </a:stretch>
+                        </pic:blipFill>
+                        <pic:spPr>
+                          <a:xfrm>
+                            <a:off x="0" y="0"/>
+                            <a:ext cx="2951999" cy="1180800"/>
+                          </a:xfrm>
+                          <a:prstGeom prst="rect"/>
+                        </pic:spPr>
+                      </pic:pic>
+                    </a:graphicData>
+                  </a:graphic>
+                </wp:inline>
+              </w:drawing>
+            </w:r>
+          </w:p>
+          <w:p>
             <w:r>
               <w:rPr>
-                <w:b w:val="0"/>
-                <w:i/>
-                <w:color w:val="595959"/>
-                <w:sz w:val="15"/>
+                <w:sz w:val="13"/>
               </w:rPr>
-              <w:t>[ Sensitivity graph: P_payback / NCRI vs the uncertain input ]</w:t>
+              <w:t>Sensitivity of P_payback and NCRI (analytics/campus_security_economics.py, from the real trials).</w:t>
             </w:r>
           </w:p>
         </w:tc>
@@ -7706,15 +7982,47 @@
               <w:spacing w:after="0"/>
               <w:jc w:val="center"/>
             </w:pPr>
-            <w:r/>
+            <w:r>
+              <w:drawing>
+                <wp:inline xmlns:a="http://schemas.openxmlformats.org/drawingml/2006/main" xmlns:pic="http://schemas.openxmlformats.org/drawingml/2006/picture">
+                  <wp:extent cx="2951999" cy="1180800"/>
+                  <wp:docPr id="2" name="Picture 2"/>
+                  <wp:cNvGraphicFramePr>
+                    <a:graphicFrameLocks noChangeAspect="1"/>
+                  </wp:cNvGraphicFramePr>
+                  <a:graphic>
+                    <a:graphicData uri="http://schemas.openxmlformats.org/drawingml/2006/picture">
+                      <pic:pic>
+                        <pic:nvPicPr>
+                          <pic:cNvPr id="0" name="campus_security_queue.png"/>
+                          <pic:cNvPicPr/>
+                        </pic:nvPicPr>
+                        <pic:blipFill>
+                          <a:blip r:embed="rId11"/>
+                          <a:stretch>
+                            <a:fillRect/>
+                          </a:stretch>
+                        </pic:blipFill>
+                        <pic:spPr>
+                          <a:xfrm>
+                            <a:off x="0" y="0"/>
+                            <a:ext cx="2951999" cy="1180800"/>
+                          </a:xfrm>
+                          <a:prstGeom prst="rect"/>
+                        </pic:spPr>
+                      </pic:pic>
+                    </a:graphicData>
+                  </a:graphic>
+                </wp:inline>
+              </w:drawing>
+            </w:r>
+          </w:p>
+          <w:p>
             <w:r>
               <w:rPr>
-                <w:b w:val="0"/>
-                <w:i/>
-                <w:color w:val="595959"/>
-                <w:sz w:val="15"/>
+                <w:sz w:val="13"/>
               </w:rPr>
-              <w:t>[ Queuing graph: W_q vs utilisation ρ, or labour-reallocation chart ]</w:t>
+              <w:t>Queue waiting time against utilisation (analytics/campus_security_economics.py).</w:t>
             </w:r>
           </w:p>
         </w:tc>
@@ -8168,7 +8476,7 @@
                     <w:sz w:val="15"/>
                     <w:szCs w:val="15"/>
                   </w:rPr>
-                  <w:t xml:space="preserve">type here</w:t>
+                  <w:t xml:space="preserve">Guard on foot in the same scene (kinematic walker), speed U[1.272, 1.462] m/s (Bohannon 1997), pause 10.0 to 60.0 s (ASSUMPTION). Proposed: uav_sectors (primary) and uav_offset_ring. The primary metric cycle_time_s is window-independent.</w:t>
                 </w:r>
               </w:sdtContent>
             </w:sdt>
@@ -8227,7 +8535,7 @@
                     <w:sz w:val="15"/>
                     <w:szCs w:val="15"/>
                   </w:rPr>
-                  <w:t xml:space="preserve">type here</w:t>
+                  <w:t xml:space="preserve">N = 30 per cell in all 6 cells (2 scenes x 3 conditions = 180 runs); seeds 1 to 30 in every cell; timestep 0.002 s.</w:t>
                 </w:r>
               </w:sdtContent>
             </w:sdt>
@@ -8286,7 +8594,7 @@
                     <w:sz w:val="15"/>
                     <w:szCs w:val="15"/>
                   </w:rPr>
-                  <w:t xml:space="preserve">type here</w:t>
+                  <w:t xml:space="preserve">Per seed, same draw for all 3 conditions: wind U[0.0, 6.0] m/s (x0.08 indoors), gust sigma U[0.5, 2.0] m/s, intruder appears U[40.0, 160.0] s, dock jitter U[0.0, 0.3] m, guard speed U[1.272, 1.462] m/s.</w:t>
                 </w:r>
               </w:sdtContent>
             </w:sdt>
@@ -8345,7 +8653,7 @@
                     <w:sz w:val="15"/>
                     <w:szCs w:val="15"/>
                   </w:rPr>
-                  <w:t xml:space="preserve">type here</w:t>
+                  <w:t xml:space="preserve">500 Hz: one row per 0.002 s step per vehicle (position, velocity, reference, error, rotor forces, FSM state, attitude). Telemetry kept for 180 of 180 runs; vision 10.0 Hz.</w:t>
                 </w:r>
               </w:sdtContent>
             </w:sdt>
@@ -8408,7 +8716,7 @@
                     <w:sz w:val="15"/>
                     <w:szCs w:val="15"/>
                   </w:rPr>
-                  <w:t xml:space="preserve">Select ▾</w:t>
+                  <w:t xml:space="preserve">Yes</w:t>
                 </w:r>
               </w:sdtContent>
             </w:sdt>
@@ -8465,7 +8773,7 @@
                     <w:sz w:val="15"/>
                     <w:szCs w:val="15"/>
                   </w:rPr>
-                  <w:t xml:space="preserve">type here</w:t>
+                  <w:t xml:space="preserve">Group_05_Muaaz_Aditya_Zaid_Soumya/analytics/campus_patrol_real_trials.csv (180 rows) and its provenance.json (sha256 checked).</w:t>
                 </w:r>
               </w:sdtContent>
             </w:sdt>
@@ -8682,7 +8990,7 @@
                     <w:sz w:val="15"/>
                     <w:szCs w:val="15"/>
                   </w:rPr>
-                  <w:t xml:space="preserve">type here</w:t>
+                  <w:t xml:space="preserve">30 UAV runs per cell</w:t>
                 </w:r>
               </w:sdtContent>
             </w:sdt>
@@ -8714,7 +9022,7 @@
                     <w:sz w:val="15"/>
                     <w:szCs w:val="15"/>
                   </w:rPr>
-                  <w:t xml:space="preserve">type here</w:t>
+                  <w:t xml:space="preserve">not applicable (guard is a kinematic walker; no controller)</w:t>
                 </w:r>
               </w:sdtContent>
             </w:sdt>
@@ -8746,7 +9054,7 @@
                     <w:sz w:val="15"/>
                     <w:szCs w:val="15"/>
                   </w:rPr>
-                  <w:t xml:space="preserve">type here</w:t>
+                  <w:t xml:space="preserve">Cross-track: sectors interior 0.4972 ± 0.0712, exterior 0.2586 ± 0.0206; offset_ring interior 0.3579 ± 0.1646, exterior 0.9690 ± 0.2416.</w:t>
                 </w:r>
               </w:sdtContent>
             </w:sdt>
@@ -8778,7 +9086,7 @@
                     <w:sz w:val="15"/>
                     <w:szCs w:val="15"/>
                   </w:rPr>
-                  <w:t xml:space="preserve">type here</w:t>
+                  <w:t xml:space="preserve">m (cross-track deviation from the active route leg)</w:t>
                 </w:r>
               </w:sdtContent>
             </w:sdt>
@@ -8814,7 +9122,7 @@
                     <w:sz w:val="14"/>
                     <w:szCs w:val="14"/>
                   </w:rPr>
-                  <w:t xml:space="preserve">Select ▾</w:t>
+                  <w:t xml:space="preserve">Lower is better</w:t>
                 </w:r>
               </w:sdtContent>
             </w:sdt>
@@ -8872,7 +9180,7 @@
                     <w:sz w:val="15"/>
                     <w:szCs w:val="15"/>
                   </w:rPr>
-                  <w:t xml:space="preserve">type here</w:t>
+                  <w:t xml:space="preserve">30 UAV runs per cell</w:t>
                 </w:r>
               </w:sdtContent>
             </w:sdt>
@@ -8904,7 +9212,7 @@
                     <w:sz w:val="15"/>
                     <w:szCs w:val="15"/>
                   </w:rPr>
-                  <w:t xml:space="preserve">type here</w:t>
+                  <w:t xml:space="preserve">not applicable (no actuators on the guard model)</w:t>
                 </w:r>
               </w:sdtContent>
             </w:sdt>
@@ -8936,7 +9244,7 @@
                     <w:sz w:val="15"/>
                     <w:szCs w:val="15"/>
                   </w:rPr>
-                  <w:t xml:space="preserve">type here</w:t>
+                  <w:t xml:space="preserve">Thrust effort (sum F^2 dt): sectors interior 26742.7 ± 13.4, exterior 28080.5 ± 51.0; offset_ring interior 26731.6 ± 15.9, exterior 28242.2 ± 56.1.</w:t>
                 </w:r>
               </w:sdtContent>
             </w:sdt>
@@ -8968,7 +9276,7 @@
                     <w:sz w:val="15"/>
                     <w:szCs w:val="15"/>
                   </w:rPr>
-                  <w:t xml:space="preserve">type here</w:t>
+                  <w:t xml:space="preserve">N^2 s for thrust (sum over the rotors of F^2 dt; the airframe is driven by rotor forces); N^2 m^2 s for body torque (integral |tau|^2 dt)</w:t>
                 </w:r>
               </w:sdtContent>
             </w:sdt>
@@ -9004,7 +9312,7 @@
                     <w:sz w:val="14"/>
                     <w:szCs w:val="14"/>
                   </w:rPr>
-                  <w:t xml:space="preserve">Select ▾</w:t>
+                  <w:t xml:space="preserve">Lower is better</w:t>
                 </w:r>
               </w:sdtContent>
             </w:sdt>
@@ -9040,7 +9348,7 @@
                     <w:sz w:val="15"/>
                     <w:szCs w:val="15"/>
                   </w:rPr>
-                  <w:t xml:space="preserve">type here</w:t>
+                  <w:t xml:space="preserve">cycle_time_s: mean time per completed full ground lap (primary, window-independent)</w:t>
                 </w:r>
               </w:sdtContent>
             </w:sdt>
@@ -9071,7 +9379,7 @@
                     <w:sz w:val="15"/>
                     <w:szCs w:val="15"/>
                   </w:rPr>
-                  <w:t xml:space="preserve">type here</w:t>
+                  <w:t xml:space="preserve">30 per cell</w:t>
                 </w:r>
               </w:sdtContent>
             </w:sdt>
@@ -9102,7 +9410,7 @@
                     <w:sz w:val="15"/>
                     <w:szCs w:val="15"/>
                   </w:rPr>
-                  <w:t xml:space="preserve">type here</w:t>
+                  <w:t xml:space="preserve">guard_baseline cycle_time_s: interior 2460.46 ± 593.21 s; exterior 532.91 ± 141.64 s.</w:t>
                 </w:r>
               </w:sdtContent>
             </w:sdt>
@@ -9133,7 +9441,7 @@
                     <w:sz w:val="15"/>
                     <w:szCs w:val="15"/>
                   </w:rPr>
-                  <w:t xml:space="preserve">type here</w:t>
+                  <w:t xml:space="preserve">uav_sectors cycle_time_s: interior 57.41 ± 5.93 s; exterior 71.82 ± 8.22 s (offset_ring 37.97 ± 2.27 / 35.58 ± 6.36 s).</w:t>
                 </w:r>
               </w:sdtContent>
             </w:sdt>
@@ -9164,7 +9472,7 @@
                     <w:sz w:val="15"/>
                     <w:szCs w:val="15"/>
                   </w:rPr>
-                  <w:t xml:space="preserve">type here</w:t>
+                  <w:t xml:space="preserve">s</w:t>
                 </w:r>
               </w:sdtContent>
             </w:sdt>
@@ -9199,7 +9507,7 @@
                     <w:sz w:val="14"/>
                     <w:szCs w:val="14"/>
                   </w:rPr>
-                  <w:t xml:space="preserve">Select ▾</w:t>
+                  <w:t xml:space="preserve">Lower is better</w:t>
                 </w:r>
               </w:sdtContent>
             </w:sdt>
@@ -9282,7 +9590,7 @@
                     <w:sz w:val="15"/>
                     <w:szCs w:val="15"/>
                   </w:rPr>
-                  <w:t xml:space="preserve">Select ▾</w:t>
+                  <w:t xml:space="preserve">Welch's t-test</w:t>
                 </w:r>
               </w:sdtContent>
             </w:sdt>
@@ -9341,7 +9649,7 @@
                     <w:sz w:val="15"/>
                     <w:szCs w:val="15"/>
                   </w:rPr>
-                  <w:t xml:space="preserve">type here</w:t>
+                  <w:t xml:space="preserve">Welch, guard vs uav_sectors: interior t = 22.1870, df = 29.006, p = 9.62908e-20; exterior t = 17.8000, df = 29.196, p = 3.22330e-17.</w:t>
                 </w:r>
               </w:sdtContent>
             </w:sdt>
@@ -9400,7 +9708,7 @@
                     <w:sz w:val="15"/>
                     <w:szCs w:val="15"/>
                   </w:rPr>
-                  <w:t xml:space="preserve">type here</w:t>
+                  <w:t xml:space="preserve">guard vs uav_sectors: interior d = 5.7286, exterior d = 4.5959 (pooled SD). Secondary: interior 4.3299, exterior 4.9292.</w:t>
                 </w:r>
               </w:sdtContent>
             </w:sdt>
@@ -9457,7 +9765,7 @@
                     <w:sz w:val="15"/>
                     <w:szCs w:val="15"/>
                   </w:rPr>
-                  <w:t xml:space="preserve">type here</w:t>
+                  <w:t xml:space="preserve">guard - uav_sectors: interior [2181.5396, 2624.5707] s; exterior [408.1221, 514.0494] s.</w:t>
                 </w:r>
               </w:sdtContent>
             </w:sdt>
@@ -9484,7 +9792,7 @@
       </w:tblGrid>
       <w:tr>
         <w:trPr>
-          <w:trHeight w:val="2608" w:hRule="exact"/>
+          <w:trHeight w:val="2608" w:hRule="atLeast"/>
           <w:cantSplit/>
         </w:trPr>
         <w:tc>
@@ -9497,15 +9805,91 @@
               <w:spacing w:after="0"/>
               <w:jc w:val="center"/>
             </w:pPr>
-            <w:r/>
+            <w:r>
+              <w:drawing>
+                <wp:inline xmlns:a="http://schemas.openxmlformats.org/drawingml/2006/main" xmlns:pic="http://schemas.openxmlformats.org/drawingml/2006/picture">
+                  <wp:extent cx="2951999" cy="1810559"/>
+                  <wp:docPr id="3" name="Picture 3"/>
+                  <wp:cNvGraphicFramePr>
+                    <a:graphicFrameLocks noChangeAspect="1"/>
+                  </wp:cNvGraphicFramePr>
+                  <a:graphic>
+                    <a:graphicData uri="http://schemas.openxmlformats.org/drawingml/2006/picture">
+                      <pic:pic>
+                        <pic:nvPicPr>
+                          <pic:cNvPr id="0" name="trajectory_interior.png"/>
+                          <pic:cNvPicPr/>
+                        </pic:nvPicPr>
+                        <pic:blipFill>
+                          <a:blip r:embed="rId12"/>
+                          <a:stretch>
+                            <a:fillRect/>
+                          </a:stretch>
+                        </pic:blipFill>
+                        <pic:spPr>
+                          <a:xfrm>
+                            <a:off x="0" y="0"/>
+                            <a:ext cx="2951999" cy="1810559"/>
+                          </a:xfrm>
+                          <a:prstGeom prst="rect"/>
+                        </pic:spPr>
+                      </pic:pic>
+                    </a:graphicData>
+                  </a:graphic>
+                </wp:inline>
+              </w:drawing>
+            </w:r>
+          </w:p>
+          <w:p>
             <w:r>
               <w:rPr>
-                <w:b w:val="0"/>
-                <w:i/>
-                <w:color w:val="595959"/>
-                <w:sz w:val="15"/>
+                <w:sz w:val="13"/>
               </w:rPr>
-              <w:t>[ Trajectory plot: reference vs actual, one representative run ]</w:t>
+              <w:t>Interior: one representative run per condition (rule stated on the figure), from analytics/runs telemetry.</w:t>
+            </w:r>
+          </w:p>
+          <w:p>
+            <w:r>
+              <w:drawing>
+                <wp:inline xmlns:a="http://schemas.openxmlformats.org/drawingml/2006/main" xmlns:pic="http://schemas.openxmlformats.org/drawingml/2006/picture">
+                  <wp:extent cx="2951999" cy="1810559"/>
+                  <wp:docPr id="4" name="Picture 4"/>
+                  <wp:cNvGraphicFramePr>
+                    <a:graphicFrameLocks noChangeAspect="1"/>
+                  </wp:cNvGraphicFramePr>
+                  <a:graphic>
+                    <a:graphicData uri="http://schemas.openxmlformats.org/drawingml/2006/picture">
+                      <pic:pic>
+                        <pic:nvPicPr>
+                          <pic:cNvPr id="0" name="trajectory_exterior.png"/>
+                          <pic:cNvPicPr/>
+                        </pic:nvPicPr>
+                        <pic:blipFill>
+                          <a:blip r:embed="rId13"/>
+                          <a:stretch>
+                            <a:fillRect/>
+                          </a:stretch>
+                        </pic:blipFill>
+                        <pic:spPr>
+                          <a:xfrm>
+                            <a:off x="0" y="0"/>
+                            <a:ext cx="2951999" cy="1810559"/>
+                          </a:xfrm>
+                          <a:prstGeom prst="rect"/>
+                        </pic:spPr>
+                      </pic:pic>
+                    </a:graphicData>
+                  </a:graphic>
+                </wp:inline>
+              </w:drawing>
+            </w:r>
+          </w:p>
+          <w:p>
+            <w:r>
+              <w:rPr>
+                <w:sz w:val="13"/>
+              </w:rPr>
+              <w:t>Exterior: same rule.</w:t>
             </w:r>
           </w:p>
         </w:tc>
@@ -9519,15 +9903,91 @@
               <w:spacing w:after="0"/>
               <w:jc w:val="center"/>
             </w:pPr>
-            <w:r/>
+            <w:r>
+              <w:drawing>
+                <wp:inline xmlns:a="http://schemas.openxmlformats.org/drawingml/2006/main" xmlns:pic="http://schemas.openxmlformats.org/drawingml/2006/picture">
+                  <wp:extent cx="2951999" cy="1317046"/>
+                  <wp:docPr id="5" name="Picture 5"/>
+                  <wp:cNvGraphicFramePr>
+                    <a:graphicFrameLocks noChangeAspect="1"/>
+                  </wp:cNvGraphicFramePr>
+                  <a:graphic>
+                    <a:graphicData uri="http://schemas.openxmlformats.org/drawingml/2006/picture">
+                      <pic:pic>
+                        <pic:nvPicPr>
+                          <pic:cNvPr id="0" name="revisit_boxplot_interior.png"/>
+                          <pic:cNvPicPr/>
+                        </pic:nvPicPr>
+                        <pic:blipFill>
+                          <a:blip r:embed="rId14"/>
+                          <a:stretch>
+                            <a:fillRect/>
+                          </a:stretch>
+                        </pic:blipFill>
+                        <pic:spPr>
+                          <a:xfrm>
+                            <a:off x="0" y="0"/>
+                            <a:ext cx="2951999" cy="1317046"/>
+                          </a:xfrm>
+                          <a:prstGeom prst="rect"/>
+                        </pic:spPr>
+                      </pic:pic>
+                    </a:graphicData>
+                  </a:graphic>
+                </wp:inline>
+              </w:drawing>
+            </w:r>
+          </w:p>
+          <w:p>
             <w:r>
               <w:rPr>
-                <w:b w:val="0"/>
-                <w:i/>
-                <w:color w:val="595959"/>
-                <w:sz w:val="15"/>
+                <w:sz w:val="13"/>
               </w:rPr>
-              <w:t>[ Box-plot of the primary metric: baseline vs proposed, N runs each ]</w:t>
+              <w:t>Interior: cycle time per lap (primary) and equal-window worst revisit, N = 30 per condition.</w:t>
+            </w:r>
+          </w:p>
+          <w:p>
+            <w:r>
+              <w:drawing>
+                <wp:inline xmlns:a="http://schemas.openxmlformats.org/drawingml/2006/main" xmlns:pic="http://schemas.openxmlformats.org/drawingml/2006/picture">
+                  <wp:extent cx="2951999" cy="1317046"/>
+                  <wp:docPr id="6" name="Picture 6"/>
+                  <wp:cNvGraphicFramePr>
+                    <a:graphicFrameLocks noChangeAspect="1"/>
+                  </wp:cNvGraphicFramePr>
+                  <a:graphic>
+                    <a:graphicData uri="http://schemas.openxmlformats.org/drawingml/2006/picture">
+                      <pic:pic>
+                        <pic:nvPicPr>
+                          <pic:cNvPr id="0" name="revisit_boxplot_exterior.png"/>
+                          <pic:cNvPicPr/>
+                        </pic:nvPicPr>
+                        <pic:blipFill>
+                          <a:blip r:embed="rId15"/>
+                          <a:stretch>
+                            <a:fillRect/>
+                          </a:stretch>
+                        </pic:blipFill>
+                        <pic:spPr>
+                          <a:xfrm>
+                            <a:off x="0" y="0"/>
+                            <a:ext cx="2951999" cy="1317046"/>
+                          </a:xfrm>
+                          <a:prstGeom prst="rect"/>
+                        </pic:spPr>
+                      </pic:pic>
+                    </a:graphicData>
+                  </a:graphic>
+                </wp:inline>
+              </w:drawing>
+            </w:r>
+          </w:p>
+          <w:p>
+            <w:r>
+              <w:rPr>
+                <w:sz w:val="13"/>
+              </w:rPr>
+              <w:t>Exterior: same two metrics, N = 30 per condition.</w:t>
             </w:r>
           </w:p>
         </w:tc>
@@ -9621,7 +10081,7 @@
                     <w:sz w:val="15"/>
                     <w:szCs w:val="15"/>
                   </w:rPr>
-                  <w:t xml:space="preserve">Select ▾</w:t>
+                  <w:t xml:space="preserve">Yes</w:t>
                 </w:r>
               </w:sdtContent>
             </w:sdt>
@@ -9684,7 +10144,7 @@
                     <w:sz w:val="15"/>
                     <w:szCs w:val="15"/>
                   </w:rPr>
-                  <w:t xml:space="preserve">Select ▾</w:t>
+                  <w:t xml:space="preserve">Yes</w:t>
                 </w:r>
               </w:sdtContent>
             </w:sdt>
@@ -9747,7 +10207,7 @@
                     <w:sz w:val="15"/>
                     <w:szCs w:val="15"/>
                   </w:rPr>
-                  <w:t xml:space="preserve">Select ▾</w:t>
+                  <w:t xml:space="preserve">Yes</w:t>
                 </w:r>
               </w:sdtContent>
             </w:sdt>
@@ -9808,7 +10268,7 @@
                     <w:sz w:val="15"/>
                     <w:szCs w:val="15"/>
                   </w:rPr>
-                  <w:t xml:space="preserve">Select ▾</w:t>
+                  <w:t xml:space="preserve">Yes</w:t>
                 </w:r>
               </w:sdtContent>
             </w:sdt>
@@ -9912,7 +10372,7 @@
                     <w:sz w:val="15"/>
                     <w:szCs w:val="15"/>
                   </w:rPr>
-                  <w:t xml:space="preserve">type here</w:t>
+                  <w:t xml:space="preserve">https://lnkd.in/p/ddww8s-J</w:t>
                 </w:r>
               </w:sdtContent>
             </w:sdt>
@@ -9971,7 +10431,7 @@
                     <w:sz w:val="15"/>
                     <w:szCs w:val="15"/>
                   </w:rPr>
-                  <w:t xml:space="preserve">type here</w:t>
+                  <w:t xml:space="preserve">3:17</w:t>
                 </w:r>
               </w:sdtContent>
             </w:sdt>
@@ -10034,7 +10494,7 @@
                     <w:sz w:val="15"/>
                     <w:szCs w:val="15"/>
                   </w:rPr>
-                  <w:t xml:space="preserve">Select ▾</w:t>
+                  <w:t xml:space="preserve">Yes</w:t>
                 </w:r>
               </w:sdtContent>
             </w:sdt>
@@ -10097,7 +10557,7 @@
                     <w:sz w:val="15"/>
                     <w:szCs w:val="15"/>
                   </w:rPr>
-                  <w:t xml:space="preserve">Select ▾</w:t>
+                  <w:t xml:space="preserve">Yes</w:t>
                 </w:r>
               </w:sdtContent>
             </w:sdt>
@@ -10158,7 +10618,7 @@
                     <w:sz w:val="15"/>
                     <w:szCs w:val="15"/>
                   </w:rPr>
-                  <w:t xml:space="preserve">Select ▾</w:t>
+                  <w:t xml:space="preserve">Yes</w:t>
                 </w:r>
               </w:sdtContent>
             </w:sdt>
@@ -10438,7 +10898,7 @@
                     <w:sz w:val="14"/>
                     <w:szCs w:val="14"/>
                   </w:rPr>
-                  <w:t xml:space="preserve">Select ▾</w:t>
+                  <w:t xml:space="preserve">Claude</w:t>
                 </w:r>
               </w:sdtContent>
             </w:sdt>
@@ -10470,7 +10930,7 @@
                     <w:sz w:val="14"/>
                     <w:szCs w:val="14"/>
                   </w:rPr>
-                  <w:t xml:space="preserve">type here</w:t>
+                  <w:t xml:space="preserve">Group AI use: code, tests and documents were first drafted by Claude (Anthropic); we ran, tested and corrected them. Case: the region-ownership gate (src/check_region_ownership.py) matched nothing.</w:t>
                 </w:r>
               </w:sdtContent>
             </w:sdt>
@@ -10511,7 +10971,7 @@
                     <w:sz w:val="14"/>
                     <w:szCs w:val="14"/>
                   </w:rPr>
-                  <w:t xml:space="preserve">Select ▾</w:t>
+                  <w:t xml:space="preserve">Ran / tested the code or simulation</w:t>
                 </w:r>
               </w:sdtContent>
             </w:sdt>
@@ -10543,7 +11003,7 @@
                     <w:sz w:val="14"/>
                     <w:szCs w:val="14"/>
                   </w:rPr>
-                  <w:t xml:space="preserve">type here</w:t>
+                  <w:t xml:space="preserve">git reports repository-root paths while the ownership globs assumed group-folder paths, so no region ever matched and every change was attributed to E043. Fixed in commit 40a811f.</w:t>
                 </w:r>
               </w:sdtContent>
             </w:sdt>
@@ -10585,7 +11045,7 @@
                     <w:sz w:val="14"/>
                     <w:szCs w:val="14"/>
                   </w:rPr>
-                  <w:t xml:space="preserve">Select ▾</w:t>
+                  <w:t xml:space="preserve">Wrong code / MuJoCo API</w:t>
                 </w:r>
               </w:sdtContent>
             </w:sdt>
@@ -10622,7 +11082,7 @@
                     <w:sz w:val="14"/>
                     <w:szCs w:val="14"/>
                   </w:rPr>
-                  <w:t xml:space="preserve">Select ▾</w:t>
+                  <w:t xml:space="preserve">Corrected</w:t>
                 </w:r>
               </w:sdtContent>
             </w:sdt>
@@ -10690,7 +11150,7 @@
                     <w:sz w:val="14"/>
                     <w:szCs w:val="14"/>
                   </w:rPr>
-                  <w:t xml:space="preserve">Select ▾</w:t>
+                  <w:t xml:space="preserve">Claude</w:t>
                 </w:r>
               </w:sdtContent>
             </w:sdt>
@@ -10722,7 +11182,7 @@
                     <w:sz w:val="14"/>
                     <w:szCs w:val="14"/>
                   </w:rPr>
-                  <w:t xml:space="preserve">type here</w:t>
+                  <w:t xml:space="preserve">The compute_apf_separation docstring claimed APF alone would "guarantee minimum separation distance d &gt;= 2.5 m".</w:t>
                 </w:r>
               </w:sdtContent>
             </w:sdt>
@@ -10763,7 +11223,7 @@
                     <w:sz w:val="14"/>
                     <w:szCs w:val="14"/>
                   </w:rPr>
-                  <w:t xml:space="preserve">Select ▾</w:t>
+                  <w:t xml:space="preserve">Ran / tested the code or simulation</w:t>
                 </w:r>
               </w:sdtContent>
             </w:sdt>
@@ -10795,7 +11255,7 @@
                     <w:sz w:val="14"/>
                     <w:szCs w:val="14"/>
                   </w:rPr>
-                  <w:t xml:space="preserve">type here</w:t>
+                  <w:t xml:space="preserve">False: head-on at 6 m/s each, APF alone came to 0.43 m (contact); the layered version held 7.12 m. Proof: tests/test_e043_separation.py.</w:t>
                 </w:r>
               </w:sdtContent>
             </w:sdt>
@@ -10837,7 +11297,7 @@
                     <w:sz w:val="14"/>
                     <w:szCs w:val="14"/>
                   </w:rPr>
-                  <w:t xml:space="preserve">Select ▾</w:t>
+                  <w:t xml:space="preserve">Wrong physics / equation</w:t>
                 </w:r>
               </w:sdtContent>
             </w:sdt>
@@ -10874,7 +11334,7 @@
                     <w:sz w:val="14"/>
                     <w:szCs w:val="14"/>
                   </w:rPr>
-                  <w:t xml:space="preserve">Select ▾</w:t>
+                  <w:t xml:space="preserve">Corrected</w:t>
                 </w:r>
               </w:sdtContent>
             </w:sdt>
@@ -10940,7 +11400,7 @@
                     <w:sz w:val="14"/>
                     <w:szCs w:val="14"/>
                   </w:rPr>
-                  <w:t xml:space="preserve">Select ▾</w:t>
+                  <w:t xml:space="preserve">Claude</w:t>
                 </w:r>
               </w:sdtContent>
             </w:sdt>
@@ -10971,7 +11431,7 @@
                     <w:sz w:val="14"/>
                     <w:szCs w:val="14"/>
                   </w:rPr>
-                  <w:t xml:space="preserve">type here</w:t>
+                  <w:t xml:space="preserve">The contact-parameter note said solref 0.004 s equals 2 x the 0.002 s timestep, so the leg contact is used as written, and that at the earlier 0.004 s timestep MuJoCo "silently clamped it".</w:t>
                 </w:r>
               </w:sdtContent>
             </w:sdt>
@@ -11011,7 +11471,7 @@
                     <w:sz w:val="14"/>
                     <w:szCs w:val="14"/>
                   </w:rPr>
-                  <w:t xml:space="preserve">Select ▾</w:t>
+                  <w:t xml:space="preserve">Ran / tested the code or simulation</w:t>
                 </w:r>
               </w:sdtContent>
             </w:sdt>
@@ -11042,7 +11502,7 @@
                     <w:sz w:val="14"/>
                     <w:szCs w:val="14"/>
                   </w:rPr>
-                  <w:t xml:space="preserve">type here</w:t>
+                  <w:t xml:space="preserve">Wrong number: MuJoCo mixes the leg's 0.004 with the surface's 0.02, giving 0.012 s, which is above 2 x timestep at both 0.002 s and 0.004 s, so no clamp acted. Proof: viva_contact_solref_mix.txt.</w:t>
                 </w:r>
               </w:sdtContent>
             </w:sdt>
@@ -11083,7 +11543,7 @@
                     <w:sz w:val="14"/>
                     <w:szCs w:val="14"/>
                   </w:rPr>
-                  <w:t xml:space="preserve">Select ▾</w:t>
+                  <w:t xml:space="preserve">Wrong code / MuJoCo API</w:t>
                 </w:r>
               </w:sdtContent>
             </w:sdt>
@@ -11119,7 +11579,7 @@
                     <w:sz w:val="14"/>
                     <w:szCs w:val="14"/>
                   </w:rPr>
-                  <w:t xml:space="preserve">Select ▾</w:t>
+                  <w:t xml:space="preserve">Corrected</w:t>
                 </w:r>
               </w:sdtContent>
             </w:sdt>
@@ -11403,7 +11863,7 @@
                     <w:sz w:val="14"/>
                     <w:szCs w:val="14"/>
                   </w:rPr>
-                  <w:t xml:space="preserve">Select ▾</w:t>
+                  <w:t xml:space="preserve">2</w:t>
                 </w:r>
               </w:sdtContent>
             </w:sdt>
@@ -11440,7 +11900,7 @@
                     <w:sz w:val="14"/>
                     <w:szCs w:val="14"/>
                   </w:rPr>
-                  <w:t xml:space="preserve">Select ▾</w:t>
+                  <w:t xml:space="preserve">2</w:t>
                 </w:r>
               </w:sdtContent>
             </w:sdt>
@@ -11477,7 +11937,7 @@
                     <w:sz w:val="14"/>
                     <w:szCs w:val="14"/>
                   </w:rPr>
-                  <w:t xml:space="preserve">Select ▾</w:t>
+                  <w:t xml:space="preserve">2</w:t>
                 </w:r>
               </w:sdtContent>
             </w:sdt>
@@ -11514,7 +11974,7 @@
                     <w:sz w:val="14"/>
                     <w:szCs w:val="14"/>
                   </w:rPr>
-                  <w:t xml:space="preserve">Select ▾</w:t>
+                  <w:t xml:space="preserve">2</w:t>
                 </w:r>
               </w:sdtContent>
             </w:sdt>
@@ -11551,7 +12011,7 @@
                     <w:sz w:val="14"/>
                     <w:szCs w:val="14"/>
                   </w:rPr>
-                  <w:t xml:space="preserve">Select ▾</w:t>
+                  <w:t xml:space="preserve">2</w:t>
                 </w:r>
               </w:sdtContent>
             </w:sdt>
@@ -11583,7 +12043,7 @@
                     <w:sz w:val="14"/>
                     <w:szCs w:val="14"/>
                   </w:rPr>
-                  <w:t xml:space="preserve">type here</w:t>
+                  <w:t xml:space="preserve">0:05</w:t>
                 </w:r>
               </w:sdtContent>
             </w:sdt>
@@ -11615,7 +12075,7 @@
                     <w:sz w:val="14"/>
                     <w:szCs w:val="14"/>
                   </w:rPr>
-                  <w:t xml:space="preserve">type here</w:t>
+                  <w:t xml:space="preserve">How does the crawler keep traction on a wet, tilted panel, and how much slip did you measure in the simulation?</w:t>
                 </w:r>
               </w:sdtContent>
             </w:sdt>
@@ -11677,7 +12137,7 @@
                     <w:sz w:val="14"/>
                     <w:szCs w:val="14"/>
                   </w:rPr>
-                  <w:t xml:space="preserve">Select ▾</w:t>
+                  <w:t xml:space="preserve">2</w:t>
                 </w:r>
               </w:sdtContent>
             </w:sdt>
@@ -11713,7 +12173,7 @@
                     <w:sz w:val="14"/>
                     <w:szCs w:val="14"/>
                   </w:rPr>
-                  <w:t xml:space="preserve">Select ▾</w:t>
+                  <w:t xml:space="preserve">2</w:t>
                 </w:r>
               </w:sdtContent>
             </w:sdt>
@@ -11749,7 +12209,7 @@
                     <w:sz w:val="14"/>
                     <w:szCs w:val="14"/>
                   </w:rPr>
-                  <w:t xml:space="preserve">Select ▾</w:t>
+                  <w:t xml:space="preserve">2</w:t>
                 </w:r>
               </w:sdtContent>
             </w:sdt>
@@ -11785,7 +12245,7 @@
                     <w:sz w:val="14"/>
                     <w:szCs w:val="14"/>
                   </w:rPr>
-                  <w:t xml:space="preserve">Select ▾</w:t>
+                  <w:t xml:space="preserve">2</w:t>
                 </w:r>
               </w:sdtContent>
             </w:sdt>
@@ -11821,7 +12281,7 @@
                     <w:sz w:val="14"/>
                     <w:szCs w:val="14"/>
                   </w:rPr>
-                  <w:t xml:space="preserve">Select ▾</w:t>
+                  <w:t xml:space="preserve">2</w:t>
                 </w:r>
               </w:sdtContent>
             </w:sdt>
@@ -11852,7 +12312,7 @@
                     <w:sz w:val="14"/>
                     <w:szCs w:val="14"/>
                   </w:rPr>
-                  <w:t xml:space="preserve">type here</w:t>
+                  <w:t xml:space="preserve">0:30</w:t>
                 </w:r>
               </w:sdtContent>
             </w:sdt>
@@ -11883,7 +12343,7 @@
                     <w:sz w:val="14"/>
                     <w:szCs w:val="14"/>
                   </w:rPr>
-                  <w:t xml:space="preserve">type here</w:t>
+                  <w:t xml:space="preserve">What false-positive rate does your defect detector show on clean panels, and how did you measure it?</w:t>
                 </w:r>
               </w:sdtContent>
             </w:sdt>
@@ -12189,7 +12649,7 @@
                     <w:sz w:val="14"/>
                     <w:szCs w:val="14"/>
                   </w:rPr>
-                  <w:t xml:space="preserve">type here</w:t>
+                  <w:t xml:space="preserve">35</w:t>
                 </w:r>
               </w:sdtContent>
             </w:sdt>
@@ -12228,7 +12688,7 @@
                     <w:sz w:val="14"/>
                     <w:szCs w:val="14"/>
                   </w:rPr>
-                  <w:t xml:space="preserve">Select ▾</w:t>
+                  <w:t xml:space="preserve">5</w:t>
                 </w:r>
               </w:sdtContent>
             </w:sdt>
@@ -12264,7 +12724,7 @@
                     <w:sz w:val="14"/>
                     <w:szCs w:val="14"/>
                   </w:rPr>
-                  <w:t xml:space="preserve">Select ▾</w:t>
+                  <w:t xml:space="preserve">Yes</w:t>
                 </w:r>
               </w:sdtContent>
             </w:sdt>
@@ -12296,7 +12756,7 @@
                     <w:sz w:val="14"/>
                     <w:szCs w:val="14"/>
                   </w:rPr>
-                  <w:t xml:space="preserve">type here</w:t>
+                  <w:t xml:space="preserve">aerial_patrol_swarm.py (flight, separation, FSM), foot_patrol_baseline.py, run_benchmark.py, scene generators, test_e043_*</w:t>
                 </w:r>
               </w:sdtContent>
             </w:sdt>
@@ -12328,7 +12788,7 @@
                     <w:sz w:val="14"/>
                     <w:szCs w:val="14"/>
                   </w:rPr>
-                  <w:t xml:space="preserve">type here</w:t>
+                  <w:t xml:space="preserve">116 of 116 (the merged tree was pushed from E043's account)</w:t>
                 </w:r>
               </w:sdtContent>
             </w:sdt>
@@ -12366,7 +12826,7 @@
                     <w:sz w:val="14"/>
                     <w:szCs w:val="14"/>
                   </w:rPr>
-                  <w:t xml:space="preserve">Select ▾</w:t>
+                  <w:t xml:space="preserve">76–100 %</w:t>
                 </w:r>
               </w:sdtContent>
             </w:sdt>
@@ -12404,7 +12864,7 @@
                     <w:sz w:val="14"/>
                     <w:szCs w:val="14"/>
                   </w:rPr>
-                  <w:t xml:space="preserve">Select ▾</w:t>
+                  <w:t xml:space="preserve">3–5</w:t>
                 </w:r>
               </w:sdtContent>
             </w:sdt>
@@ -12463,7 +12923,7 @@
                     <w:sz w:val="14"/>
                     <w:szCs w:val="14"/>
                   </w:rPr>
-                  <w:t xml:space="preserve">type here</w:t>
+                  <w:t xml:space="preserve">35</w:t>
                 </w:r>
               </w:sdtContent>
             </w:sdt>
@@ -12502,7 +12962,7 @@
                     <w:sz w:val="14"/>
                     <w:szCs w:val="14"/>
                   </w:rPr>
-                  <w:t xml:space="preserve">Select ▾</w:t>
+                  <w:t xml:space="preserve">5</w:t>
                 </w:r>
               </w:sdtContent>
             </w:sdt>
@@ -12538,7 +12998,7 @@
                     <w:sz w:val="14"/>
                     <w:szCs w:val="14"/>
                   </w:rPr>
-                  <w:t xml:space="preserve">Select ▾</w:t>
+                  <w:t xml:space="preserve">Yes</w:t>
                 </w:r>
               </w:sdtContent>
             </w:sdt>
@@ -12570,7 +13030,7 @@
                     <w:sz w:val="14"/>
                     <w:szCs w:val="14"/>
                   </w:rPr>
-                  <w:t xml:space="preserve">type here</w:t>
+                  <w:t xml:space="preserve">aerial_patrol_swarm.py E051 region, vision_illumination_benchmark.py, test_e051_vision.py</w:t>
                 </w:r>
               </w:sdtContent>
             </w:sdt>
@@ -12602,7 +13062,7 @@
                     <w:sz w:val="14"/>
                     <w:szCs w:val="14"/>
                   </w:rPr>
-                  <w:t xml:space="preserve">type here</w:t>
+                  <w:t xml:space="preserve">0 own commits; I worked on my code area (Section 2.2), merged through E043's account</w:t>
                 </w:r>
               </w:sdtContent>
             </w:sdt>
@@ -12640,7 +13100,7 @@
                     <w:sz w:val="14"/>
                     <w:szCs w:val="14"/>
                   </w:rPr>
-                  <w:t xml:space="preserve">Select ▾</w:t>
+                  <w:t xml:space="preserve">76–100 %</w:t>
                 </w:r>
               </w:sdtContent>
             </w:sdt>
@@ -12678,7 +13138,7 @@
                     <w:sz w:val="14"/>
                     <w:szCs w:val="14"/>
                   </w:rPr>
-                  <w:t xml:space="preserve">Select ▾</w:t>
+                  <w:t xml:space="preserve">1–2</w:t>
                 </w:r>
               </w:sdtContent>
             </w:sdt>
@@ -12737,7 +13197,7 @@
                     <w:sz w:val="14"/>
                     <w:szCs w:val="14"/>
                   </w:rPr>
-                  <w:t xml:space="preserve">type here</w:t>
+                  <w:t xml:space="preserve">35</w:t>
                 </w:r>
               </w:sdtContent>
             </w:sdt>
@@ -12776,7 +13236,7 @@
                     <w:sz w:val="14"/>
                     <w:szCs w:val="14"/>
                   </w:rPr>
-                  <w:t xml:space="preserve">Select ▾</w:t>
+                  <w:t xml:space="preserve">5</w:t>
                 </w:r>
               </w:sdtContent>
             </w:sdt>
@@ -12812,7 +13272,7 @@
                     <w:sz w:val="14"/>
                     <w:szCs w:val="14"/>
                   </w:rPr>
-                  <w:t xml:space="preserve">Select ▾</w:t>
+                  <w:t xml:space="preserve">Yes</w:t>
                 </w:r>
               </w:sdtContent>
             </w:sdt>
@@ -12844,7 +13304,7 @@
                     <w:sz w:val="14"/>
                     <w:szCs w:val="14"/>
                   </w:rPr>
-                  <w:t xml:space="preserve">type here</w:t>
+                  <w:t xml:space="preserve">aerial_patrol_swarm.py E075 region, statistical_validation.py, geofence_noise_demo.py, test_e075_geofence_stats.py</w:t>
                 </w:r>
               </w:sdtContent>
             </w:sdt>
@@ -12876,7 +13336,7 @@
                     <w:sz w:val="14"/>
                     <w:szCs w:val="14"/>
                   </w:rPr>
-                  <w:t xml:space="preserve">type here</w:t>
+                  <w:t xml:space="preserve">0 own commits; I worked on my code area (Section 2.2), merged through E043's account</w:t>
                 </w:r>
               </w:sdtContent>
             </w:sdt>
@@ -12914,7 +13374,7 @@
                     <w:sz w:val="14"/>
                     <w:szCs w:val="14"/>
                   </w:rPr>
-                  <w:t xml:space="preserve">Select ▾</w:t>
+                  <w:t xml:space="preserve">76–100 %</w:t>
                 </w:r>
               </w:sdtContent>
             </w:sdt>
@@ -12952,7 +13412,7 @@
                     <w:sz w:val="14"/>
                     <w:szCs w:val="14"/>
                   </w:rPr>
-                  <w:t xml:space="preserve">Select ▾</w:t>
+                  <w:t xml:space="preserve">1–2</w:t>
                 </w:r>
               </w:sdtContent>
             </w:sdt>
@@ -13009,7 +13469,7 @@
                     <w:sz w:val="14"/>
                     <w:szCs w:val="14"/>
                   </w:rPr>
-                  <w:t xml:space="preserve">type here</w:t>
+                  <w:t xml:space="preserve">35</w:t>
                 </w:r>
               </w:sdtContent>
             </w:sdt>
@@ -13047,7 +13507,7 @@
                     <w:sz w:val="14"/>
                     <w:szCs w:val="14"/>
                   </w:rPr>
-                  <w:t xml:space="preserve">Select ▾</w:t>
+                  <w:t xml:space="preserve">5</w:t>
                 </w:r>
               </w:sdtContent>
             </w:sdt>
@@ -13082,7 +13542,7 @@
                     <w:sz w:val="14"/>
                     <w:szCs w:val="14"/>
                   </w:rPr>
-                  <w:t xml:space="preserve">Select ▾</w:t>
+                  <w:t xml:space="preserve">Yes</w:t>
                 </w:r>
               </w:sdtContent>
             </w:sdt>
@@ -13113,7 +13573,7 @@
                     <w:sz w:val="14"/>
                     <w:szCs w:val="14"/>
                   </w:rPr>
-                  <w:t xml:space="preserve">type here</w:t>
+                  <w:t xml:space="preserve">campus_security_economics.py, campus_security_fmea.py, test_e077_economics.py</w:t>
                 </w:r>
               </w:sdtContent>
             </w:sdt>
@@ -13144,7 +13604,7 @@
                     <w:sz w:val="14"/>
                     <w:szCs w:val="14"/>
                   </w:rPr>
-                  <w:t xml:space="preserve">type here</w:t>
+                  <w:t xml:space="preserve">18 own commits (e077 branches, PRs #1 to #5)</w:t>
                 </w:r>
               </w:sdtContent>
             </w:sdt>
@@ -13181,7 +13641,7 @@
                     <w:sz w:val="14"/>
                     <w:szCs w:val="14"/>
                   </w:rPr>
-                  <w:t xml:space="preserve">Select ▾</w:t>
+                  <w:t xml:space="preserve">76–100 %</w:t>
                 </w:r>
               </w:sdtContent>
             </w:sdt>
@@ -13218,7 +13678,7 @@
                     <w:sz w:val="14"/>
                     <w:szCs w:val="14"/>
                   </w:rPr>
-                  <w:t xml:space="preserve">Select ▾</w:t>
+                  <w:t xml:space="preserve">1–2</w:t>
                 </w:r>
               </w:sdtContent>
             </w:sdt>
@@ -13394,7 +13854,7 @@
                     <w:sz w:val="14"/>
                     <w:szCs w:val="14"/>
                   </w:rPr>
-                  <w:t xml:space="preserve">Select ▾</w:t>
+                  <w:t xml:space="preserve">No</w:t>
                 </w:r>
               </w:sdtContent>
             </w:sdt>
@@ -13426,7 +13886,7 @@
                     <w:sz w:val="14"/>
                     <w:szCs w:val="14"/>
                   </w:rPr>
-                  <w:t xml:space="preserve">type here</w:t>
+                  <w:t xml:space="preserve">A result only counts once a test can break it: the head-on test showed APF alone fails, which led to the layered separation.</w:t>
                 </w:r>
               </w:sdtContent>
             </w:sdt>
@@ -13458,7 +13918,7 @@
                     <w:sz w:val="14"/>
                     <w:szCs w:val="14"/>
                   </w:rPr>
-                  <w:t xml:space="preserve">type here</w:t>
+                  <w:t xml:space="preserve">Set up per-member commits from day one, so each member's work shows under their own account.</w:t>
                 </w:r>
               </w:sdtContent>
             </w:sdt>
@@ -13521,7 +13981,7 @@
                     <w:sz w:val="14"/>
                     <w:szCs w:val="14"/>
                   </w:rPr>
-                  <w:t xml:space="preserve">Select ▾</w:t>
+                  <w:t xml:space="preserve">No</w:t>
                 </w:r>
               </w:sdtContent>
             </w:sdt>
@@ -13553,7 +14013,7 @@
                     <w:sz w:val="14"/>
                     <w:szCs w:val="14"/>
                   </w:rPr>
-                  <w:t xml:space="preserve">type here</w:t>
+                  <w:t xml:space="preserve">Labelled test frames catch detector errors a demo hides: the terracotta carpet false positive, fixed from 86 to 100 percent.</w:t>
                 </w:r>
               </w:sdtContent>
             </w:sdt>
@@ -13585,7 +14045,7 @@
                     <w:sz w:val="14"/>
                     <w:szCs w:val="14"/>
                   </w:rPr>
-                  <w:t xml:space="preserve">type here</w:t>
+                  <w:t xml:space="preserve">Test the detector in dim indoor light early; indoor detection stayed at about 1 in 3.</w:t>
                 </w:r>
               </w:sdtContent>
             </w:sdt>
@@ -13648,7 +14108,7 @@
                     <w:sz w:val="14"/>
                     <w:szCs w:val="14"/>
                   </w:rPr>
-                  <w:t xml:space="preserve">Select ▾</w:t>
+                  <w:t xml:space="preserve">No</w:t>
                 </w:r>
               </w:sdtContent>
             </w:sdt>
@@ -13680,7 +14140,7 @@
                     <w:sz w:val="14"/>
                     <w:szCs w:val="14"/>
                   </w:rPr>
-                  <w:t xml:space="preserve">type here</w:t>
+                  <w:t xml:space="preserve">The right test matters: Welch's t test, because guard and drone times vary so differently.</w:t>
                 </w:r>
               </w:sdtContent>
             </w:sdt>
@@ -13712,7 +14172,7 @@
                     <w:sz w:val="14"/>
                     <w:szCs w:val="14"/>
                   </w:rPr>
-                  <w:t xml:space="preserve">type here</w:t>
+                  <w:t xml:space="preserve">Fix the false-alarm logic and the censored revisit window before the batch run, not after.</w:t>
                 </w:r>
               </w:sdtContent>
             </w:sdt>
@@ -13773,7 +14233,7 @@
                     <w:sz w:val="14"/>
                     <w:szCs w:val="14"/>
                   </w:rPr>
-                  <w:t xml:space="preserve">Select ▾</w:t>
+                  <w:t xml:space="preserve">No</w:t>
                 </w:r>
               </w:sdtContent>
             </w:sdt>
@@ -13804,7 +14264,7 @@
                     <w:sz w:val="14"/>
                     <w:szCs w:val="14"/>
                   </w:rPr>
-                  <w:t xml:space="preserve">type here</w:t>
+                  <w:t xml:space="preserve">A business case is only as strong as its inputs: reading the simulation output directly and labelling every assumption makes it defensible.</w:t>
                 </w:r>
               </w:sdtContent>
             </w:sdt>
@@ -13835,7 +14295,7 @@
                     <w:sz w:val="14"/>
                     <w:szCs w:val="14"/>
                   </w:rPr>
-                  <w:t xml:space="preserve">type here</w:t>
+                  <w:t xml:space="preserve">Get real quotes and the real guard roster early to replace the assumption ranges.</w:t>
                 </w:r>
               </w:sdtContent>
             </w:sdt>
@@ -14418,7 +14878,7 @@
                     <w:sz w:val="15"/>
                     <w:szCs w:val="15"/>
                   </w:rPr>
-                  <w:t xml:space="preserve">Select ▾</w:t>
+                  <w:t xml:space="preserve">Yes</w:t>
                 </w:r>
               </w:sdtContent>
             </w:sdt>
@@ -14454,7 +14914,7 @@
                     <w:sz w:val="15"/>
                     <w:szCs w:val="15"/>
                   </w:rPr>
-                  <w:t xml:space="preserve">Select ▾</w:t>
+                  <w:t xml:space="preserve">Yes</w:t>
                 </w:r>
               </w:sdtContent>
             </w:sdt>
@@ -14490,7 +14950,7 @@
                     <w:sz w:val="15"/>
                     <w:szCs w:val="15"/>
                   </w:rPr>
-                  <w:t xml:space="preserve">Select ▾</w:t>
+                  <w:t xml:space="preserve">Yes</w:t>
                 </w:r>
               </w:sdtContent>
             </w:sdt>
@@ -14504,6 +14964,12 @@
             <w:pPr>
               <w:keepNext/>
             </w:pPr>
+            <w:r>
+              <w:rPr>
+                <w:i/>
+              </w:rPr>
+              <w:t>Muaaz Mohammed Iqbal Shaikh</w:t>
+            </w:r>
           </w:p>
         </w:tc>
         <w:tc>
@@ -14536,7 +15002,7 @@
                     <w:sz w:val="15"/>
                     <w:szCs w:val="15"/>
                   </w:rPr>
-                  <w:t xml:space="preserve">Select ▾</w:t>
+                  <w:t xml:space="preserve">Yes</w:t>
                 </w:r>
               </w:sdtContent>
             </w:sdt>
@@ -14599,7 +15065,7 @@
                     <w:sz w:val="15"/>
                     <w:szCs w:val="15"/>
                   </w:rPr>
-                  <w:t xml:space="preserve">Select ▾</w:t>
+                  <w:t xml:space="preserve">Yes</w:t>
                 </w:r>
               </w:sdtContent>
             </w:sdt>
@@ -14635,7 +15101,7 @@
                     <w:sz w:val="15"/>
                     <w:szCs w:val="15"/>
                   </w:rPr>
-                  <w:t xml:space="preserve">Select ▾</w:t>
+                  <w:t xml:space="preserve">Yes</w:t>
                 </w:r>
               </w:sdtContent>
             </w:sdt>
@@ -14671,7 +15137,7 @@
                     <w:sz w:val="15"/>
                     <w:szCs w:val="15"/>
                   </w:rPr>
-                  <w:t xml:space="preserve">Select ▾</w:t>
+                  <w:t xml:space="preserve">Yes</w:t>
                 </w:r>
               </w:sdtContent>
             </w:sdt>
@@ -14685,6 +15151,12 @@
             <w:pPr>
               <w:keepNext/>
             </w:pPr>
+            <w:r>
+              <w:rPr>
+                <w:i/>
+              </w:rPr>
+              <w:t>Aditya Rajkumar</w:t>
+            </w:r>
           </w:p>
         </w:tc>
         <w:tc>
@@ -14717,7 +15189,7 @@
                     <w:sz w:val="15"/>
                     <w:szCs w:val="15"/>
                   </w:rPr>
-                  <w:t xml:space="preserve">Select ▾</w:t>
+                  <w:t xml:space="preserve">Yes</w:t>
                 </w:r>
               </w:sdtContent>
             </w:sdt>
@@ -14780,7 +15252,7 @@
                     <w:sz w:val="15"/>
                     <w:szCs w:val="15"/>
                   </w:rPr>
-                  <w:t xml:space="preserve">Select ▾</w:t>
+                  <w:t xml:space="preserve">Yes</w:t>
                 </w:r>
               </w:sdtContent>
             </w:sdt>
@@ -14816,7 +15288,7 @@
                     <w:sz w:val="15"/>
                     <w:szCs w:val="15"/>
                   </w:rPr>
-                  <w:t xml:space="preserve">Select ▾</w:t>
+                  <w:t xml:space="preserve">Yes</w:t>
                 </w:r>
               </w:sdtContent>
             </w:sdt>
@@ -14852,7 +15324,7 @@
                     <w:sz w:val="15"/>
                     <w:szCs w:val="15"/>
                   </w:rPr>
-                  <w:t xml:space="preserve">Select ▾</w:t>
+                  <w:t xml:space="preserve">Yes</w:t>
                 </w:r>
               </w:sdtContent>
             </w:sdt>
@@ -14866,6 +15338,12 @@
             <w:pPr>
               <w:keepNext/>
             </w:pPr>
+            <w:r>
+              <w:rPr>
+                <w:i/>
+              </w:rPr>
+              <w:t>Zaid Rezaur Rahman</w:t>
+            </w:r>
           </w:p>
         </w:tc>
         <w:tc>
@@ -14898,7 +15376,7 @@
                     <w:sz w:val="15"/>
                     <w:szCs w:val="15"/>
                   </w:rPr>
-                  <w:t xml:space="preserve">Select ▾</w:t>
+                  <w:t xml:space="preserve">Yes</w:t>
                 </w:r>
               </w:sdtContent>
             </w:sdt>
@@ -14959,7 +15437,7 @@
                     <w:sz w:val="15"/>
                     <w:szCs w:val="15"/>
                   </w:rPr>
-                  <w:t xml:space="preserve">Select ▾</w:t>
+                  <w:t xml:space="preserve">Yes</w:t>
                 </w:r>
               </w:sdtContent>
             </w:sdt>
@@ -14994,7 +15472,7 @@
                     <w:sz w:val="15"/>
                     <w:szCs w:val="15"/>
                   </w:rPr>
-                  <w:t xml:space="preserve">Select ▾</w:t>
+                  <w:t xml:space="preserve">Yes</w:t>
                 </w:r>
               </w:sdtContent>
             </w:sdt>
@@ -15029,7 +15507,7 @@
                     <w:sz w:val="15"/>
                     <w:szCs w:val="15"/>
                   </w:rPr>
-                  <w:t xml:space="preserve">Select ▾</w:t>
+                  <w:t xml:space="preserve">Yes</w:t>
                 </w:r>
               </w:sdtContent>
             </w:sdt>
@@ -15039,7 +15517,14 @@
           <w:tcPr>
             <w:tcW w:type="dxa" w:w="2211"/>
           </w:tcPr>
-          <w:p/>
+          <w:p>
+            <w:r>
+              <w:rPr>
+                <w:i/>
+              </w:rPr>
+              <w:t>Soumya Subhankar Ranasingh</w:t>
+            </w:r>
+          </w:p>
         </w:tc>
         <w:tc>
           <w:tcPr>
@@ -15070,7 +15555,7 @@
                     <w:sz w:val="15"/>
                     <w:szCs w:val="15"/>
                   </w:rPr>
-                  <w:t xml:space="preserve">Select ▾</w:t>
+                  <w:t xml:space="preserve">Yes</w:t>
                 </w:r>
               </w:sdtContent>
             </w:sdt>

</xml_diff>